<commit_message>
fix: tundish offer — placeholders in tech tables + correct equipment name
Three fixes:
1. Tundish_Offer_Template.docx Tables 4 & 5 (pre-heating + drying)
   now use {{placeholders}} instead of hardcoded SMS India values.
   Pre-heating uses: num_burners, fuel_name, fuel1_cv, fuel2_cv,
   max_temperature, cycle_time, firing_rate_fuel1/2, etc.
   Drying uses _dry suffix variants that default to pre-heating values
   if not separately provided.

2. equipment_name now auto-detects from items product_type:
   - 'Tundish Preheater' → 'Tundish Preheater – X Ton'
   - 'Horizontal Ladle Preheater' → 'Horizontal Ladle Preheater – X Ton'
   - default → 'Vertical Ladle Preheater – X Ton'
   Previously always said 'Vertical Ladle Preheater'.

3. Tundish buildTechData() now sends dual-fuel fields: fuel2_cv,
   max_fuel_consumption1/2, fuel2_consumption, num_burners.

Co-Authored-By: Claude Opus 4.6 (1M context) <noreply@anthropic.com>
</commit_message>
<xml_diff>
--- a/Tundish_Offer_Template.docx
+++ b/Tundish_Offer_Template.docx
@@ -8225,14 +8225,13 @@
                 <w:color w:val="000000"/>
                 <w:lang w:val="en-GB"/>
               </w:rPr>
-              <w:t>3</w:t>
+              <w:t>{{num_burners}}</w:t>
             </w:r>
             <w:r>
               <w:rPr>
                 <w:color w:val="000000"/>
                 <w:lang w:val="en-GB"/>
               </w:rPr>
-              <w:t xml:space="preserve"> Nos.</w:t>
             </w:r>
           </w:p>
         </w:tc>
@@ -8300,28 +8299,25 @@
                 <w:color w:val="000000"/>
                 <w:lang w:val="en-GB"/>
               </w:rPr>
-              <w:t>N</w:t>
+              <w:t>{{fuel_name}}</w:t>
             </w:r>
             <w:r>
               <w:rPr>
                 <w:color w:val="000000"/>
                 <w:lang w:val="en-GB"/>
               </w:rPr>
-              <w:t>G</w:t>
             </w:r>
             <w:r>
               <w:rPr>
                 <w:color w:val="000000"/>
                 <w:lang w:val="en-GB"/>
               </w:rPr>
-              <w:t xml:space="preserve"> &amp; </w:t>
             </w:r>
             <w:r>
               <w:rPr>
                 <w:color w:val="000000"/>
                 <w:lang w:val="en-GB"/>
               </w:rPr>
-              <w:t>MG</w:t>
             </w:r>
           </w:p>
         </w:tc>
@@ -8399,35 +8395,31 @@
                 <w:color w:val="000000"/>
                 <w:lang w:val="en-GB"/>
               </w:rPr>
-              <w:t>8</w:t>
+              <w:t>{{fuel1_cv}}</w:t>
             </w:r>
             <w:r>
               <w:rPr>
                 <w:color w:val="000000"/>
                 <w:lang w:val="en-GB"/>
               </w:rPr>
-              <w:t xml:space="preserve">360 </w:t>
             </w:r>
             <w:r>
               <w:rPr>
                 <w:color w:val="000000"/>
                 <w:lang w:val="en-GB"/>
               </w:rPr>
-              <w:t>k</w:t>
             </w:r>
             <w:r>
               <w:rPr>
                 <w:color w:val="000000"/>
                 <w:lang w:val="en-GB"/>
               </w:rPr>
-              <w:t>c</w:t>
             </w:r>
             <w:r>
               <w:rPr>
                 <w:color w:val="000000"/>
                 <w:lang w:val="en-GB"/>
               </w:rPr>
-              <w:t>al/Nm</w:t>
             </w:r>
             <w:r>
               <w:rPr>
@@ -8435,7 +8427,6 @@
                 <w:vertAlign w:val="superscript"/>
                 <w:lang w:val="en-GB"/>
               </w:rPr>
-              <w:t>3</w:t>
             </w:r>
             <w:r>
               <w:rPr>
@@ -8443,14 +8434,12 @@
                 <w:vertAlign w:val="superscript"/>
                 <w:lang w:val="en-GB"/>
               </w:rPr>
-              <w:t xml:space="preserve"> </w:t>
             </w:r>
             <w:r>
               <w:rPr>
                 <w:color w:val="000000"/>
                 <w:lang w:val="en-GB"/>
               </w:rPr>
-              <w:t>(client confirm)</w:t>
             </w:r>
           </w:p>
         </w:tc>
@@ -8526,14 +8515,13 @@
                 <w:color w:val="000000"/>
                 <w:lang w:val="en-GB"/>
               </w:rPr>
-              <w:t>2199 kcal/</w:t>
+              <w:t>{{fuel2_cv}}</w:t>
             </w:r>
             <w:r>
               <w:rPr>
                 <w:color w:val="000000"/>
                 <w:lang w:val="en-GB"/>
               </w:rPr>
-              <w:t>Nm</w:t>
             </w:r>
             <w:r>
               <w:rPr>
@@ -8541,14 +8529,12 @@
                 <w:vertAlign w:val="superscript"/>
                 <w:lang w:val="en-GB"/>
               </w:rPr>
-              <w:t>3</w:t>
             </w:r>
             <w:r>
               <w:rPr>
                 <w:color w:val="000000"/>
                 <w:lang w:val="en-GB"/>
               </w:rPr>
-              <w:t xml:space="preserve"> (client confirm)</w:t>
             </w:r>
           </w:p>
         </w:tc>
@@ -8616,14 +8602,13 @@
                 <w:color w:val="000000"/>
                 <w:lang w:val="en-GB"/>
               </w:rPr>
-              <w:t>120</w:t>
+              <w:t>{{max_temperature}}</w:t>
             </w:r>
             <w:r>
               <w:rPr>
                 <w:color w:val="000000"/>
                 <w:lang w:val="en-GB"/>
               </w:rPr>
-              <w:t>0</w:t>
             </w:r>
             <w:r>
               <w:rPr>
@@ -8631,14 +8616,12 @@
                 <w:vertAlign w:val="superscript"/>
                 <w:lang w:val="en-GB"/>
               </w:rPr>
-              <w:t xml:space="preserve">0 </w:t>
             </w:r>
             <w:r>
               <w:rPr>
                 <w:color w:val="000000"/>
                 <w:lang w:val="en-GB"/>
               </w:rPr>
-              <w:t>C</w:t>
             </w:r>
           </w:p>
         </w:tc>
@@ -8706,7 +8689,7 @@
                 <w:color w:val="000000"/>
                 <w:lang w:val="en-GB"/>
               </w:rPr>
-              <w:t>90 Min.</w:t>
+              <w:t>{{cycle_time}}</w:t>
             </w:r>
           </w:p>
         </w:tc>
@@ -8774,7 +8757,7 @@
                 <w:color w:val="000000"/>
                 <w:lang w:val="en-GB"/>
               </w:rPr>
-              <w:t>Through NG fired Pilot Burner</w:t>
+              <w:t>{{ignition_method}}</w:t>
             </w:r>
           </w:p>
         </w:tc>
@@ -8842,7 +8825,7 @@
                 <w:color w:val="000000"/>
                 <w:lang w:val="en-GB"/>
               </w:rPr>
-              <w:t>With Hydraulic cylinder &amp;Power pack</w:t>
+              <w:t>{{lifting_lowering}}</w:t>
             </w:r>
           </w:p>
         </w:tc>
@@ -8920,14 +8903,13 @@
                 <w:color w:val="000000" w:themeColor="text1"/>
                 <w:lang w:val="en-GB"/>
               </w:rPr>
-              <w:t>100</w:t>
+              <w:t>{{firing_rate_fuel1}}</w:t>
             </w:r>
             <w:r>
               <w:rPr>
                 <w:color w:val="000000" w:themeColor="text1"/>
                 <w:lang w:val="en-GB"/>
               </w:rPr>
-              <w:t xml:space="preserve"> Nm</w:t>
             </w:r>
             <w:r>
               <w:rPr>
@@ -8935,14 +8917,12 @@
                 <w:vertAlign w:val="superscript"/>
                 <w:lang w:val="en-GB"/>
               </w:rPr>
-              <w:t>3</w:t>
             </w:r>
             <w:r>
               <w:rPr>
                 <w:color w:val="000000" w:themeColor="text1"/>
                 <w:lang w:val="en-GB"/>
               </w:rPr>
-              <w:t>/hr. per burner</w:t>
             </w:r>
           </w:p>
         </w:tc>
@@ -9010,7 +8990,7 @@
                 <w:highlight w:val="yellow"/>
                 <w:lang w:val="en-GB"/>
               </w:rPr>
-              <w:t>300</w:t>
+              <w:t>{{max_consumption_fuel1}}</w:t>
             </w:r>
             <w:r>
               <w:rPr>
@@ -9018,7 +8998,6 @@
                 <w:highlight w:val="yellow"/>
                 <w:lang w:val="en-GB"/>
               </w:rPr>
-              <w:t xml:space="preserve"> Nm3/Hr</w:t>
             </w:r>
           </w:p>
         </w:tc>
@@ -9090,21 +9069,19 @@
                 <w:color w:val="000000"/>
                 <w:lang w:val="en-GB"/>
               </w:rPr>
-              <w:t>316</w:t>
+              <w:t>{{firing_rate_fuel2}}</w:t>
             </w:r>
             <w:r>
               <w:rPr>
                 <w:color w:val="000000"/>
                 <w:lang w:val="en-GB"/>
               </w:rPr>
-              <w:t xml:space="preserve"> </w:t>
             </w:r>
             <w:r>
               <w:rPr>
                 <w:color w:val="000000" w:themeColor="text1"/>
                 <w:lang w:val="en-GB"/>
               </w:rPr>
-              <w:t>Nm</w:t>
             </w:r>
             <w:r>
               <w:rPr>
@@ -9112,14 +9089,12 @@
                 <w:vertAlign w:val="superscript"/>
                 <w:lang w:val="en-GB"/>
               </w:rPr>
-              <w:t>3</w:t>
             </w:r>
             <w:r>
               <w:rPr>
                 <w:color w:val="000000" w:themeColor="text1"/>
                 <w:lang w:val="en-GB"/>
               </w:rPr>
-              <w:t>/hr. per burner</w:t>
             </w:r>
           </w:p>
         </w:tc>
@@ -9184,7 +9159,7 @@
                 <w:highlight w:val="yellow"/>
                 <w:lang w:val="en-GB"/>
               </w:rPr>
-              <w:t>950</w:t>
+              <w:t>{{max_consumption_fuel2}}</w:t>
             </w:r>
             <w:r>
               <w:rPr>
@@ -9192,7 +9167,6 @@
                 <w:highlight w:val="yellow"/>
                 <w:lang w:val="en-GB"/>
               </w:rPr>
-              <w:t xml:space="preserve"> Nm3/Hr</w:t>
             </w:r>
           </w:p>
         </w:tc>
@@ -9256,7 +9230,7 @@
                 <w:color w:val="000000"/>
                 <w:lang w:val="en-GB"/>
               </w:rPr>
-              <w:t>Encon dual fuel burner-4A</w:t>
+              <w:t>{{burner_model}}</w:t>
             </w:r>
           </w:p>
         </w:tc>
@@ -9322,7 +9296,7 @@
                 <w:color w:val="000000"/>
                 <w:lang w:val="en-GB"/>
               </w:rPr>
-              <w:t>Centrifugal type</w:t>
+              <w:t>{{combustion_blower}}</w:t>
             </w:r>
           </w:p>
         </w:tc>
@@ -9389,7 +9363,7 @@
                 <w:highlight w:val="yellow"/>
                 <w:lang w:val="en-GB"/>
               </w:rPr>
-              <w:t>15</w:t>
+              <w:t>{{blower_size}}</w:t>
             </w:r>
             <w:r>
               <w:rPr>
@@ -9397,7 +9371,6 @@
                 <w:highlight w:val="yellow"/>
                 <w:lang w:val="en-GB"/>
               </w:rPr>
-              <w:t xml:space="preserve"> HP/</w:t>
             </w:r>
             <w:r>
               <w:rPr>
@@ -9405,7 +9378,6 @@
                 <w:highlight w:val="yellow"/>
                 <w:lang w:val="en-GB"/>
               </w:rPr>
-              <w:t>32</w:t>
             </w:r>
             <w:r>
               <w:rPr>
@@ -9413,7 +9385,6 @@
                 <w:highlight w:val="yellow"/>
                 <w:lang w:val="en-GB"/>
               </w:rPr>
-              <w:t>” WC</w:t>
             </w:r>
             <w:r>
               <w:rPr>
@@ -9421,7 +9392,6 @@
                 <w:highlight w:val="yellow"/>
                 <w:lang w:val="en-GB"/>
               </w:rPr>
-              <w:t xml:space="preserve">, </w:t>
             </w:r>
             <w:r>
               <w:rPr>
@@ -9429,7 +9399,6 @@
                 <w:highlight w:val="yellow"/>
                 <w:lang w:val="en-GB"/>
               </w:rPr>
-              <w:t>2</w:t>
             </w:r>
             <w:r>
               <w:rPr>
@@ -9437,7 +9406,6 @@
                 <w:highlight w:val="yellow"/>
                 <w:lang w:val="en-GB"/>
               </w:rPr>
-              <w:t>040</w:t>
             </w:r>
             <w:r>
               <w:rPr>
@@ -9445,7 +9413,6 @@
                 <w:highlight w:val="yellow"/>
                 <w:lang w:val="en-GB"/>
               </w:rPr>
-              <w:t xml:space="preserve"> Nm3/hr, </w:t>
             </w:r>
             <w:r>
               <w:rPr>
@@ -9453,7 +9420,6 @@
                 <w:highlight w:val="yellow"/>
                 <w:lang w:val="en-GB"/>
               </w:rPr>
-              <w:t>1200</w:t>
             </w:r>
             <w:r>
               <w:rPr>
@@ -9461,7 +9427,6 @@
                 <w:highlight w:val="yellow"/>
                 <w:lang w:val="en-GB"/>
               </w:rPr>
-              <w:t xml:space="preserve"> CFM</w:t>
             </w:r>
           </w:p>
         </w:tc>
@@ -9527,13 +9492,12 @@
               <w:rPr>
                 <w:lang w:val="en-GB"/>
               </w:rPr>
-              <w:t>10</w:t>
+              <w:t>{{motor_power_pack}}</w:t>
             </w:r>
             <w:r>
               <w:rPr>
                 <w:lang w:val="en-GB"/>
               </w:rPr>
-              <w:t xml:space="preserve"> HP </w:t>
             </w:r>
           </w:p>
         </w:tc>
@@ -9600,13 +9564,12 @@
               <w:rPr>
                 <w:lang w:val="en-GB"/>
               </w:rPr>
-              <w:t>18</w:t>
+              <w:t>{{max_electrical_load}}</w:t>
             </w:r>
             <w:r>
               <w:rPr>
                 <w:lang w:val="en-GB"/>
               </w:rPr>
-              <w:t xml:space="preserve"> kW</w:t>
             </w:r>
           </w:p>
         </w:tc>
@@ -9978,14 +9941,13 @@
                 <w:color w:val="000000"/>
                 <w:lang w:val="en-GB"/>
               </w:rPr>
-              <w:t>3</w:t>
+              <w:t>{{num_burners}}</w:t>
             </w:r>
             <w:r>
               <w:rPr>
                 <w:color w:val="000000"/>
                 <w:lang w:val="en-GB"/>
               </w:rPr>
-              <w:t xml:space="preserve"> Nos.</w:t>
             </w:r>
           </w:p>
         </w:tc>
@@ -10053,28 +10015,25 @@
                 <w:color w:val="000000"/>
                 <w:lang w:val="en-GB"/>
               </w:rPr>
-              <w:t>N</w:t>
+              <w:t>{{fuel_name}}</w:t>
             </w:r>
             <w:r>
               <w:rPr>
                 <w:color w:val="000000"/>
                 <w:lang w:val="en-GB"/>
               </w:rPr>
-              <w:t>G</w:t>
             </w:r>
             <w:r>
               <w:rPr>
                 <w:color w:val="000000"/>
                 <w:lang w:val="en-GB"/>
               </w:rPr>
-              <w:t xml:space="preserve"> &amp; </w:t>
             </w:r>
             <w:r>
               <w:rPr>
                 <w:color w:val="000000"/>
                 <w:lang w:val="en-GB"/>
               </w:rPr>
-              <w:t>MG</w:t>
             </w:r>
           </w:p>
         </w:tc>
@@ -10152,14 +10111,13 @@
                 <w:color w:val="000000"/>
                 <w:lang w:val="en-GB"/>
               </w:rPr>
-              <w:t>8</w:t>
+              <w:t>{{fuel1_cv}}</w:t>
             </w:r>
             <w:r>
               <w:rPr>
                 <w:color w:val="000000"/>
                 <w:lang w:val="en-GB"/>
               </w:rPr>
-              <w:t xml:space="preserve">360 </w:t>
             </w:r>
             <w:proofErr w:type="spellStart"/>
             <w:r>
@@ -10167,7 +10125,6 @@
                 <w:color w:val="000000"/>
                 <w:lang w:val="en-GB"/>
               </w:rPr>
-              <w:t>kCal</w:t>
             </w:r>
             <w:proofErr w:type="spellEnd"/>
             <w:r>
@@ -10175,7 +10132,6 @@
                 <w:color w:val="000000"/>
                 <w:lang w:val="en-GB"/>
               </w:rPr>
-              <w:t>/Nm</w:t>
             </w:r>
             <w:r>
               <w:rPr>
@@ -10183,7 +10139,6 @@
                 <w:vertAlign w:val="superscript"/>
                 <w:lang w:val="en-GB"/>
               </w:rPr>
-              <w:t>3</w:t>
             </w:r>
             <w:r>
               <w:rPr>
@@ -10191,14 +10146,12 @@
                 <w:vertAlign w:val="superscript"/>
                 <w:lang w:val="en-GB"/>
               </w:rPr>
-              <w:t xml:space="preserve"> </w:t>
             </w:r>
             <w:r>
               <w:rPr>
                 <w:color w:val="000000"/>
                 <w:lang w:val="en-GB"/>
               </w:rPr>
-              <w:t>(client confirm)</w:t>
             </w:r>
           </w:p>
         </w:tc>
@@ -10274,14 +10227,13 @@
                 <w:color w:val="000000"/>
                 <w:lang w:val="en-GB"/>
               </w:rPr>
-              <w:t>2199 kcal/</w:t>
+              <w:t>{{fuel2_cv}}</w:t>
             </w:r>
             <w:r>
               <w:rPr>
                 <w:color w:val="000000"/>
                 <w:lang w:val="en-GB"/>
               </w:rPr>
-              <w:t>Nm</w:t>
             </w:r>
             <w:r>
               <w:rPr>
@@ -10289,14 +10241,12 @@
                 <w:vertAlign w:val="superscript"/>
                 <w:lang w:val="en-GB"/>
               </w:rPr>
-              <w:t>3</w:t>
             </w:r>
             <w:r>
               <w:rPr>
                 <w:color w:val="000000"/>
                 <w:lang w:val="en-GB"/>
               </w:rPr>
-              <w:t xml:space="preserve"> (client confirm)</w:t>
             </w:r>
           </w:p>
         </w:tc>
@@ -10364,14 +10314,13 @@
                 <w:color w:val="000000"/>
                 <w:lang w:val="en-GB"/>
               </w:rPr>
-              <w:t>9</w:t>
+              <w:t>{{max_temperature_dry}}</w:t>
             </w:r>
             <w:r>
               <w:rPr>
                 <w:color w:val="000000"/>
                 <w:lang w:val="en-GB"/>
               </w:rPr>
-              <w:t>00</w:t>
             </w:r>
             <w:r>
               <w:rPr>
@@ -10379,14 +10328,12 @@
                 <w:vertAlign w:val="superscript"/>
                 <w:lang w:val="en-GB"/>
               </w:rPr>
-              <w:t xml:space="preserve">0 </w:t>
             </w:r>
             <w:r>
               <w:rPr>
                 <w:color w:val="000000"/>
                 <w:lang w:val="en-GB"/>
               </w:rPr>
-              <w:t>C</w:t>
             </w:r>
           </w:p>
         </w:tc>
@@ -10454,7 +10401,7 @@
                 <w:color w:val="000000"/>
                 <w:lang w:val="en-GB"/>
               </w:rPr>
-              <w:t>3 Hours</w:t>
+              <w:t>{{cycle_time_dry}}</w:t>
             </w:r>
           </w:p>
         </w:tc>
@@ -10522,7 +10469,7 @@
                 <w:color w:val="000000"/>
                 <w:lang w:val="en-GB"/>
               </w:rPr>
-              <w:t>Through NG fired Pilot Burner</w:t>
+              <w:t>{{ignition_method}}</w:t>
             </w:r>
           </w:p>
         </w:tc>
@@ -10590,7 +10537,7 @@
                 <w:color w:val="000000"/>
                 <w:lang w:val="en-GB"/>
               </w:rPr>
-              <w:t>With Hydraulic cylinder &amp;Power pack</w:t>
+              <w:t>{{lifting_lowering}}</w:t>
             </w:r>
           </w:p>
         </w:tc>
@@ -10668,14 +10615,13 @@
                 <w:color w:val="000000" w:themeColor="text1"/>
                 <w:lang w:val="en-GB"/>
               </w:rPr>
-              <w:t>133</w:t>
+              <w:t>{{firing_rate_fuel1_dry}}</w:t>
             </w:r>
             <w:r>
               <w:rPr>
                 <w:color w:val="000000" w:themeColor="text1"/>
                 <w:lang w:val="en-GB"/>
               </w:rPr>
-              <w:t xml:space="preserve"> Nm</w:t>
             </w:r>
             <w:r>
               <w:rPr>
@@ -10683,14 +10629,12 @@
                 <w:vertAlign w:val="superscript"/>
                 <w:lang w:val="en-GB"/>
               </w:rPr>
-              <w:t>3</w:t>
             </w:r>
             <w:r>
               <w:rPr>
                 <w:color w:val="000000" w:themeColor="text1"/>
                 <w:lang w:val="en-GB"/>
               </w:rPr>
-              <w:t>/hr. per burner</w:t>
             </w:r>
           </w:p>
         </w:tc>
@@ -10758,7 +10702,7 @@
                 <w:highlight w:val="yellow"/>
                 <w:lang w:val="en-GB"/>
               </w:rPr>
-              <w:t>400</w:t>
+              <w:t>{{max_consumption_fuel1_dry}}</w:t>
             </w:r>
             <w:r>
               <w:rPr>
@@ -10766,7 +10710,6 @@
                 <w:highlight w:val="yellow"/>
                 <w:lang w:val="en-GB"/>
               </w:rPr>
-              <w:t xml:space="preserve"> Nm3/Hr</w:t>
             </w:r>
           </w:p>
         </w:tc>
@@ -10830,21 +10773,19 @@
                 <w:color w:val="000000"/>
                 <w:lang w:val="en-GB"/>
               </w:rPr>
-              <w:t>433</w:t>
+              <w:t>{{firing_rate_fuel2_dry}}</w:t>
             </w:r>
             <w:r>
               <w:rPr>
                 <w:color w:val="000000"/>
                 <w:lang w:val="en-GB"/>
               </w:rPr>
-              <w:t xml:space="preserve"> </w:t>
             </w:r>
             <w:r>
               <w:rPr>
                 <w:color w:val="000000" w:themeColor="text1"/>
                 <w:lang w:val="en-GB"/>
               </w:rPr>
-              <w:t>Nm</w:t>
             </w:r>
             <w:r>
               <w:rPr>
@@ -10852,14 +10793,12 @@
                 <w:vertAlign w:val="superscript"/>
                 <w:lang w:val="en-GB"/>
               </w:rPr>
-              <w:t>3</w:t>
             </w:r>
             <w:r>
               <w:rPr>
                 <w:color w:val="000000" w:themeColor="text1"/>
                 <w:lang w:val="en-GB"/>
               </w:rPr>
-              <w:t>/hr. per burner</w:t>
             </w:r>
           </w:p>
         </w:tc>
@@ -10924,7 +10863,7 @@
                 <w:highlight w:val="yellow"/>
                 <w:lang w:val="en-GB"/>
               </w:rPr>
-              <w:t>1300</w:t>
+              <w:t>{{max_consumption_fuel2_dry}}</w:t>
             </w:r>
             <w:r>
               <w:rPr>
@@ -10932,7 +10871,6 @@
                 <w:highlight w:val="yellow"/>
                 <w:lang w:val="en-GB"/>
               </w:rPr>
-              <w:t xml:space="preserve"> Nm3/Hr</w:t>
             </w:r>
           </w:p>
         </w:tc>
@@ -10996,21 +10934,19 @@
                 <w:color w:val="000000"/>
                 <w:lang w:val="en-GB"/>
               </w:rPr>
-              <w:t>Encon dual fuel burner-</w:t>
+              <w:t>{{burner_model}}</w:t>
             </w:r>
             <w:r>
               <w:rPr>
                 <w:color w:val="000000"/>
                 <w:lang w:val="en-GB"/>
               </w:rPr>
-              <w:t>4</w:t>
             </w:r>
             <w:r>
               <w:rPr>
                 <w:color w:val="000000"/>
                 <w:lang w:val="en-GB"/>
               </w:rPr>
-              <w:t>A</w:t>
             </w:r>
           </w:p>
         </w:tc>
@@ -11076,7 +11012,7 @@
                 <w:color w:val="000000"/>
                 <w:lang w:val="en-GB"/>
               </w:rPr>
-              <w:t>Centrifugal type</w:t>
+              <w:t>{{combustion_blower}}</w:t>
             </w:r>
           </w:p>
         </w:tc>
@@ -11143,7 +11079,7 @@
                 <w:highlight w:val="yellow"/>
                 <w:lang w:val="en-GB"/>
               </w:rPr>
-              <w:t>20</w:t>
+              <w:t>{{blower_size_dry}}</w:t>
             </w:r>
             <w:r>
               <w:rPr>
@@ -11151,7 +11087,6 @@
                 <w:highlight w:val="yellow"/>
                 <w:lang w:val="en-GB"/>
               </w:rPr>
-              <w:t xml:space="preserve"> HP/</w:t>
             </w:r>
             <w:r>
               <w:rPr>
@@ -11159,7 +11094,6 @@
                 <w:highlight w:val="yellow"/>
                 <w:lang w:val="en-GB"/>
               </w:rPr>
-              <w:t>32</w:t>
             </w:r>
             <w:r>
               <w:rPr>
@@ -11167,7 +11101,6 @@
                 <w:highlight w:val="yellow"/>
                 <w:lang w:val="en-GB"/>
               </w:rPr>
-              <w:t>” WC</w:t>
             </w:r>
             <w:r>
               <w:rPr>
@@ -11175,7 +11108,6 @@
                 <w:highlight w:val="yellow"/>
                 <w:lang w:val="en-GB"/>
               </w:rPr>
-              <w:t xml:space="preserve">, </w:t>
             </w:r>
             <w:r>
               <w:rPr>
@@ -11183,7 +11115,6 @@
                 <w:highlight w:val="yellow"/>
                 <w:lang w:val="en-GB"/>
               </w:rPr>
-              <w:t>2720</w:t>
             </w:r>
             <w:r>
               <w:rPr>
@@ -11191,7 +11122,6 @@
                 <w:highlight w:val="yellow"/>
                 <w:lang w:val="en-GB"/>
               </w:rPr>
-              <w:t xml:space="preserve"> Nm3/hr, </w:t>
             </w:r>
             <w:r>
               <w:rPr>
@@ -11199,7 +11129,6 @@
                 <w:highlight w:val="yellow"/>
                 <w:lang w:val="en-GB"/>
               </w:rPr>
-              <w:t>1600</w:t>
             </w:r>
             <w:r>
               <w:rPr>
@@ -11207,7 +11136,6 @@
                 <w:highlight w:val="yellow"/>
                 <w:lang w:val="en-GB"/>
               </w:rPr>
-              <w:t xml:space="preserve"> CFM</w:t>
             </w:r>
           </w:p>
         </w:tc>
@@ -11273,13 +11201,12 @@
               <w:rPr>
                 <w:lang w:val="en-GB"/>
               </w:rPr>
-              <w:t>10</w:t>
+              <w:t>{{motor_power_pack}}</w:t>
             </w:r>
             <w:r>
               <w:rPr>
                 <w:lang w:val="en-GB"/>
               </w:rPr>
-              <w:t xml:space="preserve"> HP </w:t>
             </w:r>
           </w:p>
         </w:tc>
@@ -11346,13 +11273,12 @@
               <w:rPr>
                 <w:lang w:val="en-GB"/>
               </w:rPr>
-              <w:t>22</w:t>
+              <w:t>{{max_electrical_load_dry}}</w:t>
             </w:r>
             <w:r>
               <w:rPr>
                 <w:lang w:val="en-GB"/>
               </w:rPr>
-              <w:t xml:space="preserve"> kW</w:t>
             </w:r>
           </w:p>
         </w:tc>

</xml_diff>

<commit_message>
fix: tundish offer — dynamic fuel labels + wire missing fields
Three fixes:
1. Template labels now use {{fuel1_label}}/{{fuel2_label}} instead of
   hardcoded 'NG'/'MG'. So 'Calorific Value Of NG' becomes
   'Calorific Value Of Natural Gas' or whatever fuel was selected.

2. Added tundish dual-fuel fields to QuoteRequest model: num_burners,
   fuel2_cv, fuel2_consumption, max_fuel_consumption1/2. These were
   being sent by the frontend but Pydantic was stripping them.

3. quote_writer now derives fuel1_label/fuel2_label from fuel_name
   (splits on '&' — e.g. 'NG & MG' → fuel1='NG', fuel2='MG').

Co-Authored-By: Claude Opus 4.6 (1M context) <noreply@anthropic.com>
</commit_message>
<xml_diff>
--- a/Tundish_Offer_Template.docx
+++ b/Tundish_Offer_Template.docx
@@ -8356,7 +8356,7 @@
                 <w:color w:val="000000"/>
                 <w:lang w:val="en-GB"/>
               </w:rPr>
-              <w:t xml:space="preserve">Calorific Value </w:t>
+              <w:t>Calorific Value Of {{fuel1_label}}</w:t>
             </w:r>
             <w:r>
               <w:rPr>
@@ -8365,7 +8365,6 @@
                 <w:color w:val="000000"/>
                 <w:lang w:val="en-GB"/>
               </w:rPr>
-              <w:t>Of NG</w:t>
             </w:r>
           </w:p>
         </w:tc>
@@ -8477,7 +8476,7 @@
                 <w:color w:val="000000"/>
                 <w:lang w:val="en-GB"/>
               </w:rPr>
-              <w:t xml:space="preserve">Calorific Value </w:t>
+              <w:t>Calorific Value Of {{fuel2_label}}</w:t>
             </w:r>
             <w:r>
               <w:rPr>
@@ -8486,7 +8485,6 @@
                 <w:color w:val="000000"/>
                 <w:lang w:val="en-GB"/>
               </w:rPr>
-              <w:t>Of MG</w:t>
             </w:r>
           </w:p>
         </w:tc>
@@ -8864,7 +8862,7 @@
                 <w:color w:val="000000"/>
                 <w:lang w:val="en-GB"/>
               </w:rPr>
-              <w:t>Firing Rate</w:t>
+              <w:t>Firing Rate for {{fuel1_label}}</w:t>
             </w:r>
             <w:r>
               <w:rPr>
@@ -8873,7 +8871,6 @@
                 <w:color w:val="000000"/>
                 <w:lang w:val="en-GB"/>
               </w:rPr>
-              <w:t xml:space="preserve"> for NG</w:t>
             </w:r>
           </w:p>
         </w:tc>
@@ -9033,7 +9030,7 @@
                 <w:bCs/>
                 <w:lang w:val="en-GB"/>
               </w:rPr>
-              <w:t xml:space="preserve">Firing Rate for </w:t>
+              <w:t>Firing Rate for {{fuel2_label}}</w:t>
             </w:r>
             <w:r>
               <w:rPr>
@@ -9041,7 +9038,6 @@
                 <w:bCs/>
                 <w:lang w:val="en-GB"/>
               </w:rPr>
-              <w:t>MG</w:t>
             </w:r>
           </w:p>
         </w:tc>
@@ -10072,7 +10068,7 @@
                 <w:color w:val="000000"/>
                 <w:lang w:val="en-GB"/>
               </w:rPr>
-              <w:t xml:space="preserve">Calorific Value </w:t>
+              <w:t>Calorific Value Of {{fuel1_label}}</w:t>
             </w:r>
             <w:r>
               <w:rPr>
@@ -10081,7 +10077,6 @@
                 <w:color w:val="000000"/>
                 <w:lang w:val="en-GB"/>
               </w:rPr>
-              <w:t>Of NG</w:t>
             </w:r>
           </w:p>
         </w:tc>
@@ -10189,7 +10184,7 @@
                 <w:color w:val="000000"/>
                 <w:lang w:val="en-GB"/>
               </w:rPr>
-              <w:t xml:space="preserve">Calorific Value </w:t>
+              <w:t>Calorific Value Of {{fuel2_label}}</w:t>
             </w:r>
             <w:r>
               <w:rPr>
@@ -10198,7 +10193,6 @@
                 <w:color w:val="000000"/>
                 <w:lang w:val="en-GB"/>
               </w:rPr>
-              <w:t>Of MG</w:t>
             </w:r>
           </w:p>
         </w:tc>
@@ -10576,7 +10570,7 @@
                 <w:color w:val="000000"/>
                 <w:lang w:val="en-GB"/>
               </w:rPr>
-              <w:t>Firing Rate</w:t>
+              <w:t>Firing Rate for {{fuel1_label}}</w:t>
             </w:r>
             <w:r>
               <w:rPr>
@@ -10585,7 +10579,6 @@
                 <w:color w:val="000000"/>
                 <w:lang w:val="en-GB"/>
               </w:rPr>
-              <w:t xml:space="preserve"> for NG</w:t>
             </w:r>
           </w:p>
         </w:tc>
@@ -10745,7 +10738,7 @@
                 <w:bCs/>
                 <w:lang w:val="en-GB"/>
               </w:rPr>
-              <w:t>Firing Rate for MG</w:t>
+              <w:t>Firing Rate for {{fuel2_label}}</w:t>
             </w:r>
           </w:p>
         </w:tc>

</xml_diff>

<commit_message>
fix: dedupe Annexure V client list in both offer templates
The 99-row reference list copied from Preheaters_Categorized.xlsx had
13 clusters of exact (client, application) duplicates (~24 redundant
rows -- 'Danieli India Ltd. | Tundish Preheater' x4, 'Bangladesh Re
Rolling Mills Ltd. | Tundish Preheater' x4, etc.). Drop the duplicate
rows in both Offer_Template.docx (Annexure V) and Tundish_Offer_
Template.docx, and renumber S. No. sequentially.

Result: 99 rows -> 75 unique (client, application) entries in each
template. Same-client / different-application rows are preserved
(e.g. BMM Ispat Ltd. still has Vertical / Horizontal / Tundish lines).

Co-Authored-By: Claude Opus 4.7 (1M context) <noreply@anthropic.com>
</commit_message>
<xml_diff>
--- a/Tundish_Offer_Template.docx
+++ b/Tundish_Offer_Template.docx
@@ -24535,7 +24535,7 @@
                 <w:sz w:val="22"/>
                 <w:szCs w:val="22"/>
               </w:rPr>
-              <w:t xml:space="preserve">1</w:t>
+              <w:t>1</w:t>
             </w:r>
           </w:p>
         </w:tc>
@@ -24638,7 +24638,7 @@
                 <w:sz w:val="22"/>
                 <w:szCs w:val="22"/>
               </w:rPr>
-              <w:t xml:space="preserve">2</w:t>
+              <w:t>2</w:t>
             </w:r>
           </w:p>
         </w:tc>
@@ -24741,7 +24741,7 @@
                 <w:sz w:val="22"/>
                 <w:szCs w:val="22"/>
               </w:rPr>
-              <w:t xml:space="preserve">3</w:t>
+              <w:t>3</w:t>
             </w:r>
           </w:p>
         </w:tc>
@@ -24844,7 +24844,7 @@
                 <w:sz w:val="22"/>
                 <w:szCs w:val="22"/>
               </w:rPr>
-              <w:t xml:space="preserve">4</w:t>
+              <w:t>4</w:t>
             </w:r>
           </w:p>
         </w:tc>
@@ -24913,6 +24913,109 @@
                 <w:szCs w:val="22"/>
               </w:rPr>
               <w:t xml:space="preserve">Tundish Preheater</w:t>
+            </w:r>
+          </w:p>
+        </w:tc>
+      </w:tr>
+      <w:tr>
+        <w:tc>
+          <w:tcPr>
+            <w:tcW w:type="dxa" w:w="780"/>
+            <w:tcBorders>
+              <w:top w:val="single" w:color="BFBFBF" w:sz="4"/>
+              <w:left w:val="single" w:color="BFBFBF" w:sz="4"/>
+              <w:bottom w:val="single" w:color="BFBFBF" w:sz="4"/>
+              <w:right w:val="single" w:color="BFBFBF" w:sz="4"/>
+            </w:tcBorders>
+            <w:shd w:fill="FFFFFF" w:val="clear"/>
+            <w:tcMar>
+              <w:top w:type="dxa" w:w="100"/>
+              <w:left w:type="dxa" w:w="140"/>
+              <w:bottom w:type="dxa" w:w="100"/>
+              <w:right w:type="dxa" w:w="140"/>
+            </w:tcMar>
+            <w:vAlign w:val="center"/>
+          </w:tcPr>
+          <w:p>
+            <w:pPr>
+              <w:spacing w:after="40" w:before="40"/>
+              <w:jc w:val="center"/>
+            </w:pPr>
+            <w:r>
+              <w:rPr>
+                <w:rFonts w:ascii="Calibri" w:cs="Calibri" w:eastAsia="Calibri" w:hAnsi="Calibri"/>
+                <w:sz w:val="22"/>
+                <w:szCs w:val="22"/>
+              </w:rPr>
+              <w:t>5</w:t>
+            </w:r>
+          </w:p>
+        </w:tc>
+        <w:tc>
+          <w:tcPr>
+            <w:tcW w:type="dxa" w:w="3580"/>
+            <w:tcBorders>
+              <w:top w:val="single" w:color="BFBFBF" w:sz="4"/>
+              <w:left w:val="single" w:color="BFBFBF" w:sz="4"/>
+              <w:bottom w:val="single" w:color="BFBFBF" w:sz="4"/>
+              <w:right w:val="single" w:color="BFBFBF" w:sz="4"/>
+            </w:tcBorders>
+            <w:shd w:fill="FFFFFF" w:val="clear"/>
+            <w:tcMar>
+              <w:top w:type="dxa" w:w="100"/>
+              <w:left w:type="dxa" w:w="140"/>
+              <w:bottom w:type="dxa" w:w="100"/>
+              <w:right w:type="dxa" w:w="140"/>
+            </w:tcMar>
+            <w:vAlign w:val="center"/>
+          </w:tcPr>
+          <w:p>
+            <w:pPr>
+              <w:spacing w:after="40" w:before="40"/>
+              <w:jc w:val="left"/>
+            </w:pPr>
+            <w:r>
+              <w:rPr>
+                <w:rFonts w:ascii="Calibri" w:cs="Calibri" w:eastAsia="Calibri" w:hAnsi="Calibri"/>
+                <w:b/>
+                <w:bCs/>
+                <w:sz w:val="22"/>
+                <w:szCs w:val="22"/>
+              </w:rPr>
+              <w:t xml:space="preserve">BMM Ispat Ltd.</w:t>
+            </w:r>
+          </w:p>
+        </w:tc>
+        <w:tc>
+          <w:tcPr>
+            <w:tcW w:type="dxa" w:w="5000"/>
+            <w:tcBorders>
+              <w:top w:val="single" w:color="BFBFBF" w:sz="4"/>
+              <w:left w:val="single" w:color="BFBFBF" w:sz="4"/>
+              <w:bottom w:val="single" w:color="BFBFBF" w:sz="4"/>
+              <w:right w:val="single" w:color="BFBFBF" w:sz="4"/>
+            </w:tcBorders>
+            <w:shd w:fill="FFFFFF" w:val="clear"/>
+            <w:tcMar>
+              <w:top w:type="dxa" w:w="100"/>
+              <w:left w:type="dxa" w:w="140"/>
+              <w:bottom w:type="dxa" w:w="100"/>
+              <w:right w:type="dxa" w:w="140"/>
+            </w:tcMar>
+            <w:vAlign w:val="center"/>
+          </w:tcPr>
+          <w:p>
+            <w:pPr>
+              <w:spacing w:after="40" w:before="40"/>
+              <w:jc w:val="left"/>
+            </w:pPr>
+            <w:r>
+              <w:rPr>
+                <w:rFonts w:ascii="Calibri" w:cs="Calibri" w:eastAsia="Calibri" w:hAnsi="Calibri"/>
+                <w:sz w:val="22"/>
+                <w:szCs w:val="22"/>
+              </w:rPr>
+              <w:t xml:space="preserve">Vertical Ladle Preheater</w:t>
             </w:r>
           </w:p>
         </w:tc>
@@ -24947,7 +25050,7 @@
                 <w:sz w:val="22"/>
                 <w:szCs w:val="22"/>
               </w:rPr>
-              <w:t xml:space="preserve">5</w:t>
+              <w:t>6</w:t>
             </w:r>
           </w:p>
         </w:tc>
@@ -24982,7 +25085,7 @@
                 <w:sz w:val="22"/>
                 <w:szCs w:val="22"/>
               </w:rPr>
-              <w:t xml:space="preserve">Danieli India Limited</w:t>
+              <w:t xml:space="preserve">BMM Ispat Ltd.</w:t>
             </w:r>
           </w:p>
         </w:tc>
@@ -25015,7 +25118,7 @@
                 <w:sz w:val="22"/>
                 <w:szCs w:val="22"/>
               </w:rPr>
-              <w:t xml:space="preserve">Tundish Preheater</w:t>
+              <w:t xml:space="preserve">Horizontal Ladle Preheater</w:t>
             </w:r>
           </w:p>
         </w:tc>
@@ -25050,7 +25153,7 @@
                 <w:sz w:val="22"/>
                 <w:szCs w:val="22"/>
               </w:rPr>
-              <w:t xml:space="preserve">6</w:t>
+              <w:t>7</w:t>
             </w:r>
           </w:p>
         </w:tc>
@@ -25118,7 +25221,7 @@
                 <w:sz w:val="22"/>
                 <w:szCs w:val="22"/>
               </w:rPr>
-              <w:t xml:space="preserve">Vertical Ladle Preheater</w:t>
+              <w:t xml:space="preserve">Tundish Preheater</w:t>
             </w:r>
           </w:p>
         </w:tc>
@@ -25153,7 +25256,7 @@
                 <w:sz w:val="22"/>
                 <w:szCs w:val="22"/>
               </w:rPr>
-              <w:t xml:space="preserve">7</w:t>
+              <w:t>8</w:t>
             </w:r>
           </w:p>
         </w:tc>
@@ -25188,7 +25291,7 @@
                 <w:sz w:val="22"/>
                 <w:szCs w:val="22"/>
               </w:rPr>
-              <w:t xml:space="preserve">BMM Ispat Ltd.</w:t>
+              <w:t xml:space="preserve">Electrotherm India Ltd.</w:t>
             </w:r>
           </w:p>
         </w:tc>
@@ -25221,7 +25324,7 @@
                 <w:sz w:val="22"/>
                 <w:szCs w:val="22"/>
               </w:rPr>
-              <w:t xml:space="preserve">Horizontal Ladle Preheater</w:t>
+              <w:t xml:space="preserve">Vertical Ladle Preheater - 15 MT</w:t>
             </w:r>
           </w:p>
         </w:tc>
@@ -25256,7 +25359,7 @@
                 <w:sz w:val="22"/>
                 <w:szCs w:val="22"/>
               </w:rPr>
-              <w:t xml:space="preserve">8</w:t>
+              <w:t>9</w:t>
             </w:r>
           </w:p>
         </w:tc>
@@ -25291,7 +25394,7 @@
                 <w:sz w:val="22"/>
                 <w:szCs w:val="22"/>
               </w:rPr>
-              <w:t xml:space="preserve">BMM Ispat Ltd.</w:t>
+              <w:t xml:space="preserve">Electrotherm India Ltd.</w:t>
             </w:r>
           </w:p>
         </w:tc>
@@ -25324,7 +25427,7 @@
                 <w:sz w:val="22"/>
                 <w:szCs w:val="22"/>
               </w:rPr>
-              <w:t xml:space="preserve">Tundish Preheater</w:t>
+              <w:t xml:space="preserve">Horizontal Ladle Preheater - 15 MT</w:t>
             </w:r>
           </w:p>
         </w:tc>
@@ -25359,7 +25462,7 @@
                 <w:sz w:val="22"/>
                 <w:szCs w:val="22"/>
               </w:rPr>
-              <w:t xml:space="preserve">9</w:t>
+              <w:t>10</w:t>
             </w:r>
           </w:p>
         </w:tc>
@@ -25394,7 +25497,7 @@
                 <w:sz w:val="22"/>
                 <w:szCs w:val="22"/>
               </w:rPr>
-              <w:t xml:space="preserve">Electrotherm India Ltd.</w:t>
+              <w:t xml:space="preserve">Siemens Ltd.</w:t>
             </w:r>
           </w:p>
         </w:tc>
@@ -25427,7 +25530,7 @@
                 <w:sz w:val="22"/>
                 <w:szCs w:val="22"/>
               </w:rPr>
-              <w:t xml:space="preserve">Vertical Ladle Preheater - 15 MT</w:t>
+              <w:t xml:space="preserve">Horizontal Ladle Preheater</w:t>
             </w:r>
           </w:p>
         </w:tc>
@@ -25462,7 +25565,7 @@
                 <w:sz w:val="22"/>
                 <w:szCs w:val="22"/>
               </w:rPr>
-              <w:t xml:space="preserve">10</w:t>
+              <w:t>11</w:t>
             </w:r>
           </w:p>
         </w:tc>
@@ -25497,7 +25600,7 @@
                 <w:sz w:val="22"/>
                 <w:szCs w:val="22"/>
               </w:rPr>
-              <w:t xml:space="preserve">Electrotherm India Ltd.</w:t>
+              <w:t xml:space="preserve">Siemens Ltd.</w:t>
             </w:r>
           </w:p>
         </w:tc>
@@ -25530,7 +25633,7 @@
                 <w:sz w:val="22"/>
                 <w:szCs w:val="22"/>
               </w:rPr>
-              <w:t xml:space="preserve">Horizontal Ladle Preheater - 15 MT</w:t>
+              <w:t xml:space="preserve">Vertical Ladle Preheater</w:t>
             </w:r>
           </w:p>
         </w:tc>
@@ -25565,7 +25668,7 @@
                 <w:sz w:val="22"/>
                 <w:szCs w:val="22"/>
               </w:rPr>
-              <w:t xml:space="preserve">11</w:t>
+              <w:t>12</w:t>
             </w:r>
           </w:p>
         </w:tc>
@@ -25600,7 +25703,7 @@
                 <w:sz w:val="22"/>
                 <w:szCs w:val="22"/>
               </w:rPr>
-              <w:t xml:space="preserve">Siemens Ltd.</w:t>
+              <w:t xml:space="preserve">E &amp; P Division Electrotherm India Ltd.</w:t>
             </w:r>
           </w:p>
         </w:tc>
@@ -25633,7 +25736,7 @@
                 <w:sz w:val="22"/>
                 <w:szCs w:val="22"/>
               </w:rPr>
-              <w:t xml:space="preserve">Horizontal Ladle Preheater</w:t>
+              <w:t xml:space="preserve">Horizontal Ladle Preheater - 30 MT</w:t>
             </w:r>
           </w:p>
         </w:tc>
@@ -25668,7 +25771,7 @@
                 <w:sz w:val="22"/>
                 <w:szCs w:val="22"/>
               </w:rPr>
-              <w:t xml:space="preserve">12</w:t>
+              <w:t>13</w:t>
             </w:r>
           </w:p>
         </w:tc>
@@ -25703,7 +25806,7 @@
                 <w:sz w:val="22"/>
                 <w:szCs w:val="22"/>
               </w:rPr>
-              <w:t xml:space="preserve">Siemens Ltd.</w:t>
+              <w:t xml:space="preserve">E &amp; P Division Electrotherm India Ltd.</w:t>
             </w:r>
           </w:p>
         </w:tc>
@@ -25736,7 +25839,7 @@
                 <w:sz w:val="22"/>
                 <w:szCs w:val="22"/>
               </w:rPr>
-              <w:t xml:space="preserve">Vertical Ladle Preheater</w:t>
+              <w:t xml:space="preserve">Vertical Ladle Preheater - 30 MT</w:t>
             </w:r>
           </w:p>
         </w:tc>
@@ -25771,7 +25874,7 @@
                 <w:sz w:val="22"/>
                 <w:szCs w:val="22"/>
               </w:rPr>
-              <w:t xml:space="preserve">13</w:t>
+              <w:t>14</w:t>
             </w:r>
           </w:p>
         </w:tc>
@@ -25806,7 +25909,7 @@
                 <w:sz w:val="22"/>
                 <w:szCs w:val="22"/>
               </w:rPr>
-              <w:t xml:space="preserve">E &amp; P Division Electrotherm India Ltd.</w:t>
+              <w:t xml:space="preserve">Hill Metal Est</w:t>
             </w:r>
           </w:p>
         </w:tc>
@@ -25839,7 +25942,7 @@
                 <w:sz w:val="22"/>
                 <w:szCs w:val="22"/>
               </w:rPr>
-              <w:t xml:space="preserve">Horizontal Ladle Preheater - 30 MT</w:t>
+              <w:t xml:space="preserve">Tundish Preheater</w:t>
             </w:r>
           </w:p>
         </w:tc>
@@ -25874,7 +25977,7 @@
                 <w:sz w:val="22"/>
                 <w:szCs w:val="22"/>
               </w:rPr>
-              <w:t xml:space="preserve">14</w:t>
+              <w:t>15</w:t>
             </w:r>
           </w:p>
         </w:tc>
@@ -25909,7 +26012,7 @@
                 <w:sz w:val="22"/>
                 <w:szCs w:val="22"/>
               </w:rPr>
-              <w:t xml:space="preserve">E &amp; P Division Electrotherm India Ltd.</w:t>
+              <w:t xml:space="preserve">PT. Gunung Raja Paksi</w:t>
             </w:r>
           </w:p>
         </w:tc>
@@ -25942,7 +26045,7 @@
                 <w:sz w:val="22"/>
                 <w:szCs w:val="22"/>
               </w:rPr>
-              <w:t xml:space="preserve">Vertical Ladle Preheater - 30 MT</w:t>
+              <w:t xml:space="preserve">Vertical Ladle Preheater</w:t>
             </w:r>
           </w:p>
         </w:tc>
@@ -25977,7 +26080,7 @@
                 <w:sz w:val="22"/>
                 <w:szCs w:val="22"/>
               </w:rPr>
-              <w:t xml:space="preserve">15</w:t>
+              <w:t>16</w:t>
             </w:r>
           </w:p>
         </w:tc>
@@ -26012,7 +26115,7 @@
                 <w:sz w:val="22"/>
                 <w:szCs w:val="22"/>
               </w:rPr>
-              <w:t xml:space="preserve">Hill Metal Est</w:t>
+              <w:t xml:space="preserve">PT. Gunung Raja Paksi</w:t>
             </w:r>
           </w:p>
         </w:tc>
@@ -26045,7 +26148,7 @@
                 <w:sz w:val="22"/>
                 <w:szCs w:val="22"/>
               </w:rPr>
-              <w:t xml:space="preserve">Tundish Preheater</w:t>
+              <w:t xml:space="preserve">Horizontal Ladle Preheater</w:t>
             </w:r>
           </w:p>
         </w:tc>
@@ -26080,7 +26183,7 @@
                 <w:sz w:val="22"/>
                 <w:szCs w:val="22"/>
               </w:rPr>
-              <w:t xml:space="preserve">16</w:t>
+              <w:t>17</w:t>
             </w:r>
           </w:p>
         </w:tc>
@@ -26115,7 +26218,7 @@
                 <w:sz w:val="22"/>
                 <w:szCs w:val="22"/>
               </w:rPr>
-              <w:t xml:space="preserve">PT. Gunung Raja Paksi</w:t>
+              <w:t xml:space="preserve">Danieli India Ltd.</w:t>
             </w:r>
           </w:p>
         </w:tc>
@@ -26148,7 +26251,110 @@
                 <w:sz w:val="22"/>
                 <w:szCs w:val="22"/>
               </w:rPr>
-              <w:t xml:space="preserve">Vertical Ladle Preheater</w:t>
+              <w:t xml:space="preserve">Tundish Preheater</w:t>
+            </w:r>
+          </w:p>
+        </w:tc>
+      </w:tr>
+      <w:tr>
+        <w:tc>
+          <w:tcPr>
+            <w:tcW w:type="dxa" w:w="780"/>
+            <w:tcBorders>
+              <w:top w:val="single" w:color="BFBFBF" w:sz="4"/>
+              <w:left w:val="single" w:color="BFBFBF" w:sz="4"/>
+              <w:bottom w:val="single" w:color="BFBFBF" w:sz="4"/>
+              <w:right w:val="single" w:color="BFBFBF" w:sz="4"/>
+            </w:tcBorders>
+            <w:shd w:fill="FFFFFF" w:val="clear"/>
+            <w:tcMar>
+              <w:top w:type="dxa" w:w="100"/>
+              <w:left w:type="dxa" w:w="140"/>
+              <w:bottom w:type="dxa" w:w="100"/>
+              <w:right w:type="dxa" w:w="140"/>
+            </w:tcMar>
+            <w:vAlign w:val="center"/>
+          </w:tcPr>
+          <w:p>
+            <w:pPr>
+              <w:spacing w:after="40" w:before="40"/>
+              <w:jc w:val="center"/>
+            </w:pPr>
+            <w:r>
+              <w:rPr>
+                <w:rFonts w:ascii="Calibri" w:cs="Calibri" w:eastAsia="Calibri" w:hAnsi="Calibri"/>
+                <w:sz w:val="22"/>
+                <w:szCs w:val="22"/>
+              </w:rPr>
+              <w:t>18</w:t>
+            </w:r>
+          </w:p>
+        </w:tc>
+        <w:tc>
+          <w:tcPr>
+            <w:tcW w:type="dxa" w:w="3580"/>
+            <w:tcBorders>
+              <w:top w:val="single" w:color="BFBFBF" w:sz="4"/>
+              <w:left w:val="single" w:color="BFBFBF" w:sz="4"/>
+              <w:bottom w:val="single" w:color="BFBFBF" w:sz="4"/>
+              <w:right w:val="single" w:color="BFBFBF" w:sz="4"/>
+            </w:tcBorders>
+            <w:shd w:fill="FFFFFF" w:val="clear"/>
+            <w:tcMar>
+              <w:top w:type="dxa" w:w="100"/>
+              <w:left w:type="dxa" w:w="140"/>
+              <w:bottom w:type="dxa" w:w="100"/>
+              <w:right w:type="dxa" w:w="140"/>
+            </w:tcMar>
+            <w:vAlign w:val="center"/>
+          </w:tcPr>
+          <w:p>
+            <w:pPr>
+              <w:spacing w:after="40" w:before="40"/>
+              <w:jc w:val="left"/>
+            </w:pPr>
+            <w:r>
+              <w:rPr>
+                <w:rFonts w:ascii="Calibri" w:cs="Calibri" w:eastAsia="Calibri" w:hAnsi="Calibri"/>
+                <w:b/>
+                <w:bCs/>
+                <w:sz w:val="22"/>
+                <w:szCs w:val="22"/>
+              </w:rPr>
+              <w:t xml:space="preserve">Primetals Technologies India Pvt. Ltd.</w:t>
+            </w:r>
+          </w:p>
+        </w:tc>
+        <w:tc>
+          <w:tcPr>
+            <w:tcW w:type="dxa" w:w="5000"/>
+            <w:tcBorders>
+              <w:top w:val="single" w:color="BFBFBF" w:sz="4"/>
+              <w:left w:val="single" w:color="BFBFBF" w:sz="4"/>
+              <w:bottom w:val="single" w:color="BFBFBF" w:sz="4"/>
+              <w:right w:val="single" w:color="BFBFBF" w:sz="4"/>
+            </w:tcBorders>
+            <w:shd w:fill="FFFFFF" w:val="clear"/>
+            <w:tcMar>
+              <w:top w:type="dxa" w:w="100"/>
+              <w:left w:type="dxa" w:w="140"/>
+              <w:bottom w:type="dxa" w:w="100"/>
+              <w:right w:type="dxa" w:w="140"/>
+            </w:tcMar>
+            <w:vAlign w:val="center"/>
+          </w:tcPr>
+          <w:p>
+            <w:pPr>
+              <w:spacing w:after="40" w:before="40"/>
+              <w:jc w:val="left"/>
+            </w:pPr>
+            <w:r>
+              <w:rPr>
+                <w:rFonts w:ascii="Calibri" w:cs="Calibri" w:eastAsia="Calibri" w:hAnsi="Calibri"/>
+                <w:sz w:val="22"/>
+                <w:szCs w:val="22"/>
+              </w:rPr>
+              <w:t xml:space="preserve">Tundish Preheater</w:t>
             </w:r>
           </w:p>
         </w:tc>
@@ -26183,7 +26389,7 @@
                 <w:sz w:val="22"/>
                 <w:szCs w:val="22"/>
               </w:rPr>
-              <w:t xml:space="preserve">17</w:t>
+              <w:t>19</w:t>
             </w:r>
           </w:p>
         </w:tc>
@@ -26218,7 +26424,7 @@
                 <w:sz w:val="22"/>
                 <w:szCs w:val="22"/>
               </w:rPr>
-              <w:t xml:space="preserve">PT. Gunung Raja Paksi</w:t>
+              <w:t xml:space="preserve">JSW Steel Limited</w:t>
             </w:r>
           </w:p>
         </w:tc>
@@ -26251,7 +26457,7 @@
                 <w:sz w:val="22"/>
                 <w:szCs w:val="22"/>
               </w:rPr>
-              <w:t xml:space="preserve">Horizontal Ladle Preheater</w:t>
+              <w:t xml:space="preserve">Tundish Preheater</w:t>
             </w:r>
           </w:p>
         </w:tc>
@@ -26286,7 +26492,7 @@
                 <w:sz w:val="22"/>
                 <w:szCs w:val="22"/>
               </w:rPr>
-              <w:t xml:space="preserve">18</w:t>
+              <w:t>20</w:t>
             </w:r>
           </w:p>
         </w:tc>
@@ -26321,7 +26527,7 @@
                 <w:sz w:val="22"/>
                 <w:szCs w:val="22"/>
               </w:rPr>
-              <w:t xml:space="preserve">Danieli India Ltd.</w:t>
+              <w:t xml:space="preserve">Kalyani Carpenter Special Steel Pvt. Ltd.</w:t>
             </w:r>
           </w:p>
         </w:tc>
@@ -26354,7 +26560,7 @@
                 <w:sz w:val="22"/>
                 <w:szCs w:val="22"/>
               </w:rPr>
-              <w:t xml:space="preserve">Tundish Preheater</w:t>
+              <w:t xml:space="preserve">Horizontal Ladle Preheater</w:t>
             </w:r>
           </w:p>
         </w:tc>
@@ -26389,7 +26595,7 @@
                 <w:sz w:val="22"/>
                 <w:szCs w:val="22"/>
               </w:rPr>
-              <w:t xml:space="preserve">19</w:t>
+              <w:t>21</w:t>
             </w:r>
           </w:p>
         </w:tc>
@@ -26424,7 +26630,7 @@
                 <w:sz w:val="22"/>
                 <w:szCs w:val="22"/>
               </w:rPr>
-              <w:t xml:space="preserve">Danieli India Ltd.</w:t>
+              <w:t xml:space="preserve">Jindal Shadeed Iron &amp; Steel LLC</w:t>
             </w:r>
           </w:p>
         </w:tc>
@@ -26438,109 +26644,6 @@
               <w:right w:val="single" w:color="BFBFBF" w:sz="4"/>
             </w:tcBorders>
             <w:shd w:fill="F3F4F6" w:val="clear"/>
-            <w:tcMar>
-              <w:top w:type="dxa" w:w="100"/>
-              <w:left w:type="dxa" w:w="140"/>
-              <w:bottom w:type="dxa" w:w="100"/>
-              <w:right w:type="dxa" w:w="140"/>
-            </w:tcMar>
-            <w:vAlign w:val="center"/>
-          </w:tcPr>
-          <w:p>
-            <w:pPr>
-              <w:spacing w:after="40" w:before="40"/>
-              <w:jc w:val="left"/>
-            </w:pPr>
-            <w:r>
-              <w:rPr>
-                <w:rFonts w:ascii="Calibri" w:cs="Calibri" w:eastAsia="Calibri" w:hAnsi="Calibri"/>
-                <w:sz w:val="22"/>
-                <w:szCs w:val="22"/>
-              </w:rPr>
-              <w:t xml:space="preserve">Tundish Preheater</w:t>
-            </w:r>
-          </w:p>
-        </w:tc>
-      </w:tr>
-      <w:tr>
-        <w:tc>
-          <w:tcPr>
-            <w:tcW w:type="dxa" w:w="780"/>
-            <w:tcBorders>
-              <w:top w:val="single" w:color="BFBFBF" w:sz="4"/>
-              <w:left w:val="single" w:color="BFBFBF" w:sz="4"/>
-              <w:bottom w:val="single" w:color="BFBFBF" w:sz="4"/>
-              <w:right w:val="single" w:color="BFBFBF" w:sz="4"/>
-            </w:tcBorders>
-            <w:shd w:fill="FFFFFF" w:val="clear"/>
-            <w:tcMar>
-              <w:top w:type="dxa" w:w="100"/>
-              <w:left w:type="dxa" w:w="140"/>
-              <w:bottom w:type="dxa" w:w="100"/>
-              <w:right w:type="dxa" w:w="140"/>
-            </w:tcMar>
-            <w:vAlign w:val="center"/>
-          </w:tcPr>
-          <w:p>
-            <w:pPr>
-              <w:spacing w:after="40" w:before="40"/>
-              <w:jc w:val="center"/>
-            </w:pPr>
-            <w:r>
-              <w:rPr>
-                <w:rFonts w:ascii="Calibri" w:cs="Calibri" w:eastAsia="Calibri" w:hAnsi="Calibri"/>
-                <w:sz w:val="22"/>
-                <w:szCs w:val="22"/>
-              </w:rPr>
-              <w:t xml:space="preserve">20</w:t>
-            </w:r>
-          </w:p>
-        </w:tc>
-        <w:tc>
-          <w:tcPr>
-            <w:tcW w:type="dxa" w:w="3580"/>
-            <w:tcBorders>
-              <w:top w:val="single" w:color="BFBFBF" w:sz="4"/>
-              <w:left w:val="single" w:color="BFBFBF" w:sz="4"/>
-              <w:bottom w:val="single" w:color="BFBFBF" w:sz="4"/>
-              <w:right w:val="single" w:color="BFBFBF" w:sz="4"/>
-            </w:tcBorders>
-            <w:shd w:fill="FFFFFF" w:val="clear"/>
-            <w:tcMar>
-              <w:top w:type="dxa" w:w="100"/>
-              <w:left w:type="dxa" w:w="140"/>
-              <w:bottom w:type="dxa" w:w="100"/>
-              <w:right w:type="dxa" w:w="140"/>
-            </w:tcMar>
-            <w:vAlign w:val="center"/>
-          </w:tcPr>
-          <w:p>
-            <w:pPr>
-              <w:spacing w:after="40" w:before="40"/>
-              <w:jc w:val="left"/>
-            </w:pPr>
-            <w:r>
-              <w:rPr>
-                <w:rFonts w:ascii="Calibri" w:cs="Calibri" w:eastAsia="Calibri" w:hAnsi="Calibri"/>
-                <w:b/>
-                <w:bCs/>
-                <w:sz w:val="22"/>
-                <w:szCs w:val="22"/>
-              </w:rPr>
-              <w:t xml:space="preserve">Primetals Technologies India Pvt. Ltd.</w:t>
-            </w:r>
-          </w:p>
-        </w:tc>
-        <w:tc>
-          <w:tcPr>
-            <w:tcW w:type="dxa" w:w="5000"/>
-            <w:tcBorders>
-              <w:top w:val="single" w:color="BFBFBF" w:sz="4"/>
-              <w:left w:val="single" w:color="BFBFBF" w:sz="4"/>
-              <w:bottom w:val="single" w:color="BFBFBF" w:sz="4"/>
-              <w:right w:val="single" w:color="BFBFBF" w:sz="4"/>
-            </w:tcBorders>
-            <w:shd w:fill="FFFFFF" w:val="clear"/>
             <w:tcMar>
               <w:top w:type="dxa" w:w="100"/>
               <w:left w:type="dxa" w:w="140"/>
@@ -26595,7 +26698,7 @@
                 <w:sz w:val="22"/>
                 <w:szCs w:val="22"/>
               </w:rPr>
-              <w:t xml:space="preserve">21</w:t>
+              <w:t>22</w:t>
             </w:r>
           </w:p>
         </w:tc>
@@ -26630,7 +26733,7 @@
                 <w:sz w:val="22"/>
                 <w:szCs w:val="22"/>
               </w:rPr>
-              <w:t xml:space="preserve">Danieli India Ltd.</w:t>
+              <w:t xml:space="preserve">Saarloha Advanced Materials (P) Ltd.</w:t>
             </w:r>
           </w:p>
         </w:tc>
@@ -26663,110 +26766,7 @@
                 <w:sz w:val="22"/>
                 <w:szCs w:val="22"/>
               </w:rPr>
-              <w:t xml:space="preserve">Tundish Preheater</w:t>
-            </w:r>
-          </w:p>
-        </w:tc>
-      </w:tr>
-      <w:tr>
-        <w:tc>
-          <w:tcPr>
-            <w:tcW w:type="dxa" w:w="780"/>
-            <w:tcBorders>
-              <w:top w:val="single" w:color="BFBFBF" w:sz="4"/>
-              <w:left w:val="single" w:color="BFBFBF" w:sz="4"/>
-              <w:bottom w:val="single" w:color="BFBFBF" w:sz="4"/>
-              <w:right w:val="single" w:color="BFBFBF" w:sz="4"/>
-            </w:tcBorders>
-            <w:shd w:fill="FFFFFF" w:val="clear"/>
-            <w:tcMar>
-              <w:top w:type="dxa" w:w="100"/>
-              <w:left w:type="dxa" w:w="140"/>
-              <w:bottom w:type="dxa" w:w="100"/>
-              <w:right w:type="dxa" w:w="140"/>
-            </w:tcMar>
-            <w:vAlign w:val="center"/>
-          </w:tcPr>
-          <w:p>
-            <w:pPr>
-              <w:spacing w:after="40" w:before="40"/>
-              <w:jc w:val="center"/>
-            </w:pPr>
-            <w:r>
-              <w:rPr>
-                <w:rFonts w:ascii="Calibri" w:cs="Calibri" w:eastAsia="Calibri" w:hAnsi="Calibri"/>
-                <w:sz w:val="22"/>
-                <w:szCs w:val="22"/>
-              </w:rPr>
-              <w:t xml:space="preserve">22</w:t>
-            </w:r>
-          </w:p>
-        </w:tc>
-        <w:tc>
-          <w:tcPr>
-            <w:tcW w:type="dxa" w:w="3580"/>
-            <w:tcBorders>
-              <w:top w:val="single" w:color="BFBFBF" w:sz="4"/>
-              <w:left w:val="single" w:color="BFBFBF" w:sz="4"/>
-              <w:bottom w:val="single" w:color="BFBFBF" w:sz="4"/>
-              <w:right w:val="single" w:color="BFBFBF" w:sz="4"/>
-            </w:tcBorders>
-            <w:shd w:fill="FFFFFF" w:val="clear"/>
-            <w:tcMar>
-              <w:top w:type="dxa" w:w="100"/>
-              <w:left w:type="dxa" w:w="140"/>
-              <w:bottom w:type="dxa" w:w="100"/>
-              <w:right w:type="dxa" w:w="140"/>
-            </w:tcMar>
-            <w:vAlign w:val="center"/>
-          </w:tcPr>
-          <w:p>
-            <w:pPr>
-              <w:spacing w:after="40" w:before="40"/>
-              <w:jc w:val="left"/>
-            </w:pPr>
-            <w:r>
-              <w:rPr>
-                <w:rFonts w:ascii="Calibri" w:cs="Calibri" w:eastAsia="Calibri" w:hAnsi="Calibri"/>
-                <w:b/>
-                <w:bCs/>
-                <w:sz w:val="22"/>
-                <w:szCs w:val="22"/>
-              </w:rPr>
-              <w:t xml:space="preserve">Primetals Technologies India Pvt. Ltd.</w:t>
-            </w:r>
-          </w:p>
-        </w:tc>
-        <w:tc>
-          <w:tcPr>
-            <w:tcW w:type="dxa" w:w="5000"/>
-            <w:tcBorders>
-              <w:top w:val="single" w:color="BFBFBF" w:sz="4"/>
-              <w:left w:val="single" w:color="BFBFBF" w:sz="4"/>
-              <w:bottom w:val="single" w:color="BFBFBF" w:sz="4"/>
-              <w:right w:val="single" w:color="BFBFBF" w:sz="4"/>
-            </w:tcBorders>
-            <w:shd w:fill="FFFFFF" w:val="clear"/>
-            <w:tcMar>
-              <w:top w:type="dxa" w:w="100"/>
-              <w:left w:type="dxa" w:w="140"/>
-              <w:bottom w:type="dxa" w:w="100"/>
-              <w:right w:type="dxa" w:w="140"/>
-            </w:tcMar>
-            <w:vAlign w:val="center"/>
-          </w:tcPr>
-          <w:p>
-            <w:pPr>
-              <w:spacing w:after="40" w:before="40"/>
-              <w:jc w:val="left"/>
-            </w:pPr>
-            <w:r>
-              <w:rPr>
-                <w:rFonts w:ascii="Calibri" w:cs="Calibri" w:eastAsia="Calibri" w:hAnsi="Calibri"/>
-                <w:sz w:val="22"/>
-                <w:szCs w:val="22"/>
-              </w:rPr>
-              <w:t xml:space="preserve">Tundish Preheater</w:t>
+              <w:t xml:space="preserve">Horizontal Ladle Preheater - 35 MT</w:t>
             </w:r>
           </w:p>
         </w:tc>
@@ -26801,7 +26801,7 @@
                 <w:sz w:val="22"/>
                 <w:szCs w:val="22"/>
               </w:rPr>
-              <w:t xml:space="preserve">23</w:t>
+              <w:t>23</w:t>
             </w:r>
           </w:p>
         </w:tc>
@@ -26836,7 +26836,7 @@
                 <w:sz w:val="22"/>
                 <w:szCs w:val="22"/>
               </w:rPr>
-              <w:t xml:space="preserve">JSW Steel Limited</w:t>
+              <w:t xml:space="preserve">Saarloha Advanced Materials (P) Ltd.</w:t>
             </w:r>
           </w:p>
         </w:tc>
@@ -26869,110 +26869,7 @@
                 <w:sz w:val="22"/>
                 <w:szCs w:val="22"/>
               </w:rPr>
-              <w:t xml:space="preserve">Tundish Preheater</w:t>
-            </w:r>
-          </w:p>
-        </w:tc>
-      </w:tr>
-      <w:tr>
-        <w:tc>
-          <w:tcPr>
-            <w:tcW w:type="dxa" w:w="780"/>
-            <w:tcBorders>
-              <w:top w:val="single" w:color="BFBFBF" w:sz="4"/>
-              <w:left w:val="single" w:color="BFBFBF" w:sz="4"/>
-              <w:bottom w:val="single" w:color="BFBFBF" w:sz="4"/>
-              <w:right w:val="single" w:color="BFBFBF" w:sz="4"/>
-            </w:tcBorders>
-            <w:shd w:fill="FFFFFF" w:val="clear"/>
-            <w:tcMar>
-              <w:top w:type="dxa" w:w="100"/>
-              <w:left w:type="dxa" w:w="140"/>
-              <w:bottom w:type="dxa" w:w="100"/>
-              <w:right w:type="dxa" w:w="140"/>
-            </w:tcMar>
-            <w:vAlign w:val="center"/>
-          </w:tcPr>
-          <w:p>
-            <w:pPr>
-              <w:spacing w:after="40" w:before="40"/>
-              <w:jc w:val="center"/>
-            </w:pPr>
-            <w:r>
-              <w:rPr>
-                <w:rFonts w:ascii="Calibri" w:cs="Calibri" w:eastAsia="Calibri" w:hAnsi="Calibri"/>
-                <w:sz w:val="22"/>
-                <w:szCs w:val="22"/>
-              </w:rPr>
-              <w:t xml:space="preserve">24</w:t>
-            </w:r>
-          </w:p>
-        </w:tc>
-        <w:tc>
-          <w:tcPr>
-            <w:tcW w:type="dxa" w:w="3580"/>
-            <w:tcBorders>
-              <w:top w:val="single" w:color="BFBFBF" w:sz="4"/>
-              <w:left w:val="single" w:color="BFBFBF" w:sz="4"/>
-              <w:bottom w:val="single" w:color="BFBFBF" w:sz="4"/>
-              <w:right w:val="single" w:color="BFBFBF" w:sz="4"/>
-            </w:tcBorders>
-            <w:shd w:fill="FFFFFF" w:val="clear"/>
-            <w:tcMar>
-              <w:top w:type="dxa" w:w="100"/>
-              <w:left w:type="dxa" w:w="140"/>
-              <w:bottom w:type="dxa" w:w="100"/>
-              <w:right w:type="dxa" w:w="140"/>
-            </w:tcMar>
-            <w:vAlign w:val="center"/>
-          </w:tcPr>
-          <w:p>
-            <w:pPr>
-              <w:spacing w:after="40" w:before="40"/>
-              <w:jc w:val="left"/>
-            </w:pPr>
-            <w:r>
-              <w:rPr>
-                <w:rFonts w:ascii="Calibri" w:cs="Calibri" w:eastAsia="Calibri" w:hAnsi="Calibri"/>
-                <w:b/>
-                <w:bCs/>
-                <w:sz w:val="22"/>
-                <w:szCs w:val="22"/>
-              </w:rPr>
-              <w:t xml:space="preserve">Kalyani Carpenter Special Steel Pvt. Ltd.</w:t>
-            </w:r>
-          </w:p>
-        </w:tc>
-        <w:tc>
-          <w:tcPr>
-            <w:tcW w:type="dxa" w:w="5000"/>
-            <w:tcBorders>
-              <w:top w:val="single" w:color="BFBFBF" w:sz="4"/>
-              <w:left w:val="single" w:color="BFBFBF" w:sz="4"/>
-              <w:bottom w:val="single" w:color="BFBFBF" w:sz="4"/>
-              <w:right w:val="single" w:color="BFBFBF" w:sz="4"/>
-            </w:tcBorders>
-            <w:shd w:fill="FFFFFF" w:val="clear"/>
-            <w:tcMar>
-              <w:top w:type="dxa" w:w="100"/>
-              <w:left w:type="dxa" w:w="140"/>
-              <w:bottom w:type="dxa" w:w="100"/>
-              <w:right w:type="dxa" w:w="140"/>
-            </w:tcMar>
-            <w:vAlign w:val="center"/>
-          </w:tcPr>
-          <w:p>
-            <w:pPr>
-              <w:spacing w:after="40" w:before="40"/>
-              <w:jc w:val="left"/>
-            </w:pPr>
-            <w:r>
-              <w:rPr>
-                <w:rFonts w:ascii="Calibri" w:cs="Calibri" w:eastAsia="Calibri" w:hAnsi="Calibri"/>
-                <w:sz w:val="22"/>
-                <w:szCs w:val="22"/>
-              </w:rPr>
-              <w:t xml:space="preserve">Horizontal Ladle Preheater</w:t>
+              <w:t xml:space="preserve">Vertical Ladle Preheater</w:t>
             </w:r>
           </w:p>
         </w:tc>
@@ -27007,7 +26904,7 @@
                 <w:sz w:val="22"/>
                 <w:szCs w:val="22"/>
               </w:rPr>
-              <w:t xml:space="preserve">25</w:t>
+              <w:t>24</w:t>
             </w:r>
           </w:p>
         </w:tc>
@@ -27042,7 +26939,7 @@
                 <w:sz w:val="22"/>
                 <w:szCs w:val="22"/>
               </w:rPr>
-              <w:t xml:space="preserve">Jindal Shadeed Iron &amp; Steel LLC</w:t>
+              <w:t xml:space="preserve">GPH Ispat Ltd.</w:t>
             </w:r>
           </w:p>
         </w:tc>
@@ -27075,7 +26972,7 @@
                 <w:sz w:val="22"/>
                 <w:szCs w:val="22"/>
               </w:rPr>
-              <w:t xml:space="preserve">Tundish Preheater</w:t>
+              <w:t xml:space="preserve">Vertical Ladle Preheater</w:t>
             </w:r>
           </w:p>
         </w:tc>
@@ -27110,7 +27007,7 @@
                 <w:sz w:val="22"/>
                 <w:szCs w:val="22"/>
               </w:rPr>
-              <w:t xml:space="preserve">26</w:t>
+              <w:t>25</w:t>
             </w:r>
           </w:p>
         </w:tc>
@@ -27145,7 +27042,7 @@
                 <w:sz w:val="22"/>
                 <w:szCs w:val="22"/>
               </w:rPr>
-              <w:t xml:space="preserve">Jindal Shadeed Iron &amp; Steel LLC</w:t>
+              <w:t xml:space="preserve">GPH Ispat Ltd.</w:t>
             </w:r>
           </w:p>
         </w:tc>
@@ -27178,7 +27075,7 @@
                 <w:sz w:val="22"/>
                 <w:szCs w:val="22"/>
               </w:rPr>
-              <w:t xml:space="preserve">Tundish Preheater</w:t>
+              <w:t xml:space="preserve">Horizontal Ladle Preheater</w:t>
             </w:r>
           </w:p>
         </w:tc>
@@ -27213,7 +27110,7 @@
                 <w:sz w:val="22"/>
                 <w:szCs w:val="22"/>
               </w:rPr>
-              <w:t xml:space="preserve">27</w:t>
+              <w:t>26</w:t>
             </w:r>
           </w:p>
         </w:tc>
@@ -27248,7 +27145,7 @@
                 <w:sz w:val="22"/>
                 <w:szCs w:val="22"/>
               </w:rPr>
-              <w:t xml:space="preserve">Saarloha Advanced Materials (P) Ltd.</w:t>
+              <w:t xml:space="preserve">SMS India Pvt. Ltd.</w:t>
             </w:r>
           </w:p>
         </w:tc>
@@ -27281,7 +27178,7 @@
                 <w:sz w:val="22"/>
                 <w:szCs w:val="22"/>
               </w:rPr>
-              <w:t xml:space="preserve">Horizontal Ladle Preheater - 35 MT</w:t>
+              <w:t xml:space="preserve">Tundish Preheater</w:t>
             </w:r>
           </w:p>
         </w:tc>
@@ -27316,7 +27213,7 @@
                 <w:sz w:val="22"/>
                 <w:szCs w:val="22"/>
               </w:rPr>
-              <w:t xml:space="preserve">28</w:t>
+              <w:t>27</w:t>
             </w:r>
           </w:p>
         </w:tc>
@@ -27351,7 +27248,7 @@
                 <w:sz w:val="22"/>
                 <w:szCs w:val="22"/>
               </w:rPr>
-              <w:t xml:space="preserve">Saarloha Advanced Materials (P) Ltd.</w:t>
+              <w:t xml:space="preserve">BSRM Steel Mills Limited</w:t>
             </w:r>
           </w:p>
         </w:tc>
@@ -27384,7 +27281,7 @@
                 <w:sz w:val="22"/>
                 <w:szCs w:val="22"/>
               </w:rPr>
-              <w:t xml:space="preserve">Vertical Ladle Preheater</w:t>
+              <w:t xml:space="preserve">Tundish Preheater</w:t>
             </w:r>
           </w:p>
         </w:tc>
@@ -27419,7 +27316,7 @@
                 <w:sz w:val="22"/>
                 <w:szCs w:val="22"/>
               </w:rPr>
-              <w:t xml:space="preserve">29</w:t>
+              <w:t>28</w:t>
             </w:r>
           </w:p>
         </w:tc>
@@ -27454,7 +27351,7 @@
                 <w:sz w:val="22"/>
                 <w:szCs w:val="22"/>
               </w:rPr>
-              <w:t xml:space="preserve">GPH Ispat Ltd.</w:t>
+              <w:t xml:space="preserve">Electrotherm India Limited</w:t>
             </w:r>
           </w:p>
         </w:tc>
@@ -27487,7 +27384,7 @@
                 <w:sz w:val="22"/>
                 <w:szCs w:val="22"/>
               </w:rPr>
-              <w:t xml:space="preserve">Vertical Ladle Preheater</w:t>
+              <w:t xml:space="preserve">Tundish Preheater</w:t>
             </w:r>
           </w:p>
         </w:tc>
@@ -27522,7 +27419,7 @@
                 <w:sz w:val="22"/>
                 <w:szCs w:val="22"/>
               </w:rPr>
-              <w:t xml:space="preserve">30</w:t>
+              <w:t>29</w:t>
             </w:r>
           </w:p>
         </w:tc>
@@ -27557,7 +27454,7 @@
                 <w:sz w:val="22"/>
                 <w:szCs w:val="22"/>
               </w:rPr>
-              <w:t xml:space="preserve">GPH Ispat Ltd.</w:t>
+              <w:t xml:space="preserve">Bhilai Steel Plant</w:t>
             </w:r>
           </w:p>
         </w:tc>
@@ -27590,7 +27487,7 @@
                 <w:sz w:val="22"/>
                 <w:szCs w:val="22"/>
               </w:rPr>
-              <w:t xml:space="preserve">Horizontal Ladle Preheater</w:t>
+              <w:t xml:space="preserve">Tundish Preheater</w:t>
             </w:r>
           </w:p>
         </w:tc>
@@ -27625,7 +27522,7 @@
                 <w:sz w:val="22"/>
                 <w:szCs w:val="22"/>
               </w:rPr>
-              <w:t xml:space="preserve">31</w:t>
+              <w:t>30</w:t>
             </w:r>
           </w:p>
         </w:tc>
@@ -27660,7 +27557,7 @@
                 <w:sz w:val="22"/>
                 <w:szCs w:val="22"/>
               </w:rPr>
-              <w:t xml:space="preserve">Danieli India Ltd.</w:t>
+              <w:t xml:space="preserve">Rungta Mines Limited</w:t>
             </w:r>
           </w:p>
         </w:tc>
@@ -27693,7 +27590,7 @@
                 <w:sz w:val="22"/>
                 <w:szCs w:val="22"/>
               </w:rPr>
-              <w:t xml:space="preserve">Tundish Preheater</w:t>
+              <w:t xml:space="preserve">Horizontal Ladle Preheater - 22 MT</w:t>
             </w:r>
           </w:p>
         </w:tc>
@@ -27728,7 +27625,7 @@
                 <w:sz w:val="22"/>
                 <w:szCs w:val="22"/>
               </w:rPr>
-              <w:t xml:space="preserve">32</w:t>
+              <w:t>31</w:t>
             </w:r>
           </w:p>
         </w:tc>
@@ -27763,7 +27660,7 @@
                 <w:sz w:val="22"/>
                 <w:szCs w:val="22"/>
               </w:rPr>
-              <w:t xml:space="preserve">SMS India Pvt. Ltd.</w:t>
+              <w:t xml:space="preserve">Rungta Mines Limited</w:t>
             </w:r>
           </w:p>
         </w:tc>
@@ -27796,7 +27693,7 @@
                 <w:sz w:val="22"/>
                 <w:szCs w:val="22"/>
               </w:rPr>
-              <w:t xml:space="preserve">Tundish Preheater</w:t>
+              <w:t xml:space="preserve">Vertical Ladle Preheater - 22 MT</w:t>
             </w:r>
           </w:p>
         </w:tc>
@@ -27831,7 +27728,7 @@
                 <w:sz w:val="22"/>
                 <w:szCs w:val="22"/>
               </w:rPr>
-              <w:t xml:space="preserve">33</w:t>
+              <w:t>32</w:t>
             </w:r>
           </w:p>
         </w:tc>
@@ -27866,7 +27763,7 @@
                 <w:sz w:val="22"/>
                 <w:szCs w:val="22"/>
               </w:rPr>
-              <w:t xml:space="preserve">BSRM Steel Mills Limited</w:t>
+              <w:t xml:space="preserve">Primetals Technologies India P. Ltd.</w:t>
             </w:r>
           </w:p>
         </w:tc>
@@ -27899,7 +27796,7 @@
                 <w:sz w:val="22"/>
                 <w:szCs w:val="22"/>
               </w:rPr>
-              <w:t xml:space="preserve">Tundish Preheater</w:t>
+              <w:t xml:space="preserve">Horizontal Ladle Preheater</w:t>
             </w:r>
           </w:p>
         </w:tc>
@@ -27934,7 +27831,7 @@
                 <w:sz w:val="22"/>
                 <w:szCs w:val="22"/>
               </w:rPr>
-              <w:t xml:space="preserve">34</w:t>
+              <w:t>33</w:t>
             </w:r>
           </w:p>
         </w:tc>
@@ -27969,7 +27866,7 @@
                 <w:sz w:val="22"/>
                 <w:szCs w:val="22"/>
               </w:rPr>
-              <w:t xml:space="preserve">Electrotherm India Limited</w:t>
+              <w:t xml:space="preserve">Primetals Technologies India P. Ltd.</w:t>
             </w:r>
           </w:p>
         </w:tc>
@@ -28002,7 +27899,7 @@
                 <w:sz w:val="22"/>
                 <w:szCs w:val="22"/>
               </w:rPr>
-              <w:t xml:space="preserve">Tundish Preheater</w:t>
+              <w:t xml:space="preserve">Vertical Ladle Preheater</w:t>
             </w:r>
           </w:p>
         </w:tc>
@@ -28037,7 +27934,7 @@
                 <w:sz w:val="22"/>
                 <w:szCs w:val="22"/>
               </w:rPr>
-              <w:t xml:space="preserve">35</w:t>
+              <w:t>34</w:t>
             </w:r>
           </w:p>
         </w:tc>
@@ -28072,7 +27969,7 @@
                 <w:sz w:val="22"/>
                 <w:szCs w:val="22"/>
               </w:rPr>
-              <w:t xml:space="preserve">Bhilai Steel Plant</w:t>
+              <w:t xml:space="preserve">Rashtriya Ispat Nigam Ltd.</w:t>
             </w:r>
           </w:p>
         </w:tc>
@@ -28140,7 +28037,7 @@
                 <w:sz w:val="22"/>
                 <w:szCs w:val="22"/>
               </w:rPr>
-              <w:t xml:space="preserve">36</w:t>
+              <w:t>35</w:t>
             </w:r>
           </w:p>
         </w:tc>
@@ -28175,7 +28072,7 @@
                 <w:sz w:val="22"/>
                 <w:szCs w:val="22"/>
               </w:rPr>
-              <w:t xml:space="preserve">Rungta Mines Limited</w:t>
+              <w:t xml:space="preserve">Jindal Stainless Limited A/c Primetals</w:t>
             </w:r>
           </w:p>
         </w:tc>
@@ -28208,7 +28105,7 @@
                 <w:sz w:val="22"/>
                 <w:szCs w:val="22"/>
               </w:rPr>
-              <w:t xml:space="preserve">Horizontal Ladle Preheater - 22 MT</w:t>
+              <w:t xml:space="preserve">Tundish Preheater</w:t>
             </w:r>
           </w:p>
         </w:tc>
@@ -28243,7 +28140,7 @@
                 <w:sz w:val="22"/>
                 <w:szCs w:val="22"/>
               </w:rPr>
-              <w:t xml:space="preserve">37</w:t>
+              <w:t>36</w:t>
             </w:r>
           </w:p>
         </w:tc>
@@ -28278,7 +28175,7 @@
                 <w:sz w:val="22"/>
                 <w:szCs w:val="22"/>
               </w:rPr>
-              <w:t xml:space="preserve">Rungta Mines Limited</w:t>
+              <w:t xml:space="preserve">Jindal Steel &amp; Power Ltd.</w:t>
             </w:r>
           </w:p>
         </w:tc>
@@ -28311,7 +28208,7 @@
                 <w:sz w:val="22"/>
                 <w:szCs w:val="22"/>
               </w:rPr>
-              <w:t xml:space="preserve">Vertical Ladle Preheater - 22 MT</w:t>
+              <w:t xml:space="preserve">Vertical Ladle Preheater - 100 MT</w:t>
             </w:r>
           </w:p>
         </w:tc>
@@ -28346,7 +28243,7 @@
                 <w:sz w:val="22"/>
                 <w:szCs w:val="22"/>
               </w:rPr>
-              <w:t xml:space="preserve">38</w:t>
+              <w:t>37</w:t>
             </w:r>
           </w:p>
         </w:tc>
@@ -28381,7 +28278,7 @@
                 <w:sz w:val="22"/>
                 <w:szCs w:val="22"/>
               </w:rPr>
-              <w:t xml:space="preserve">Electrotherm India Limited</w:t>
+              <w:t xml:space="preserve">Bangladesh Steel Re-Rolling Mills Ltd.</w:t>
             </w:r>
           </w:p>
         </w:tc>
@@ -28414,7 +28311,7 @@
                 <w:sz w:val="22"/>
                 <w:szCs w:val="22"/>
               </w:rPr>
-              <w:t xml:space="preserve">Tundish Preheater</w:t>
+              <w:t xml:space="preserve">Horizontal Ladle Preheater</w:t>
             </w:r>
           </w:p>
         </w:tc>
@@ -28449,7 +28346,7 @@
                 <w:sz w:val="22"/>
                 <w:szCs w:val="22"/>
               </w:rPr>
-              <w:t xml:space="preserve">39</w:t>
+              <w:t>38</w:t>
             </w:r>
           </w:p>
         </w:tc>
@@ -28484,7 +28381,7 @@
                 <w:sz w:val="22"/>
                 <w:szCs w:val="22"/>
               </w:rPr>
-              <w:t xml:space="preserve">Electrotherm India Limited</w:t>
+              <w:t xml:space="preserve">Kisco Castings India Ltd.</w:t>
             </w:r>
           </w:p>
         </w:tc>
@@ -28517,7 +28414,7 @@
                 <w:sz w:val="22"/>
                 <w:szCs w:val="22"/>
               </w:rPr>
-              <w:t xml:space="preserve">Tundish Preheater</w:t>
+              <w:t xml:space="preserve">Vertical Ladle Preheater - 11 MT</w:t>
             </w:r>
           </w:p>
         </w:tc>
@@ -28552,7 +28449,7 @@
                 <w:sz w:val="22"/>
                 <w:szCs w:val="22"/>
               </w:rPr>
-              <w:t xml:space="preserve">40</w:t>
+              <w:t>39</w:t>
             </w:r>
           </w:p>
         </w:tc>
@@ -28587,7 +28484,7 @@
                 <w:sz w:val="22"/>
                 <w:szCs w:val="22"/>
               </w:rPr>
-              <w:t xml:space="preserve">Electrotherm India Limited</w:t>
+              <w:t xml:space="preserve">Vardhman Special Steels Ltd. ( Unit-1)</w:t>
             </w:r>
           </w:p>
         </w:tc>
@@ -28620,7 +28517,7 @@
                 <w:sz w:val="22"/>
                 <w:szCs w:val="22"/>
               </w:rPr>
-              <w:t xml:space="preserve">Tundish Preheater</w:t>
+              <w:t xml:space="preserve">Vertical Ladle Preheater</w:t>
             </w:r>
           </w:p>
         </w:tc>
@@ -28655,7 +28552,7 @@
                 <w:sz w:val="22"/>
                 <w:szCs w:val="22"/>
               </w:rPr>
-              <w:t xml:space="preserve">41</w:t>
+              <w:t>40</w:t>
             </w:r>
           </w:p>
         </w:tc>
@@ -28690,7 +28587,7 @@
                 <w:sz w:val="22"/>
                 <w:szCs w:val="22"/>
               </w:rPr>
-              <w:t xml:space="preserve">Primetals Technologies India P. Ltd.</w:t>
+              <w:t xml:space="preserve">Vardhman Special Steels Ltd. ( Unit-1)</w:t>
             </w:r>
           </w:p>
         </w:tc>
@@ -28758,7 +28655,7 @@
                 <w:sz w:val="22"/>
                 <w:szCs w:val="22"/>
               </w:rPr>
-              <w:t xml:space="preserve">42</w:t>
+              <w:t>41</w:t>
             </w:r>
           </w:p>
         </w:tc>
@@ -28793,7 +28690,7 @@
                 <w:sz w:val="22"/>
                 <w:szCs w:val="22"/>
               </w:rPr>
-              <w:t xml:space="preserve">Primetals Technologies India P. Ltd.</w:t>
+              <w:t xml:space="preserve">Vardhman Special Steels Ltd. ( Unit-1)</w:t>
             </w:r>
           </w:p>
         </w:tc>
@@ -28826,7 +28723,7 @@
                 <w:sz w:val="22"/>
                 <w:szCs w:val="22"/>
               </w:rPr>
-              <w:t xml:space="preserve">Vertical Ladle Preheater</w:t>
+              <w:t xml:space="preserve">Vertical Ladle Preheater - 45 MT</w:t>
             </w:r>
           </w:p>
         </w:tc>
@@ -28861,7 +28758,7 @@
                 <w:sz w:val="22"/>
                 <w:szCs w:val="22"/>
               </w:rPr>
-              <w:t xml:space="preserve">43</w:t>
+              <w:t>42</w:t>
             </w:r>
           </w:p>
         </w:tc>
@@ -28896,7 +28793,7 @@
                 <w:sz w:val="22"/>
                 <w:szCs w:val="22"/>
               </w:rPr>
-              <w:t xml:space="preserve">Primetals Technologies India P. Ltd.</w:t>
+              <w:t xml:space="preserve">Rungta Mines Ltd.</w:t>
             </w:r>
           </w:p>
         </w:tc>
@@ -28929,7 +28826,7 @@
                 <w:sz w:val="22"/>
                 <w:szCs w:val="22"/>
               </w:rPr>
-              <w:t xml:space="preserve">Vertical Ladle Preheater</w:t>
+              <w:t xml:space="preserve">Horizontal Ladle Preheater - 45 MT</w:t>
             </w:r>
           </w:p>
         </w:tc>
@@ -28964,7 +28861,7 @@
                 <w:sz w:val="22"/>
                 <w:szCs w:val="22"/>
               </w:rPr>
-              <w:t xml:space="preserve">44</w:t>
+              <w:t>43</w:t>
             </w:r>
           </w:p>
         </w:tc>
@@ -28999,7 +28896,7 @@
                 <w:sz w:val="22"/>
                 <w:szCs w:val="22"/>
               </w:rPr>
-              <w:t xml:space="preserve">Rashtriya Ispat Nigam Ltd.</w:t>
+              <w:t xml:space="preserve">Rungta Mines Ltd.</w:t>
             </w:r>
           </w:p>
         </w:tc>
@@ -29032,7 +28929,7 @@
                 <w:sz w:val="22"/>
                 <w:szCs w:val="22"/>
               </w:rPr>
-              <w:t xml:space="preserve">Tundish Preheater</w:t>
+              <w:t xml:space="preserve">Horizontal Ladle Preheater - 250 MT</w:t>
             </w:r>
           </w:p>
         </w:tc>
@@ -29067,7 +28964,7 @@
                 <w:sz w:val="22"/>
                 <w:szCs w:val="22"/>
               </w:rPr>
-              <w:t xml:space="preserve">45</w:t>
+              <w:t>44</w:t>
             </w:r>
           </w:p>
         </w:tc>
@@ -29102,7 +28999,7 @@
                 <w:sz w:val="22"/>
                 <w:szCs w:val="22"/>
               </w:rPr>
-              <w:t xml:space="preserve">Rashtriya Ispat Nigam Ltd.</w:t>
+              <w:t xml:space="preserve">Rungta Mines Ltd.</w:t>
             </w:r>
           </w:p>
         </w:tc>
@@ -29135,7 +29032,7 @@
                 <w:sz w:val="22"/>
                 <w:szCs w:val="22"/>
               </w:rPr>
-              <w:t xml:space="preserve">Tundish Preheater</w:t>
+              <w:t xml:space="preserve">Vertical Ladle Preheater - 250 MT</w:t>
             </w:r>
           </w:p>
         </w:tc>
@@ -29170,7 +29067,7 @@
                 <w:sz w:val="22"/>
                 <w:szCs w:val="22"/>
               </w:rPr>
-              <w:t xml:space="preserve">46</w:t>
+              <w:t>45</w:t>
             </w:r>
           </w:p>
         </w:tc>
@@ -29205,7 +29102,7 @@
                 <w:sz w:val="22"/>
                 <w:szCs w:val="22"/>
               </w:rPr>
-              <w:t xml:space="preserve">Jindal Stainless Limited A/c Primetals</w:t>
+              <w:t xml:space="preserve">Rungta Mines Ltd.</w:t>
             </w:r>
           </w:p>
         </w:tc>
@@ -29238,7 +29135,7 @@
                 <w:sz w:val="22"/>
                 <w:szCs w:val="22"/>
               </w:rPr>
-              <w:t xml:space="preserve">Tundish Preheater</w:t>
+              <w:t xml:space="preserve">Vertical Ladle Preheater</w:t>
             </w:r>
           </w:p>
         </w:tc>
@@ -29273,7 +29170,7 @@
                 <w:sz w:val="22"/>
                 <w:szCs w:val="22"/>
               </w:rPr>
-              <w:t xml:space="preserve">47</w:t>
+              <w:t>46</w:t>
             </w:r>
           </w:p>
         </w:tc>
@@ -29308,7 +29205,7 @@
                 <w:sz w:val="22"/>
                 <w:szCs w:val="22"/>
               </w:rPr>
-              <w:t xml:space="preserve">Rashtriya Ispat Nigam Ltd.</w:t>
+              <w:t xml:space="preserve">Tata Steel Long Products</w:t>
             </w:r>
           </w:p>
         </w:tc>
@@ -29341,7 +29238,7 @@
                 <w:sz w:val="22"/>
                 <w:szCs w:val="22"/>
               </w:rPr>
-              <w:t xml:space="preserve">Tundish Preheater</w:t>
+              <w:t xml:space="preserve">Vertical Ladle Preheater - 70 MT</w:t>
             </w:r>
           </w:p>
         </w:tc>
@@ -29376,7 +29273,7 @@
                 <w:sz w:val="22"/>
                 <w:szCs w:val="22"/>
               </w:rPr>
-              <w:t xml:space="preserve">48</w:t>
+              <w:t>47</w:t>
             </w:r>
           </w:p>
         </w:tc>
@@ -29411,7 +29308,7 @@
                 <w:sz w:val="22"/>
                 <w:szCs w:val="22"/>
               </w:rPr>
-              <w:t xml:space="preserve">Rashtriya Ispat Nigam Ltd.</w:t>
+              <w:t xml:space="preserve">Jindal Steel Iron &amp; Steel LLC</w:t>
             </w:r>
           </w:p>
         </w:tc>
@@ -29479,7 +29376,7 @@
                 <w:sz w:val="22"/>
                 <w:szCs w:val="22"/>
               </w:rPr>
-              <w:t xml:space="preserve">49</w:t>
+              <w:t>48</w:t>
             </w:r>
           </w:p>
         </w:tc>
@@ -29514,7 +29411,7 @@
                 <w:sz w:val="22"/>
                 <w:szCs w:val="22"/>
               </w:rPr>
-              <w:t xml:space="preserve">Jindal Steel &amp; Power Ltd.</w:t>
+              <w:t xml:space="preserve">Tata Steel Long Products</w:t>
             </w:r>
           </w:p>
         </w:tc>
@@ -29547,7 +29444,7 @@
                 <w:sz w:val="22"/>
                 <w:szCs w:val="22"/>
               </w:rPr>
-              <w:t xml:space="preserve">Vertical Ladle Preheater - 100 MT</w:t>
+              <w:t xml:space="preserve">Vertical Ladle Preheater</w:t>
             </w:r>
           </w:p>
         </w:tc>
@@ -29582,7 +29479,7 @@
                 <w:sz w:val="22"/>
                 <w:szCs w:val="22"/>
               </w:rPr>
-              <w:t xml:space="preserve">50</w:t>
+              <w:t>49</w:t>
             </w:r>
           </w:p>
         </w:tc>
@@ -29617,7 +29514,7 @@
                 <w:sz w:val="22"/>
                 <w:szCs w:val="22"/>
               </w:rPr>
-              <w:t xml:space="preserve">Bangladesh Steel Re-Rolling Mills Ltd.</w:t>
+              <w:t xml:space="preserve">JSW Power Steel Ltd.</w:t>
             </w:r>
           </w:p>
         </w:tc>
@@ -29650,7 +29547,7 @@
                 <w:sz w:val="22"/>
                 <w:szCs w:val="22"/>
               </w:rPr>
-              <w:t xml:space="preserve">Horizontal Ladle Preheater</w:t>
+              <w:t xml:space="preserve">Tundish Preheater</w:t>
             </w:r>
           </w:p>
         </w:tc>
@@ -29685,7 +29582,7 @@
                 <w:sz w:val="22"/>
                 <w:szCs w:val="22"/>
               </w:rPr>
-              <w:t xml:space="preserve">51</w:t>
+              <w:t>50</w:t>
             </w:r>
           </w:p>
         </w:tc>
@@ -29720,7 +29617,7 @@
                 <w:sz w:val="22"/>
                 <w:szCs w:val="22"/>
               </w:rPr>
-              <w:t xml:space="preserve">Kisco Castings India Ltd.</w:t>
+              <w:t xml:space="preserve">Jindal Stainless Limited</w:t>
             </w:r>
           </w:p>
         </w:tc>
@@ -29753,7 +29650,7 @@
                 <w:sz w:val="22"/>
                 <w:szCs w:val="22"/>
               </w:rPr>
-              <w:t xml:space="preserve">Vertical Ladle Preheater - 11 MT</w:t>
+              <w:t xml:space="preserve">Horizontal Ladle Preheater - 150 MT</w:t>
             </w:r>
           </w:p>
         </w:tc>
@@ -29788,7 +29685,7 @@
                 <w:sz w:val="22"/>
                 <w:szCs w:val="22"/>
               </w:rPr>
-              <w:t xml:space="preserve">52</w:t>
+              <w:t>51</w:t>
             </w:r>
           </w:p>
         </w:tc>
@@ -29823,7 +29720,7 @@
                 <w:sz w:val="22"/>
                 <w:szCs w:val="22"/>
               </w:rPr>
-              <w:t xml:space="preserve">Vardhman Special Steels Ltd. ( Unit-1)</w:t>
+              <w:t xml:space="preserve">Jindal Stainless Limited</w:t>
             </w:r>
           </w:p>
         </w:tc>
@@ -29856,7 +29753,7 @@
                 <w:sz w:val="22"/>
                 <w:szCs w:val="22"/>
               </w:rPr>
-              <w:t xml:space="preserve">Vertical Ladle Preheater</w:t>
+              <w:t xml:space="preserve">Horizontal Ladle Preheater - 130 MT</w:t>
             </w:r>
           </w:p>
         </w:tc>
@@ -29891,7 +29788,7 @@
                 <w:sz w:val="22"/>
                 <w:szCs w:val="22"/>
               </w:rPr>
-              <w:t xml:space="preserve">53</w:t>
+              <w:t>52</w:t>
             </w:r>
           </w:p>
         </w:tc>
@@ -29926,7 +29823,7 @@
                 <w:sz w:val="22"/>
                 <w:szCs w:val="22"/>
               </w:rPr>
-              <w:t xml:space="preserve">Vardhman Special Steels Ltd. ( Unit-1)</w:t>
+              <w:t xml:space="preserve">Jindal Stainless Limited</w:t>
             </w:r>
           </w:p>
         </w:tc>
@@ -29959,7 +29856,7 @@
                 <w:sz w:val="22"/>
                 <w:szCs w:val="22"/>
               </w:rPr>
-              <w:t xml:space="preserve">Horizontal Ladle Preheater</w:t>
+              <w:t xml:space="preserve">Vertical Ladle Preheater - 150 MT</w:t>
             </w:r>
           </w:p>
         </w:tc>
@@ -29994,7 +29891,7 @@
                 <w:sz w:val="22"/>
                 <w:szCs w:val="22"/>
               </w:rPr>
-              <w:t xml:space="preserve">54</w:t>
+              <w:t>53</w:t>
             </w:r>
           </w:p>
         </w:tc>
@@ -30029,7 +29926,7 @@
                 <w:sz w:val="22"/>
                 <w:szCs w:val="22"/>
               </w:rPr>
-              <w:t xml:space="preserve">Vardhman Special Steels Ltd. ( Unit-1)</w:t>
+              <w:t xml:space="preserve">Primetals Technologies India Limited</w:t>
             </w:r>
           </w:p>
         </w:tc>
@@ -30062,7 +29959,7 @@
                 <w:sz w:val="22"/>
                 <w:szCs w:val="22"/>
               </w:rPr>
-              <w:t xml:space="preserve">Vertical Ladle Preheater - 45 MT</w:t>
+              <w:t xml:space="preserve">Tundish Preheater</w:t>
             </w:r>
           </w:p>
         </w:tc>
@@ -30097,7 +29994,7 @@
                 <w:sz w:val="22"/>
                 <w:szCs w:val="22"/>
               </w:rPr>
-              <w:t xml:space="preserve">55</w:t>
+              <w:t>54</w:t>
             </w:r>
           </w:p>
         </w:tc>
@@ -30132,7 +30029,7 @@
                 <w:sz w:val="22"/>
                 <w:szCs w:val="22"/>
               </w:rPr>
-              <w:t xml:space="preserve">Rungta Mines Ltd.</w:t>
+              <w:t xml:space="preserve">Emirates Steel Industries</w:t>
             </w:r>
           </w:p>
         </w:tc>
@@ -30165,7 +30062,7 @@
                 <w:sz w:val="22"/>
                 <w:szCs w:val="22"/>
               </w:rPr>
-              <w:t xml:space="preserve">Horizontal Ladle Preheater - 45 MT</w:t>
+              <w:t xml:space="preserve">Tundish Preheater</w:t>
             </w:r>
           </w:p>
         </w:tc>
@@ -30200,7 +30097,7 @@
                 <w:sz w:val="22"/>
                 <w:szCs w:val="22"/>
               </w:rPr>
-              <w:t xml:space="preserve">56</w:t>
+              <w:t>55</w:t>
             </w:r>
           </w:p>
         </w:tc>
@@ -30235,7 +30132,7 @@
                 <w:sz w:val="22"/>
                 <w:szCs w:val="22"/>
               </w:rPr>
-              <w:t xml:space="preserve">Rungta Mines Ltd.</w:t>
+              <w:t xml:space="preserve">Jindal Steel &amp; Power Limited</w:t>
             </w:r>
           </w:p>
         </w:tc>
@@ -30268,7 +30165,7 @@
                 <w:sz w:val="22"/>
                 <w:szCs w:val="22"/>
               </w:rPr>
-              <w:t xml:space="preserve">Horizontal Ladle Preheater - 250 MT</w:t>
+              <w:t xml:space="preserve">Vertical Ladle Preheater - 65 MT</w:t>
             </w:r>
           </w:p>
         </w:tc>
@@ -30303,7 +30200,7 @@
                 <w:sz w:val="22"/>
                 <w:szCs w:val="22"/>
               </w:rPr>
-              <w:t xml:space="preserve">57</w:t>
+              <w:t>56</w:t>
             </w:r>
           </w:p>
         </w:tc>
@@ -30338,7 +30235,7 @@
                 <w:sz w:val="22"/>
                 <w:szCs w:val="22"/>
               </w:rPr>
-              <w:t xml:space="preserve">Rungta Mines Ltd.</w:t>
+              <w:t xml:space="preserve">Jindal Steel &amp; Power Limited</w:t>
             </w:r>
           </w:p>
         </w:tc>
@@ -30371,7 +30268,7 @@
                 <w:sz w:val="22"/>
                 <w:szCs w:val="22"/>
               </w:rPr>
-              <w:t xml:space="preserve">Vertical Ladle Preheater - 250 MT</w:t>
+              <w:t xml:space="preserve">Tundish Preheater</w:t>
             </w:r>
           </w:p>
         </w:tc>
@@ -30406,7 +30303,7 @@
                 <w:sz w:val="22"/>
                 <w:szCs w:val="22"/>
               </w:rPr>
-              <w:t xml:space="preserve">58</w:t>
+              <w:t>57</w:t>
             </w:r>
           </w:p>
         </w:tc>
@@ -30441,7 +30338,7 @@
                 <w:sz w:val="22"/>
                 <w:szCs w:val="22"/>
               </w:rPr>
-              <w:t xml:space="preserve">Rungta Mines Ltd.</w:t>
+              <w:t xml:space="preserve">Aarti Steel Limited</w:t>
             </w:r>
           </w:p>
         </w:tc>
@@ -30474,7 +30371,7 @@
                 <w:sz w:val="22"/>
                 <w:szCs w:val="22"/>
               </w:rPr>
-              <w:t xml:space="preserve">Vertical Ladle Preheater</w:t>
+              <w:t xml:space="preserve">Tundish Preheater</w:t>
             </w:r>
           </w:p>
         </w:tc>
@@ -30509,7 +30406,7 @@
                 <w:sz w:val="22"/>
                 <w:szCs w:val="22"/>
               </w:rPr>
-              <w:t xml:space="preserve">59</w:t>
+              <w:t>58</w:t>
             </w:r>
           </w:p>
         </w:tc>
@@ -30544,7 +30441,7 @@
                 <w:sz w:val="22"/>
                 <w:szCs w:val="22"/>
               </w:rPr>
-              <w:t xml:space="preserve">Tata Steel Long Products</w:t>
+              <w:t xml:space="preserve">Action Ispat And Power P Ltd.</w:t>
             </w:r>
           </w:p>
         </w:tc>
@@ -30577,7 +30474,7 @@
                 <w:sz w:val="22"/>
                 <w:szCs w:val="22"/>
               </w:rPr>
-              <w:t xml:space="preserve">Vertical Ladle Preheater - 70 MT</w:t>
+              <w:t xml:space="preserve">Vertical Ladle Preheater - 15 MT</w:t>
             </w:r>
           </w:p>
         </w:tc>
@@ -30612,7 +30509,7 @@
                 <w:sz w:val="22"/>
                 <w:szCs w:val="22"/>
               </w:rPr>
-              <w:t xml:space="preserve">60</w:t>
+              <w:t>59</w:t>
             </w:r>
           </w:p>
         </w:tc>
@@ -30647,7 +30544,7 @@
                 <w:sz w:val="22"/>
                 <w:szCs w:val="22"/>
               </w:rPr>
-              <w:t xml:space="preserve">Jindal Steel Iron &amp; Steel LLC</w:t>
+              <w:t xml:space="preserve">Action Ispat And Power P Ltd.</w:t>
             </w:r>
           </w:p>
         </w:tc>
@@ -30680,7 +30577,7 @@
                 <w:sz w:val="22"/>
                 <w:szCs w:val="22"/>
               </w:rPr>
-              <w:t xml:space="preserve">Tundish Preheater</w:t>
+              <w:t xml:space="preserve">Vertical Ladle Preheater</w:t>
             </w:r>
           </w:p>
         </w:tc>
@@ -30715,7 +30612,7 @@
                 <w:sz w:val="22"/>
                 <w:szCs w:val="22"/>
               </w:rPr>
-              <w:t xml:space="preserve">61</w:t>
+              <w:t>60</w:t>
             </w:r>
           </w:p>
         </w:tc>
@@ -30750,7 +30647,7 @@
                 <w:sz w:val="22"/>
                 <w:szCs w:val="22"/>
               </w:rPr>
-              <w:t xml:space="preserve">Tata Steel Long Products</w:t>
+              <w:t xml:space="preserve">Vardhman Special Steels Ltd.Unit-1</w:t>
             </w:r>
           </w:p>
         </w:tc>
@@ -30783,7 +30680,7 @@
                 <w:sz w:val="22"/>
                 <w:szCs w:val="22"/>
               </w:rPr>
-              <w:t xml:space="preserve">Vertical Ladle Preheater</w:t>
+              <w:t xml:space="preserve">Tundish Preheater</w:t>
             </w:r>
           </w:p>
         </w:tc>
@@ -30818,7 +30715,7 @@
                 <w:sz w:val="22"/>
                 <w:szCs w:val="22"/>
               </w:rPr>
-              <w:t xml:space="preserve">62</w:t>
+              <w:t>61</w:t>
             </w:r>
           </w:p>
         </w:tc>
@@ -30853,7 +30750,7 @@
                 <w:sz w:val="22"/>
                 <w:szCs w:val="22"/>
               </w:rPr>
-              <w:t xml:space="preserve">JSW Power Steel Ltd.</w:t>
+              <w:t xml:space="preserve">Bangladesh Re Rolling Mills Ltd.</w:t>
             </w:r>
           </w:p>
         </w:tc>
@@ -30921,7 +30818,7 @@
                 <w:sz w:val="22"/>
                 <w:szCs w:val="22"/>
               </w:rPr>
-              <w:t xml:space="preserve">63</w:t>
+              <w:t>62</w:t>
             </w:r>
           </w:p>
         </w:tc>
@@ -30956,7 +30853,7 @@
                 <w:sz w:val="22"/>
                 <w:szCs w:val="22"/>
               </w:rPr>
-              <w:t xml:space="preserve">JSW Power Steel Ltd.</w:t>
+              <w:t xml:space="preserve">Amic Forging Ltd.</w:t>
             </w:r>
           </w:p>
         </w:tc>
@@ -30989,7 +30886,7 @@
                 <w:sz w:val="22"/>
                 <w:szCs w:val="22"/>
               </w:rPr>
-              <w:t xml:space="preserve">Tundish Preheater</w:t>
+              <w:t xml:space="preserve">Vertical Ladle Preheater - 10 MT</w:t>
             </w:r>
           </w:p>
         </w:tc>
@@ -31024,7 +30921,7 @@
                 <w:sz w:val="22"/>
                 <w:szCs w:val="22"/>
               </w:rPr>
-              <w:t xml:space="preserve">64</w:t>
+              <w:t>63</w:t>
             </w:r>
           </w:p>
         </w:tc>
@@ -31059,7 +30956,7 @@
                 <w:sz w:val="22"/>
                 <w:szCs w:val="22"/>
               </w:rPr>
-              <w:t xml:space="preserve">JSW Power Steel Ltd.</w:t>
+              <w:t xml:space="preserve">Lloyds Engineering Works Limited</w:t>
             </w:r>
           </w:p>
         </w:tc>
@@ -31092,7 +30989,7 @@
                 <w:sz w:val="22"/>
                 <w:szCs w:val="22"/>
               </w:rPr>
-              <w:t xml:space="preserve">Tundish Preheater</w:t>
+              <w:t xml:space="preserve">Vertical Ladle Preheater - 50 MT</w:t>
             </w:r>
           </w:p>
         </w:tc>
@@ -31127,7 +31024,7 @@
                 <w:sz w:val="22"/>
                 <w:szCs w:val="22"/>
               </w:rPr>
-              <w:t xml:space="preserve">65</w:t>
+              <w:t>64</w:t>
             </w:r>
           </w:p>
         </w:tc>
@@ -31162,7 +31059,7 @@
                 <w:sz w:val="22"/>
                 <w:szCs w:val="22"/>
               </w:rPr>
-              <w:t xml:space="preserve">Jindal Stainless Limited</w:t>
+              <w:t xml:space="preserve">Lloyds Engineering Works Limited</w:t>
             </w:r>
           </w:p>
         </w:tc>
@@ -31195,7 +31092,7 @@
                 <w:sz w:val="22"/>
                 <w:szCs w:val="22"/>
               </w:rPr>
-              <w:t xml:space="preserve">Horizontal Ladle Preheater - 150 MT</w:t>
+              <w:t xml:space="preserve">Vertical Ladle Preheater - 40 MT</w:t>
             </w:r>
           </w:p>
         </w:tc>
@@ -31230,7 +31127,7 @@
                 <w:sz w:val="22"/>
                 <w:szCs w:val="22"/>
               </w:rPr>
-              <w:t xml:space="preserve">66</w:t>
+              <w:t>65</w:t>
             </w:r>
           </w:p>
         </w:tc>
@@ -31265,7 +31162,7 @@
                 <w:sz w:val="22"/>
                 <w:szCs w:val="22"/>
               </w:rPr>
-              <w:t xml:space="preserve">Jindal Stainless Limited</w:t>
+              <w:t xml:space="preserve">Muhaj Baghdad Co. Ltd.</w:t>
             </w:r>
           </w:p>
         </w:tc>
@@ -31298,7 +31195,7 @@
                 <w:sz w:val="22"/>
                 <w:szCs w:val="22"/>
               </w:rPr>
-              <w:t xml:space="preserve">Horizontal Ladle Preheater - 130 MT</w:t>
+              <w:t xml:space="preserve">Tundish Preheater</w:t>
             </w:r>
           </w:p>
         </w:tc>
@@ -31333,7 +31230,7 @@
                 <w:sz w:val="22"/>
                 <w:szCs w:val="22"/>
               </w:rPr>
-              <w:t xml:space="preserve">67</w:t>
+              <w:t>66</w:t>
             </w:r>
           </w:p>
         </w:tc>
@@ -31368,7 +31265,7 @@
                 <w:sz w:val="22"/>
                 <w:szCs w:val="22"/>
               </w:rPr>
-              <w:t xml:space="preserve">Jindal Stainless Limited</w:t>
+              <w:t xml:space="preserve">Topworth Steels &amp; Power Pvt. Ltd.</w:t>
             </w:r>
           </w:p>
         </w:tc>
@@ -31401,7 +31298,7 @@
                 <w:sz w:val="22"/>
                 <w:szCs w:val="22"/>
               </w:rPr>
-              <w:t xml:space="preserve">Vertical Ladle Preheater - 150 MT</w:t>
+              <w:t xml:space="preserve">Vertical Ladle Preheater</w:t>
             </w:r>
           </w:p>
         </w:tc>
@@ -31436,7 +31333,7 @@
                 <w:sz w:val="22"/>
                 <w:szCs w:val="22"/>
               </w:rPr>
-              <w:t xml:space="preserve">68</w:t>
+              <w:t>67</w:t>
             </w:r>
           </w:p>
         </w:tc>
@@ -31471,7 +31368,7 @@
                 <w:sz w:val="22"/>
                 <w:szCs w:val="22"/>
               </w:rPr>
-              <w:t xml:space="preserve">Primetals Technologies India Limited</w:t>
+              <w:t xml:space="preserve">JSW Steel Limited</w:t>
             </w:r>
           </w:p>
         </w:tc>
@@ -31504,7 +31401,7 @@
                 <w:sz w:val="22"/>
                 <w:szCs w:val="22"/>
               </w:rPr>
-              <w:t xml:space="preserve">Tundish Preheater</w:t>
+              <w:t xml:space="preserve">Vertical Ladle Preheater</w:t>
             </w:r>
           </w:p>
         </w:tc>
@@ -31539,7 +31436,7 @@
                 <w:sz w:val="22"/>
                 <w:szCs w:val="22"/>
               </w:rPr>
-              <w:t xml:space="preserve">69</w:t>
+              <w:t>68</w:t>
             </w:r>
           </w:p>
         </w:tc>
@@ -31574,7 +31471,7 @@
                 <w:sz w:val="22"/>
                 <w:szCs w:val="22"/>
               </w:rPr>
-              <w:t xml:space="preserve">Primetals Technologies India Pvt. Ltd.</w:t>
+              <w:t xml:space="preserve">Sohar Steel LLC</w:t>
             </w:r>
           </w:p>
         </w:tc>
@@ -31607,7 +31504,7 @@
                 <w:sz w:val="22"/>
                 <w:szCs w:val="22"/>
               </w:rPr>
-              <w:t xml:space="preserve">Tundish Preheater</w:t>
+              <w:t xml:space="preserve">Vertical Ladle Preheater</w:t>
             </w:r>
           </w:p>
         </w:tc>
@@ -31642,7 +31539,7 @@
                 <w:sz w:val="22"/>
                 <w:szCs w:val="22"/>
               </w:rPr>
-              <w:t xml:space="preserve">70</w:t>
+              <w:t>69</w:t>
             </w:r>
           </w:p>
         </w:tc>
@@ -31677,7 +31574,7 @@
                 <w:sz w:val="22"/>
                 <w:szCs w:val="22"/>
               </w:rPr>
-              <w:t xml:space="preserve">Emirates Steel Industries</w:t>
+              <w:t xml:space="preserve">Sohar Steel LLC</w:t>
             </w:r>
           </w:p>
         </w:tc>
@@ -31710,7 +31607,7 @@
                 <w:sz w:val="22"/>
                 <w:szCs w:val="22"/>
               </w:rPr>
-              <w:t xml:space="preserve">Tundish Preheater</w:t>
+              <w:t xml:space="preserve">Horizontal Ladle Preheater</w:t>
             </w:r>
           </w:p>
         </w:tc>
@@ -31745,7 +31642,7 @@
                 <w:sz w:val="22"/>
                 <w:szCs w:val="22"/>
               </w:rPr>
-              <w:t xml:space="preserve">71</w:t>
+              <w:t>70</w:t>
             </w:r>
           </w:p>
         </w:tc>
@@ -31780,7 +31677,7 @@
                 <w:sz w:val="22"/>
                 <w:szCs w:val="22"/>
               </w:rPr>
-              <w:t xml:space="preserve">Jindal Steel &amp; Power Limited</w:t>
+              <w:t xml:space="preserve">Quality Industries P Ltd.</w:t>
             </w:r>
           </w:p>
         </w:tc>
@@ -31813,7 +31710,7 @@
                 <w:sz w:val="22"/>
                 <w:szCs w:val="22"/>
               </w:rPr>
-              <w:t xml:space="preserve">Vertical Ladle Preheater - 65 MT</w:t>
+              <w:t xml:space="preserve">Vertical Ladle Preheater - 30 MT</w:t>
             </w:r>
           </w:p>
         </w:tc>
@@ -31848,7 +31745,7 @@
                 <w:sz w:val="22"/>
                 <w:szCs w:val="22"/>
               </w:rPr>
-              <w:t xml:space="preserve">72</w:t>
+              <w:t>71</w:t>
             </w:r>
           </w:p>
         </w:tc>
@@ -31883,7 +31780,7 @@
                 <w:sz w:val="22"/>
                 <w:szCs w:val="22"/>
               </w:rPr>
-              <w:t xml:space="preserve">Jindal Steel &amp; Power Limited</w:t>
+              <w:t xml:space="preserve">Quality Industries P Ltd.</w:t>
             </w:r>
           </w:p>
         </w:tc>
@@ -31916,7 +31813,7 @@
                 <w:sz w:val="22"/>
                 <w:szCs w:val="22"/>
               </w:rPr>
-              <w:t xml:space="preserve">Tundish Preheater</w:t>
+              <w:t xml:space="preserve">Horizontal Ladle Preheater - 30 MT</w:t>
             </w:r>
           </w:p>
         </w:tc>
@@ -31951,7 +31848,7 @@
                 <w:sz w:val="22"/>
                 <w:szCs w:val="22"/>
               </w:rPr>
-              <w:t xml:space="preserve">73</w:t>
+              <w:t>72</w:t>
             </w:r>
           </w:p>
         </w:tc>
@@ -31986,7 +31883,7 @@
                 <w:sz w:val="22"/>
                 <w:szCs w:val="22"/>
               </w:rPr>
-              <w:t xml:space="preserve">Jindal Steel &amp; Power Limited</w:t>
+              <w:t xml:space="preserve">Rashtriya Ispat Nigam Limited</w:t>
             </w:r>
           </w:p>
         </w:tc>
@@ -32054,7 +31951,7 @@
                 <w:sz w:val="22"/>
                 <w:szCs w:val="22"/>
               </w:rPr>
-              <w:t xml:space="preserve">74</w:t>
+              <w:t>73</w:t>
             </w:r>
           </w:p>
         </w:tc>
@@ -32089,7 +31986,7 @@
                 <w:sz w:val="22"/>
                 <w:szCs w:val="22"/>
               </w:rPr>
-              <w:t xml:space="preserve">Aarti Steel Limited</w:t>
+              <w:t xml:space="preserve">PT. Garuda Yamato Steel</w:t>
             </w:r>
           </w:p>
         </w:tc>
@@ -32122,7 +32019,7 @@
                 <w:sz w:val="22"/>
                 <w:szCs w:val="22"/>
               </w:rPr>
-              <w:t xml:space="preserve">Tundish Preheater</w:t>
+              <w:t xml:space="preserve">Horizontal Ladle Preheater</w:t>
             </w:r>
           </w:p>
         </w:tc>
@@ -32157,7 +32054,7 @@
                 <w:sz w:val="22"/>
                 <w:szCs w:val="22"/>
               </w:rPr>
-              <w:t xml:space="preserve">75</w:t>
+              <w:t>74</w:t>
             </w:r>
           </w:p>
         </w:tc>
@@ -32192,7 +32089,7 @@
                 <w:sz w:val="22"/>
                 <w:szCs w:val="22"/>
               </w:rPr>
-              <w:t xml:space="preserve">Action Ispat And Power P Ltd.</w:t>
+              <w:t xml:space="preserve">PT. Garuda Yamato Steel</w:t>
             </w:r>
           </w:p>
         </w:tc>
@@ -32225,7 +32122,7 @@
                 <w:sz w:val="22"/>
                 <w:szCs w:val="22"/>
               </w:rPr>
-              <w:t xml:space="preserve">Vertical Ladle Preheater - 15 MT</w:t>
+              <w:t xml:space="preserve">Vertical Ladle Preheater</w:t>
             </w:r>
           </w:p>
         </w:tc>
@@ -32260,2376 +32157,7 @@
                 <w:sz w:val="22"/>
                 <w:szCs w:val="22"/>
               </w:rPr>
-              <w:t xml:space="preserve">76</w:t>
-            </w:r>
-          </w:p>
-        </w:tc>
-        <w:tc>
-          <w:tcPr>
-            <w:tcW w:type="dxa" w:w="3580"/>
-            <w:tcBorders>
-              <w:top w:val="single" w:color="BFBFBF" w:sz="4"/>
-              <w:left w:val="single" w:color="BFBFBF" w:sz="4"/>
-              <w:bottom w:val="single" w:color="BFBFBF" w:sz="4"/>
-              <w:right w:val="single" w:color="BFBFBF" w:sz="4"/>
-            </w:tcBorders>
-            <w:shd w:fill="F3F4F6" w:val="clear"/>
-            <w:tcMar>
-              <w:top w:type="dxa" w:w="100"/>
-              <w:left w:type="dxa" w:w="140"/>
-              <w:bottom w:type="dxa" w:w="100"/>
-              <w:right w:type="dxa" w:w="140"/>
-            </w:tcMar>
-            <w:vAlign w:val="center"/>
-          </w:tcPr>
-          <w:p>
-            <w:pPr>
-              <w:spacing w:after="40" w:before="40"/>
-              <w:jc w:val="left"/>
-            </w:pPr>
-            <w:r>
-              <w:rPr>
-                <w:rFonts w:ascii="Calibri" w:cs="Calibri" w:eastAsia="Calibri" w:hAnsi="Calibri"/>
-                <w:b/>
-                <w:bCs/>
-                <w:sz w:val="22"/>
-                <w:szCs w:val="22"/>
-              </w:rPr>
-              <w:t xml:space="preserve">Action Ispat And Power P Ltd.</w:t>
-            </w:r>
-          </w:p>
-        </w:tc>
-        <w:tc>
-          <w:tcPr>
-            <w:tcW w:type="dxa" w:w="5000"/>
-            <w:tcBorders>
-              <w:top w:val="single" w:color="BFBFBF" w:sz="4"/>
-              <w:left w:val="single" w:color="BFBFBF" w:sz="4"/>
-              <w:bottom w:val="single" w:color="BFBFBF" w:sz="4"/>
-              <w:right w:val="single" w:color="BFBFBF" w:sz="4"/>
-            </w:tcBorders>
-            <w:shd w:fill="F3F4F6" w:val="clear"/>
-            <w:tcMar>
-              <w:top w:type="dxa" w:w="100"/>
-              <w:left w:type="dxa" w:w="140"/>
-              <w:bottom w:type="dxa" w:w="100"/>
-              <w:right w:type="dxa" w:w="140"/>
-            </w:tcMar>
-            <w:vAlign w:val="center"/>
-          </w:tcPr>
-          <w:p>
-            <w:pPr>
-              <w:spacing w:after="40" w:before="40"/>
-              <w:jc w:val="left"/>
-            </w:pPr>
-            <w:r>
-              <w:rPr>
-                <w:rFonts w:ascii="Calibri" w:cs="Calibri" w:eastAsia="Calibri" w:hAnsi="Calibri"/>
-                <w:sz w:val="22"/>
-                <w:szCs w:val="22"/>
-              </w:rPr>
-              <w:t xml:space="preserve">Vertical Ladle Preheater</w:t>
-            </w:r>
-          </w:p>
-        </w:tc>
-      </w:tr>
-      <w:tr>
-        <w:tc>
-          <w:tcPr>
-            <w:tcW w:type="dxa" w:w="780"/>
-            <w:tcBorders>
-              <w:top w:val="single" w:color="BFBFBF" w:sz="4"/>
-              <w:left w:val="single" w:color="BFBFBF" w:sz="4"/>
-              <w:bottom w:val="single" w:color="BFBFBF" w:sz="4"/>
-              <w:right w:val="single" w:color="BFBFBF" w:sz="4"/>
-            </w:tcBorders>
-            <w:shd w:fill="F3F4F6" w:val="clear"/>
-            <w:tcMar>
-              <w:top w:type="dxa" w:w="100"/>
-              <w:left w:type="dxa" w:w="140"/>
-              <w:bottom w:type="dxa" w:w="100"/>
-              <w:right w:type="dxa" w:w="140"/>
-            </w:tcMar>
-            <w:vAlign w:val="center"/>
-          </w:tcPr>
-          <w:p>
-            <w:pPr>
-              <w:spacing w:after="40" w:before="40"/>
-              <w:jc w:val="center"/>
-            </w:pPr>
-            <w:r>
-              <w:rPr>
-                <w:rFonts w:ascii="Calibri" w:cs="Calibri" w:eastAsia="Calibri" w:hAnsi="Calibri"/>
-                <w:sz w:val="22"/>
-                <w:szCs w:val="22"/>
-              </w:rPr>
-              <w:t xml:space="preserve">77</w:t>
-            </w:r>
-          </w:p>
-        </w:tc>
-        <w:tc>
-          <w:tcPr>
-            <w:tcW w:type="dxa" w:w="3580"/>
-            <w:tcBorders>
-              <w:top w:val="single" w:color="BFBFBF" w:sz="4"/>
-              <w:left w:val="single" w:color="BFBFBF" w:sz="4"/>
-              <w:bottom w:val="single" w:color="BFBFBF" w:sz="4"/>
-              <w:right w:val="single" w:color="BFBFBF" w:sz="4"/>
-            </w:tcBorders>
-            <w:shd w:fill="F3F4F6" w:val="clear"/>
-            <w:tcMar>
-              <w:top w:type="dxa" w:w="100"/>
-              <w:left w:type="dxa" w:w="140"/>
-              <w:bottom w:type="dxa" w:w="100"/>
-              <w:right w:type="dxa" w:w="140"/>
-            </w:tcMar>
-            <w:vAlign w:val="center"/>
-          </w:tcPr>
-          <w:p>
-            <w:pPr>
-              <w:spacing w:after="40" w:before="40"/>
-              <w:jc w:val="left"/>
-            </w:pPr>
-            <w:r>
-              <w:rPr>
-                <w:rFonts w:ascii="Calibri" w:cs="Calibri" w:eastAsia="Calibri" w:hAnsi="Calibri"/>
-                <w:b/>
-                <w:bCs/>
-                <w:sz w:val="22"/>
-                <w:szCs w:val="22"/>
-              </w:rPr>
-              <w:t xml:space="preserve">Vardhman Special Steels Ltd.Unit-1</w:t>
-            </w:r>
-          </w:p>
-        </w:tc>
-        <w:tc>
-          <w:tcPr>
-            <w:tcW w:type="dxa" w:w="5000"/>
-            <w:tcBorders>
-              <w:top w:val="single" w:color="BFBFBF" w:sz="4"/>
-              <w:left w:val="single" w:color="BFBFBF" w:sz="4"/>
-              <w:bottom w:val="single" w:color="BFBFBF" w:sz="4"/>
-              <w:right w:val="single" w:color="BFBFBF" w:sz="4"/>
-            </w:tcBorders>
-            <w:shd w:fill="F3F4F6" w:val="clear"/>
-            <w:tcMar>
-              <w:top w:type="dxa" w:w="100"/>
-              <w:left w:type="dxa" w:w="140"/>
-              <w:bottom w:type="dxa" w:w="100"/>
-              <w:right w:type="dxa" w:w="140"/>
-            </w:tcMar>
-            <w:vAlign w:val="center"/>
-          </w:tcPr>
-          <w:p>
-            <w:pPr>
-              <w:spacing w:after="40" w:before="40"/>
-              <w:jc w:val="left"/>
-            </w:pPr>
-            <w:r>
-              <w:rPr>
-                <w:rFonts w:ascii="Calibri" w:cs="Calibri" w:eastAsia="Calibri" w:hAnsi="Calibri"/>
-                <w:sz w:val="22"/>
-                <w:szCs w:val="22"/>
-              </w:rPr>
-              <w:t xml:space="preserve">Tundish Preheater</w:t>
-            </w:r>
-          </w:p>
-        </w:tc>
-      </w:tr>
-      <w:tr>
-        <w:tc>
-          <w:tcPr>
-            <w:tcW w:type="dxa" w:w="780"/>
-            <w:tcBorders>
-              <w:top w:val="single" w:color="BFBFBF" w:sz="4"/>
-              <w:left w:val="single" w:color="BFBFBF" w:sz="4"/>
-              <w:bottom w:val="single" w:color="BFBFBF" w:sz="4"/>
-              <w:right w:val="single" w:color="BFBFBF" w:sz="4"/>
-            </w:tcBorders>
-            <w:shd w:fill="F3F4F6" w:val="clear"/>
-            <w:tcMar>
-              <w:top w:type="dxa" w:w="100"/>
-              <w:left w:type="dxa" w:w="140"/>
-              <w:bottom w:type="dxa" w:w="100"/>
-              <w:right w:type="dxa" w:w="140"/>
-            </w:tcMar>
-            <w:vAlign w:val="center"/>
-          </w:tcPr>
-          <w:p>
-            <w:pPr>
-              <w:spacing w:after="40" w:before="40"/>
-              <w:jc w:val="center"/>
-            </w:pPr>
-            <w:r>
-              <w:rPr>
-                <w:rFonts w:ascii="Calibri" w:cs="Calibri" w:eastAsia="Calibri" w:hAnsi="Calibri"/>
-                <w:sz w:val="22"/>
-                <w:szCs w:val="22"/>
-              </w:rPr>
-              <w:t xml:space="preserve">78</w:t>
-            </w:r>
-          </w:p>
-        </w:tc>
-        <w:tc>
-          <w:tcPr>
-            <w:tcW w:type="dxa" w:w="3580"/>
-            <w:tcBorders>
-              <w:top w:val="single" w:color="BFBFBF" w:sz="4"/>
-              <w:left w:val="single" w:color="BFBFBF" w:sz="4"/>
-              <w:bottom w:val="single" w:color="BFBFBF" w:sz="4"/>
-              <w:right w:val="single" w:color="BFBFBF" w:sz="4"/>
-            </w:tcBorders>
-            <w:shd w:fill="F3F4F6" w:val="clear"/>
-            <w:tcMar>
-              <w:top w:type="dxa" w:w="100"/>
-              <w:left w:type="dxa" w:w="140"/>
-              <w:bottom w:type="dxa" w:w="100"/>
-              <w:right w:type="dxa" w:w="140"/>
-            </w:tcMar>
-            <w:vAlign w:val="center"/>
-          </w:tcPr>
-          <w:p>
-            <w:pPr>
-              <w:spacing w:after="40" w:before="40"/>
-              <w:jc w:val="left"/>
-            </w:pPr>
-            <w:r>
-              <w:rPr>
-                <w:rFonts w:ascii="Calibri" w:cs="Calibri" w:eastAsia="Calibri" w:hAnsi="Calibri"/>
-                <w:b/>
-                <w:bCs/>
-                <w:sz w:val="22"/>
-                <w:szCs w:val="22"/>
-              </w:rPr>
-              <w:t xml:space="preserve">Bangladesh Re Rolling Mills Ltd.</w:t>
-            </w:r>
-          </w:p>
-        </w:tc>
-        <w:tc>
-          <w:tcPr>
-            <w:tcW w:type="dxa" w:w="5000"/>
-            <w:tcBorders>
-              <w:top w:val="single" w:color="BFBFBF" w:sz="4"/>
-              <w:left w:val="single" w:color="BFBFBF" w:sz="4"/>
-              <w:bottom w:val="single" w:color="BFBFBF" w:sz="4"/>
-              <w:right w:val="single" w:color="BFBFBF" w:sz="4"/>
-            </w:tcBorders>
-            <w:shd w:fill="F3F4F6" w:val="clear"/>
-            <w:tcMar>
-              <w:top w:type="dxa" w:w="100"/>
-              <w:left w:type="dxa" w:w="140"/>
-              <w:bottom w:type="dxa" w:w="100"/>
-              <w:right w:type="dxa" w:w="140"/>
-            </w:tcMar>
-            <w:vAlign w:val="center"/>
-          </w:tcPr>
-          <w:p>
-            <w:pPr>
-              <w:spacing w:after="40" w:before="40"/>
-              <w:jc w:val="left"/>
-            </w:pPr>
-            <w:r>
-              <w:rPr>
-                <w:rFonts w:ascii="Calibri" w:cs="Calibri" w:eastAsia="Calibri" w:hAnsi="Calibri"/>
-                <w:sz w:val="22"/>
-                <w:szCs w:val="22"/>
-              </w:rPr>
-              <w:t xml:space="preserve">Tundish Preheater</w:t>
-            </w:r>
-          </w:p>
-        </w:tc>
-      </w:tr>
-      <w:tr>
-        <w:tc>
-          <w:tcPr>
-            <w:tcW w:type="dxa" w:w="780"/>
-            <w:tcBorders>
-              <w:top w:val="single" w:color="BFBFBF" w:sz="4"/>
-              <w:left w:val="single" w:color="BFBFBF" w:sz="4"/>
-              <w:bottom w:val="single" w:color="BFBFBF" w:sz="4"/>
-              <w:right w:val="single" w:color="BFBFBF" w:sz="4"/>
-            </w:tcBorders>
-            <w:shd w:fill="F3F4F6" w:val="clear"/>
-            <w:tcMar>
-              <w:top w:type="dxa" w:w="100"/>
-              <w:left w:type="dxa" w:w="140"/>
-              <w:bottom w:type="dxa" w:w="100"/>
-              <w:right w:type="dxa" w:w="140"/>
-            </w:tcMar>
-            <w:vAlign w:val="center"/>
-          </w:tcPr>
-          <w:p>
-            <w:pPr>
-              <w:spacing w:after="40" w:before="40"/>
-              <w:jc w:val="center"/>
-            </w:pPr>
-            <w:r>
-              <w:rPr>
-                <w:rFonts w:ascii="Calibri" w:cs="Calibri" w:eastAsia="Calibri" w:hAnsi="Calibri"/>
-                <w:sz w:val="22"/>
-                <w:szCs w:val="22"/>
-              </w:rPr>
-              <w:t xml:space="preserve">79</w:t>
-            </w:r>
-          </w:p>
-        </w:tc>
-        <w:tc>
-          <w:tcPr>
-            <w:tcW w:type="dxa" w:w="3580"/>
-            <w:tcBorders>
-              <w:top w:val="single" w:color="BFBFBF" w:sz="4"/>
-              <w:left w:val="single" w:color="BFBFBF" w:sz="4"/>
-              <w:bottom w:val="single" w:color="BFBFBF" w:sz="4"/>
-              <w:right w:val="single" w:color="BFBFBF" w:sz="4"/>
-            </w:tcBorders>
-            <w:shd w:fill="F3F4F6" w:val="clear"/>
-            <w:tcMar>
-              <w:top w:type="dxa" w:w="100"/>
-              <w:left w:type="dxa" w:w="140"/>
-              <w:bottom w:type="dxa" w:w="100"/>
-              <w:right w:type="dxa" w:w="140"/>
-            </w:tcMar>
-            <w:vAlign w:val="center"/>
-          </w:tcPr>
-          <w:p>
-            <w:pPr>
-              <w:spacing w:after="40" w:before="40"/>
-              <w:jc w:val="left"/>
-            </w:pPr>
-            <w:r>
-              <w:rPr>
-                <w:rFonts w:ascii="Calibri" w:cs="Calibri" w:eastAsia="Calibri" w:hAnsi="Calibri"/>
-                <w:b/>
-                <w:bCs/>
-                <w:sz w:val="22"/>
-                <w:szCs w:val="22"/>
-              </w:rPr>
-              <w:t xml:space="preserve">Bangladesh Re Rolling Mills Ltd.</w:t>
-            </w:r>
-          </w:p>
-        </w:tc>
-        <w:tc>
-          <w:tcPr>
-            <w:tcW w:type="dxa" w:w="5000"/>
-            <w:tcBorders>
-              <w:top w:val="single" w:color="BFBFBF" w:sz="4"/>
-              <w:left w:val="single" w:color="BFBFBF" w:sz="4"/>
-              <w:bottom w:val="single" w:color="BFBFBF" w:sz="4"/>
-              <w:right w:val="single" w:color="BFBFBF" w:sz="4"/>
-            </w:tcBorders>
-            <w:shd w:fill="F3F4F6" w:val="clear"/>
-            <w:tcMar>
-              <w:top w:type="dxa" w:w="100"/>
-              <w:left w:type="dxa" w:w="140"/>
-              <w:bottom w:type="dxa" w:w="100"/>
-              <w:right w:type="dxa" w:w="140"/>
-            </w:tcMar>
-            <w:vAlign w:val="center"/>
-          </w:tcPr>
-          <w:p>
-            <w:pPr>
-              <w:spacing w:after="40" w:before="40"/>
-              <w:jc w:val="left"/>
-            </w:pPr>
-            <w:r>
-              <w:rPr>
-                <w:rFonts w:ascii="Calibri" w:cs="Calibri" w:eastAsia="Calibri" w:hAnsi="Calibri"/>
-                <w:sz w:val="22"/>
-                <w:szCs w:val="22"/>
-              </w:rPr>
-              <w:t xml:space="preserve">Tundish Preheater</w:t>
-            </w:r>
-          </w:p>
-        </w:tc>
-      </w:tr>
-      <w:tr>
-        <w:tc>
-          <w:tcPr>
-            <w:tcW w:type="dxa" w:w="780"/>
-            <w:tcBorders>
-              <w:top w:val="single" w:color="BFBFBF" w:sz="4"/>
-              <w:left w:val="single" w:color="BFBFBF" w:sz="4"/>
-              <w:bottom w:val="single" w:color="BFBFBF" w:sz="4"/>
-              <w:right w:val="single" w:color="BFBFBF" w:sz="4"/>
-            </w:tcBorders>
-            <w:shd w:fill="F3F4F6" w:val="clear"/>
-            <w:tcMar>
-              <w:top w:type="dxa" w:w="100"/>
-              <w:left w:type="dxa" w:w="140"/>
-              <w:bottom w:type="dxa" w:w="100"/>
-              <w:right w:type="dxa" w:w="140"/>
-            </w:tcMar>
-            <w:vAlign w:val="center"/>
-          </w:tcPr>
-          <w:p>
-            <w:pPr>
-              <w:spacing w:after="40" w:before="40"/>
-              <w:jc w:val="center"/>
-            </w:pPr>
-            <w:r>
-              <w:rPr>
-                <w:rFonts w:ascii="Calibri" w:cs="Calibri" w:eastAsia="Calibri" w:hAnsi="Calibri"/>
-                <w:sz w:val="22"/>
-                <w:szCs w:val="22"/>
-              </w:rPr>
-              <w:t xml:space="preserve">80</w:t>
-            </w:r>
-          </w:p>
-        </w:tc>
-        <w:tc>
-          <w:tcPr>
-            <w:tcW w:type="dxa" w:w="3580"/>
-            <w:tcBorders>
-              <w:top w:val="single" w:color="BFBFBF" w:sz="4"/>
-              <w:left w:val="single" w:color="BFBFBF" w:sz="4"/>
-              <w:bottom w:val="single" w:color="BFBFBF" w:sz="4"/>
-              <w:right w:val="single" w:color="BFBFBF" w:sz="4"/>
-            </w:tcBorders>
-            <w:shd w:fill="F3F4F6" w:val="clear"/>
-            <w:tcMar>
-              <w:top w:type="dxa" w:w="100"/>
-              <w:left w:type="dxa" w:w="140"/>
-              <w:bottom w:type="dxa" w:w="100"/>
-              <w:right w:type="dxa" w:w="140"/>
-            </w:tcMar>
-            <w:vAlign w:val="center"/>
-          </w:tcPr>
-          <w:p>
-            <w:pPr>
-              <w:spacing w:after="40" w:before="40"/>
-              <w:jc w:val="left"/>
-            </w:pPr>
-            <w:r>
-              <w:rPr>
-                <w:rFonts w:ascii="Calibri" w:cs="Calibri" w:eastAsia="Calibri" w:hAnsi="Calibri"/>
-                <w:b/>
-                <w:bCs/>
-                <w:sz w:val="22"/>
-                <w:szCs w:val="22"/>
-              </w:rPr>
-              <w:t xml:space="preserve">Bangladesh Re Rolling Mills Ltd.</w:t>
-            </w:r>
-          </w:p>
-        </w:tc>
-        <w:tc>
-          <w:tcPr>
-            <w:tcW w:type="dxa" w:w="5000"/>
-            <w:tcBorders>
-              <w:top w:val="single" w:color="BFBFBF" w:sz="4"/>
-              <w:left w:val="single" w:color="BFBFBF" w:sz="4"/>
-              <w:bottom w:val="single" w:color="BFBFBF" w:sz="4"/>
-              <w:right w:val="single" w:color="BFBFBF" w:sz="4"/>
-            </w:tcBorders>
-            <w:shd w:fill="F3F4F6" w:val="clear"/>
-            <w:tcMar>
-              <w:top w:type="dxa" w:w="100"/>
-              <w:left w:type="dxa" w:w="140"/>
-              <w:bottom w:type="dxa" w:w="100"/>
-              <w:right w:type="dxa" w:w="140"/>
-            </w:tcMar>
-            <w:vAlign w:val="center"/>
-          </w:tcPr>
-          <w:p>
-            <w:pPr>
-              <w:spacing w:after="40" w:before="40"/>
-              <w:jc w:val="left"/>
-            </w:pPr>
-            <w:r>
-              <w:rPr>
-                <w:rFonts w:ascii="Calibri" w:cs="Calibri" w:eastAsia="Calibri" w:hAnsi="Calibri"/>
-                <w:sz w:val="22"/>
-                <w:szCs w:val="22"/>
-              </w:rPr>
-              <w:t xml:space="preserve">Tundish Preheater</w:t>
-            </w:r>
-          </w:p>
-        </w:tc>
-      </w:tr>
-      <w:tr>
-        <w:tc>
-          <w:tcPr>
-            <w:tcW w:type="dxa" w:w="780"/>
-            <w:tcBorders>
-              <w:top w:val="single" w:color="BFBFBF" w:sz="4"/>
-              <w:left w:val="single" w:color="BFBFBF" w:sz="4"/>
-              <w:bottom w:val="single" w:color="BFBFBF" w:sz="4"/>
-              <w:right w:val="single" w:color="BFBFBF" w:sz="4"/>
-            </w:tcBorders>
-            <w:shd w:fill="F3F4F6" w:val="clear"/>
-            <w:tcMar>
-              <w:top w:type="dxa" w:w="100"/>
-              <w:left w:type="dxa" w:w="140"/>
-              <w:bottom w:type="dxa" w:w="100"/>
-              <w:right w:type="dxa" w:w="140"/>
-            </w:tcMar>
-            <w:vAlign w:val="center"/>
-          </w:tcPr>
-          <w:p>
-            <w:pPr>
-              <w:spacing w:after="40" w:before="40"/>
-              <w:jc w:val="center"/>
-            </w:pPr>
-            <w:r>
-              <w:rPr>
-                <w:rFonts w:ascii="Calibri" w:cs="Calibri" w:eastAsia="Calibri" w:hAnsi="Calibri"/>
-                <w:sz w:val="22"/>
-                <w:szCs w:val="22"/>
-              </w:rPr>
-              <w:t xml:space="preserve">81</w:t>
-            </w:r>
-          </w:p>
-        </w:tc>
-        <w:tc>
-          <w:tcPr>
-            <w:tcW w:type="dxa" w:w="3580"/>
-            <w:tcBorders>
-              <w:top w:val="single" w:color="BFBFBF" w:sz="4"/>
-              <w:left w:val="single" w:color="BFBFBF" w:sz="4"/>
-              <w:bottom w:val="single" w:color="BFBFBF" w:sz="4"/>
-              <w:right w:val="single" w:color="BFBFBF" w:sz="4"/>
-            </w:tcBorders>
-            <w:shd w:fill="F3F4F6" w:val="clear"/>
-            <w:tcMar>
-              <w:top w:type="dxa" w:w="100"/>
-              <w:left w:type="dxa" w:w="140"/>
-              <w:bottom w:type="dxa" w:w="100"/>
-              <w:right w:type="dxa" w:w="140"/>
-            </w:tcMar>
-            <w:vAlign w:val="center"/>
-          </w:tcPr>
-          <w:p>
-            <w:pPr>
-              <w:spacing w:after="40" w:before="40"/>
-              <w:jc w:val="left"/>
-            </w:pPr>
-            <w:r>
-              <w:rPr>
-                <w:rFonts w:ascii="Calibri" w:cs="Calibri" w:eastAsia="Calibri" w:hAnsi="Calibri"/>
-                <w:b/>
-                <w:bCs/>
-                <w:sz w:val="22"/>
-                <w:szCs w:val="22"/>
-              </w:rPr>
-              <w:t xml:space="preserve">Bangladesh Re Rolling Mills Ltd.</w:t>
-            </w:r>
-          </w:p>
-        </w:tc>
-        <w:tc>
-          <w:tcPr>
-            <w:tcW w:type="dxa" w:w="5000"/>
-            <w:tcBorders>
-              <w:top w:val="single" w:color="BFBFBF" w:sz="4"/>
-              <w:left w:val="single" w:color="BFBFBF" w:sz="4"/>
-              <w:bottom w:val="single" w:color="BFBFBF" w:sz="4"/>
-              <w:right w:val="single" w:color="BFBFBF" w:sz="4"/>
-            </w:tcBorders>
-            <w:shd w:fill="F3F4F6" w:val="clear"/>
-            <w:tcMar>
-              <w:top w:type="dxa" w:w="100"/>
-              <w:left w:type="dxa" w:w="140"/>
-              <w:bottom w:type="dxa" w:w="100"/>
-              <w:right w:type="dxa" w:w="140"/>
-            </w:tcMar>
-            <w:vAlign w:val="center"/>
-          </w:tcPr>
-          <w:p>
-            <w:pPr>
-              <w:spacing w:after="40" w:before="40"/>
-              <w:jc w:val="left"/>
-            </w:pPr>
-            <w:r>
-              <w:rPr>
-                <w:rFonts w:ascii="Calibri" w:cs="Calibri" w:eastAsia="Calibri" w:hAnsi="Calibri"/>
-                <w:sz w:val="22"/>
-                <w:szCs w:val="22"/>
-              </w:rPr>
-              <w:t xml:space="preserve">Tundish Preheater</w:t>
-            </w:r>
-          </w:p>
-        </w:tc>
-      </w:tr>
-      <w:tr>
-        <w:tc>
-          <w:tcPr>
-            <w:tcW w:type="dxa" w:w="780"/>
-            <w:tcBorders>
-              <w:top w:val="single" w:color="BFBFBF" w:sz="4"/>
-              <w:left w:val="single" w:color="BFBFBF" w:sz="4"/>
-              <w:bottom w:val="single" w:color="BFBFBF" w:sz="4"/>
-              <w:right w:val="single" w:color="BFBFBF" w:sz="4"/>
-            </w:tcBorders>
-            <w:shd w:fill="F3F4F6" w:val="clear"/>
-            <w:tcMar>
-              <w:top w:type="dxa" w:w="100"/>
-              <w:left w:type="dxa" w:w="140"/>
-              <w:bottom w:type="dxa" w:w="100"/>
-              <w:right w:type="dxa" w:w="140"/>
-            </w:tcMar>
-            <w:vAlign w:val="center"/>
-          </w:tcPr>
-          <w:p>
-            <w:pPr>
-              <w:spacing w:after="40" w:before="40"/>
-              <w:jc w:val="center"/>
-            </w:pPr>
-            <w:r>
-              <w:rPr>
-                <w:rFonts w:ascii="Calibri" w:cs="Calibri" w:eastAsia="Calibri" w:hAnsi="Calibri"/>
-                <w:sz w:val="22"/>
-                <w:szCs w:val="22"/>
-              </w:rPr>
-              <w:t xml:space="preserve">82</w:t>
-            </w:r>
-          </w:p>
-        </w:tc>
-        <w:tc>
-          <w:tcPr>
-            <w:tcW w:type="dxa" w:w="3580"/>
-            <w:tcBorders>
-              <w:top w:val="single" w:color="BFBFBF" w:sz="4"/>
-              <w:left w:val="single" w:color="BFBFBF" w:sz="4"/>
-              <w:bottom w:val="single" w:color="BFBFBF" w:sz="4"/>
-              <w:right w:val="single" w:color="BFBFBF" w:sz="4"/>
-            </w:tcBorders>
-            <w:shd w:fill="F3F4F6" w:val="clear"/>
-            <w:tcMar>
-              <w:top w:type="dxa" w:w="100"/>
-              <w:left w:type="dxa" w:w="140"/>
-              <w:bottom w:type="dxa" w:w="100"/>
-              <w:right w:type="dxa" w:w="140"/>
-            </w:tcMar>
-            <w:vAlign w:val="center"/>
-          </w:tcPr>
-          <w:p>
-            <w:pPr>
-              <w:spacing w:after="40" w:before="40"/>
-              <w:jc w:val="left"/>
-            </w:pPr>
-            <w:r>
-              <w:rPr>
-                <w:rFonts w:ascii="Calibri" w:cs="Calibri" w:eastAsia="Calibri" w:hAnsi="Calibri"/>
-                <w:b/>
-                <w:bCs/>
-                <w:sz w:val="22"/>
-                <w:szCs w:val="22"/>
-              </w:rPr>
-              <w:t xml:space="preserve">Amic Forging Ltd.</w:t>
-            </w:r>
-          </w:p>
-        </w:tc>
-        <w:tc>
-          <w:tcPr>
-            <w:tcW w:type="dxa" w:w="5000"/>
-            <w:tcBorders>
-              <w:top w:val="single" w:color="BFBFBF" w:sz="4"/>
-              <w:left w:val="single" w:color="BFBFBF" w:sz="4"/>
-              <w:bottom w:val="single" w:color="BFBFBF" w:sz="4"/>
-              <w:right w:val="single" w:color="BFBFBF" w:sz="4"/>
-            </w:tcBorders>
-            <w:shd w:fill="F3F4F6" w:val="clear"/>
-            <w:tcMar>
-              <w:top w:type="dxa" w:w="100"/>
-              <w:left w:type="dxa" w:w="140"/>
-              <w:bottom w:type="dxa" w:w="100"/>
-              <w:right w:type="dxa" w:w="140"/>
-            </w:tcMar>
-            <w:vAlign w:val="center"/>
-          </w:tcPr>
-          <w:p>
-            <w:pPr>
-              <w:spacing w:after="40" w:before="40"/>
-              <w:jc w:val="left"/>
-            </w:pPr>
-            <w:r>
-              <w:rPr>
-                <w:rFonts w:ascii="Calibri" w:cs="Calibri" w:eastAsia="Calibri" w:hAnsi="Calibri"/>
-                <w:sz w:val="22"/>
-                <w:szCs w:val="22"/>
-              </w:rPr>
-              <w:t xml:space="preserve">Vertical Ladle Preheater - 10 MT</w:t>
-            </w:r>
-          </w:p>
-        </w:tc>
-      </w:tr>
-      <w:tr>
-        <w:tc>
-          <w:tcPr>
-            <w:tcW w:type="dxa" w:w="780"/>
-            <w:tcBorders>
-              <w:top w:val="single" w:color="BFBFBF" w:sz="4"/>
-              <w:left w:val="single" w:color="BFBFBF" w:sz="4"/>
-              <w:bottom w:val="single" w:color="BFBFBF" w:sz="4"/>
-              <w:right w:val="single" w:color="BFBFBF" w:sz="4"/>
-            </w:tcBorders>
-            <w:shd w:fill="F3F4F6" w:val="clear"/>
-            <w:tcMar>
-              <w:top w:type="dxa" w:w="100"/>
-              <w:left w:type="dxa" w:w="140"/>
-              <w:bottom w:type="dxa" w:w="100"/>
-              <w:right w:type="dxa" w:w="140"/>
-            </w:tcMar>
-            <w:vAlign w:val="center"/>
-          </w:tcPr>
-          <w:p>
-            <w:pPr>
-              <w:spacing w:after="40" w:before="40"/>
-              <w:jc w:val="center"/>
-            </w:pPr>
-            <w:r>
-              <w:rPr>
-                <w:rFonts w:ascii="Calibri" w:cs="Calibri" w:eastAsia="Calibri" w:hAnsi="Calibri"/>
-                <w:sz w:val="22"/>
-                <w:szCs w:val="22"/>
-              </w:rPr>
-              <w:t xml:space="preserve">83</w:t>
-            </w:r>
-          </w:p>
-        </w:tc>
-        <w:tc>
-          <w:tcPr>
-            <w:tcW w:type="dxa" w:w="3580"/>
-            <w:tcBorders>
-              <w:top w:val="single" w:color="BFBFBF" w:sz="4"/>
-              <w:left w:val="single" w:color="BFBFBF" w:sz="4"/>
-              <w:bottom w:val="single" w:color="BFBFBF" w:sz="4"/>
-              <w:right w:val="single" w:color="BFBFBF" w:sz="4"/>
-            </w:tcBorders>
-            <w:shd w:fill="F3F4F6" w:val="clear"/>
-            <w:tcMar>
-              <w:top w:type="dxa" w:w="100"/>
-              <w:left w:type="dxa" w:w="140"/>
-              <w:bottom w:type="dxa" w:w="100"/>
-              <w:right w:type="dxa" w:w="140"/>
-            </w:tcMar>
-            <w:vAlign w:val="center"/>
-          </w:tcPr>
-          <w:p>
-            <w:pPr>
-              <w:spacing w:after="40" w:before="40"/>
-              <w:jc w:val="left"/>
-            </w:pPr>
-            <w:r>
-              <w:rPr>
-                <w:rFonts w:ascii="Calibri" w:cs="Calibri" w:eastAsia="Calibri" w:hAnsi="Calibri"/>
-                <w:b/>
-                <w:bCs/>
-                <w:sz w:val="22"/>
-                <w:szCs w:val="22"/>
-              </w:rPr>
-              <w:t xml:space="preserve">Lloyds Engineering Works Limited</w:t>
-            </w:r>
-          </w:p>
-        </w:tc>
-        <w:tc>
-          <w:tcPr>
-            <w:tcW w:type="dxa" w:w="5000"/>
-            <w:tcBorders>
-              <w:top w:val="single" w:color="BFBFBF" w:sz="4"/>
-              <w:left w:val="single" w:color="BFBFBF" w:sz="4"/>
-              <w:bottom w:val="single" w:color="BFBFBF" w:sz="4"/>
-              <w:right w:val="single" w:color="BFBFBF" w:sz="4"/>
-            </w:tcBorders>
-            <w:shd w:fill="F3F4F6" w:val="clear"/>
-            <w:tcMar>
-              <w:top w:type="dxa" w:w="100"/>
-              <w:left w:type="dxa" w:w="140"/>
-              <w:bottom w:type="dxa" w:w="100"/>
-              <w:right w:type="dxa" w:w="140"/>
-            </w:tcMar>
-            <w:vAlign w:val="center"/>
-          </w:tcPr>
-          <w:p>
-            <w:pPr>
-              <w:spacing w:after="40" w:before="40"/>
-              <w:jc w:val="left"/>
-            </w:pPr>
-            <w:r>
-              <w:rPr>
-                <w:rFonts w:ascii="Calibri" w:cs="Calibri" w:eastAsia="Calibri" w:hAnsi="Calibri"/>
-                <w:sz w:val="22"/>
-                <w:szCs w:val="22"/>
-              </w:rPr>
-              <w:t xml:space="preserve">Vertical Ladle Preheater - 50 MT</w:t>
-            </w:r>
-          </w:p>
-        </w:tc>
-      </w:tr>
-      <w:tr>
-        <w:tc>
-          <w:tcPr>
-            <w:tcW w:type="dxa" w:w="780"/>
-            <w:tcBorders>
-              <w:top w:val="single" w:color="BFBFBF" w:sz="4"/>
-              <w:left w:val="single" w:color="BFBFBF" w:sz="4"/>
-              <w:bottom w:val="single" w:color="BFBFBF" w:sz="4"/>
-              <w:right w:val="single" w:color="BFBFBF" w:sz="4"/>
-            </w:tcBorders>
-            <w:shd w:fill="F3F4F6" w:val="clear"/>
-            <w:tcMar>
-              <w:top w:type="dxa" w:w="100"/>
-              <w:left w:type="dxa" w:w="140"/>
-              <w:bottom w:type="dxa" w:w="100"/>
-              <w:right w:type="dxa" w:w="140"/>
-            </w:tcMar>
-            <w:vAlign w:val="center"/>
-          </w:tcPr>
-          <w:p>
-            <w:pPr>
-              <w:spacing w:after="40" w:before="40"/>
-              <w:jc w:val="center"/>
-            </w:pPr>
-            <w:r>
-              <w:rPr>
-                <w:rFonts w:ascii="Calibri" w:cs="Calibri" w:eastAsia="Calibri" w:hAnsi="Calibri"/>
-                <w:sz w:val="22"/>
-                <w:szCs w:val="22"/>
-              </w:rPr>
-              <w:t xml:space="preserve">84</w:t>
-            </w:r>
-          </w:p>
-        </w:tc>
-        <w:tc>
-          <w:tcPr>
-            <w:tcW w:type="dxa" w:w="3580"/>
-            <w:tcBorders>
-              <w:top w:val="single" w:color="BFBFBF" w:sz="4"/>
-              <w:left w:val="single" w:color="BFBFBF" w:sz="4"/>
-              <w:bottom w:val="single" w:color="BFBFBF" w:sz="4"/>
-              <w:right w:val="single" w:color="BFBFBF" w:sz="4"/>
-            </w:tcBorders>
-            <w:shd w:fill="F3F4F6" w:val="clear"/>
-            <w:tcMar>
-              <w:top w:type="dxa" w:w="100"/>
-              <w:left w:type="dxa" w:w="140"/>
-              <w:bottom w:type="dxa" w:w="100"/>
-              <w:right w:type="dxa" w:w="140"/>
-            </w:tcMar>
-            <w:vAlign w:val="center"/>
-          </w:tcPr>
-          <w:p>
-            <w:pPr>
-              <w:spacing w:after="40" w:before="40"/>
-              <w:jc w:val="left"/>
-            </w:pPr>
-            <w:r>
-              <w:rPr>
-                <w:rFonts w:ascii="Calibri" w:cs="Calibri" w:eastAsia="Calibri" w:hAnsi="Calibri"/>
-                <w:b/>
-                <w:bCs/>
-                <w:sz w:val="22"/>
-                <w:szCs w:val="22"/>
-              </w:rPr>
-              <w:t xml:space="preserve">Lloyds Engineering Works Limited</w:t>
-            </w:r>
-          </w:p>
-        </w:tc>
-        <w:tc>
-          <w:tcPr>
-            <w:tcW w:type="dxa" w:w="5000"/>
-            <w:tcBorders>
-              <w:top w:val="single" w:color="BFBFBF" w:sz="4"/>
-              <w:left w:val="single" w:color="BFBFBF" w:sz="4"/>
-              <w:bottom w:val="single" w:color="BFBFBF" w:sz="4"/>
-              <w:right w:val="single" w:color="BFBFBF" w:sz="4"/>
-            </w:tcBorders>
-            <w:shd w:fill="F3F4F6" w:val="clear"/>
-            <w:tcMar>
-              <w:top w:type="dxa" w:w="100"/>
-              <w:left w:type="dxa" w:w="140"/>
-              <w:bottom w:type="dxa" w:w="100"/>
-              <w:right w:type="dxa" w:w="140"/>
-            </w:tcMar>
-            <w:vAlign w:val="center"/>
-          </w:tcPr>
-          <w:p>
-            <w:pPr>
-              <w:spacing w:after="40" w:before="40"/>
-              <w:jc w:val="left"/>
-            </w:pPr>
-            <w:r>
-              <w:rPr>
-                <w:rFonts w:ascii="Calibri" w:cs="Calibri" w:eastAsia="Calibri" w:hAnsi="Calibri"/>
-                <w:sz w:val="22"/>
-                <w:szCs w:val="22"/>
-              </w:rPr>
-              <w:t xml:space="preserve">Vertical Ladle Preheater - 50 MT</w:t>
-            </w:r>
-          </w:p>
-        </w:tc>
-      </w:tr>
-      <w:tr>
-        <w:tc>
-          <w:tcPr>
-            <w:tcW w:type="dxa" w:w="780"/>
-            <w:tcBorders>
-              <w:top w:val="single" w:color="BFBFBF" w:sz="4"/>
-              <w:left w:val="single" w:color="BFBFBF" w:sz="4"/>
-              <w:bottom w:val="single" w:color="BFBFBF" w:sz="4"/>
-              <w:right w:val="single" w:color="BFBFBF" w:sz="4"/>
-            </w:tcBorders>
-            <w:shd w:fill="F3F4F6" w:val="clear"/>
-            <w:tcMar>
-              <w:top w:type="dxa" w:w="100"/>
-              <w:left w:type="dxa" w:w="140"/>
-              <w:bottom w:type="dxa" w:w="100"/>
-              <w:right w:type="dxa" w:w="140"/>
-            </w:tcMar>
-            <w:vAlign w:val="center"/>
-          </w:tcPr>
-          <w:p>
-            <w:pPr>
-              <w:spacing w:after="40" w:before="40"/>
-              <w:jc w:val="center"/>
-            </w:pPr>
-            <w:r>
-              <w:rPr>
-                <w:rFonts w:ascii="Calibri" w:cs="Calibri" w:eastAsia="Calibri" w:hAnsi="Calibri"/>
-                <w:sz w:val="22"/>
-                <w:szCs w:val="22"/>
-              </w:rPr>
-              <w:t xml:space="preserve">85</w:t>
-            </w:r>
-          </w:p>
-        </w:tc>
-        <w:tc>
-          <w:tcPr>
-            <w:tcW w:type="dxa" w:w="3580"/>
-            <w:tcBorders>
-              <w:top w:val="single" w:color="BFBFBF" w:sz="4"/>
-              <w:left w:val="single" w:color="BFBFBF" w:sz="4"/>
-              <w:bottom w:val="single" w:color="BFBFBF" w:sz="4"/>
-              <w:right w:val="single" w:color="BFBFBF" w:sz="4"/>
-            </w:tcBorders>
-            <w:shd w:fill="F3F4F6" w:val="clear"/>
-            <w:tcMar>
-              <w:top w:type="dxa" w:w="100"/>
-              <w:left w:type="dxa" w:w="140"/>
-              <w:bottom w:type="dxa" w:w="100"/>
-              <w:right w:type="dxa" w:w="140"/>
-            </w:tcMar>
-            <w:vAlign w:val="center"/>
-          </w:tcPr>
-          <w:p>
-            <w:pPr>
-              <w:spacing w:after="40" w:before="40"/>
-              <w:jc w:val="left"/>
-            </w:pPr>
-            <w:r>
-              <w:rPr>
-                <w:rFonts w:ascii="Calibri" w:cs="Calibri" w:eastAsia="Calibri" w:hAnsi="Calibri"/>
-                <w:b/>
-                <w:bCs/>
-                <w:sz w:val="22"/>
-                <w:szCs w:val="22"/>
-              </w:rPr>
-              <w:t xml:space="preserve">Lloyds Engineering Works Limited</w:t>
-            </w:r>
-          </w:p>
-        </w:tc>
-        <w:tc>
-          <w:tcPr>
-            <w:tcW w:type="dxa" w:w="5000"/>
-            <w:tcBorders>
-              <w:top w:val="single" w:color="BFBFBF" w:sz="4"/>
-              <w:left w:val="single" w:color="BFBFBF" w:sz="4"/>
-              <w:bottom w:val="single" w:color="BFBFBF" w:sz="4"/>
-              <w:right w:val="single" w:color="BFBFBF" w:sz="4"/>
-            </w:tcBorders>
-            <w:shd w:fill="F3F4F6" w:val="clear"/>
-            <w:tcMar>
-              <w:top w:type="dxa" w:w="100"/>
-              <w:left w:type="dxa" w:w="140"/>
-              <w:bottom w:type="dxa" w:w="100"/>
-              <w:right w:type="dxa" w:w="140"/>
-            </w:tcMar>
-            <w:vAlign w:val="center"/>
-          </w:tcPr>
-          <w:p>
-            <w:pPr>
-              <w:spacing w:after="40" w:before="40"/>
-              <w:jc w:val="left"/>
-            </w:pPr>
-            <w:r>
-              <w:rPr>
-                <w:rFonts w:ascii="Calibri" w:cs="Calibri" w:eastAsia="Calibri" w:hAnsi="Calibri"/>
-                <w:sz w:val="22"/>
-                <w:szCs w:val="22"/>
-              </w:rPr>
-              <w:t xml:space="preserve">Vertical Ladle Preheater - 50 MT</w:t>
-            </w:r>
-          </w:p>
-        </w:tc>
-      </w:tr>
-      <w:tr>
-        <w:tc>
-          <w:tcPr>
-            <w:tcW w:type="dxa" w:w="780"/>
-            <w:tcBorders>
-              <w:top w:val="single" w:color="BFBFBF" w:sz="4"/>
-              <w:left w:val="single" w:color="BFBFBF" w:sz="4"/>
-              <w:bottom w:val="single" w:color="BFBFBF" w:sz="4"/>
-              <w:right w:val="single" w:color="BFBFBF" w:sz="4"/>
-            </w:tcBorders>
-            <w:shd w:fill="F3F4F6" w:val="clear"/>
-            <w:tcMar>
-              <w:top w:type="dxa" w:w="100"/>
-              <w:left w:type="dxa" w:w="140"/>
-              <w:bottom w:type="dxa" w:w="100"/>
-              <w:right w:type="dxa" w:w="140"/>
-            </w:tcMar>
-            <w:vAlign w:val="center"/>
-          </w:tcPr>
-          <w:p>
-            <w:pPr>
-              <w:spacing w:after="40" w:before="40"/>
-              <w:jc w:val="center"/>
-            </w:pPr>
-            <w:r>
-              <w:rPr>
-                <w:rFonts w:ascii="Calibri" w:cs="Calibri" w:eastAsia="Calibri" w:hAnsi="Calibri"/>
-                <w:sz w:val="22"/>
-                <w:szCs w:val="22"/>
-              </w:rPr>
-              <w:t xml:space="preserve">86</w:t>
-            </w:r>
-          </w:p>
-        </w:tc>
-        <w:tc>
-          <w:tcPr>
-            <w:tcW w:type="dxa" w:w="3580"/>
-            <w:tcBorders>
-              <w:top w:val="single" w:color="BFBFBF" w:sz="4"/>
-              <w:left w:val="single" w:color="BFBFBF" w:sz="4"/>
-              <w:bottom w:val="single" w:color="BFBFBF" w:sz="4"/>
-              <w:right w:val="single" w:color="BFBFBF" w:sz="4"/>
-            </w:tcBorders>
-            <w:shd w:fill="F3F4F6" w:val="clear"/>
-            <w:tcMar>
-              <w:top w:type="dxa" w:w="100"/>
-              <w:left w:type="dxa" w:w="140"/>
-              <w:bottom w:type="dxa" w:w="100"/>
-              <w:right w:type="dxa" w:w="140"/>
-            </w:tcMar>
-            <w:vAlign w:val="center"/>
-          </w:tcPr>
-          <w:p>
-            <w:pPr>
-              <w:spacing w:after="40" w:before="40"/>
-              <w:jc w:val="left"/>
-            </w:pPr>
-            <w:r>
-              <w:rPr>
-                <w:rFonts w:ascii="Calibri" w:cs="Calibri" w:eastAsia="Calibri" w:hAnsi="Calibri"/>
-                <w:b/>
-                <w:bCs/>
-                <w:sz w:val="22"/>
-                <w:szCs w:val="22"/>
-              </w:rPr>
-              <w:t xml:space="preserve">Lloyds Engineering Works Limited</w:t>
-            </w:r>
-          </w:p>
-        </w:tc>
-        <w:tc>
-          <w:tcPr>
-            <w:tcW w:type="dxa" w:w="5000"/>
-            <w:tcBorders>
-              <w:top w:val="single" w:color="BFBFBF" w:sz="4"/>
-              <w:left w:val="single" w:color="BFBFBF" w:sz="4"/>
-              <w:bottom w:val="single" w:color="BFBFBF" w:sz="4"/>
-              <w:right w:val="single" w:color="BFBFBF" w:sz="4"/>
-            </w:tcBorders>
-            <w:shd w:fill="F3F4F6" w:val="clear"/>
-            <w:tcMar>
-              <w:top w:type="dxa" w:w="100"/>
-              <w:left w:type="dxa" w:w="140"/>
-              <w:bottom w:type="dxa" w:w="100"/>
-              <w:right w:type="dxa" w:w="140"/>
-            </w:tcMar>
-            <w:vAlign w:val="center"/>
-          </w:tcPr>
-          <w:p>
-            <w:pPr>
-              <w:spacing w:after="40" w:before="40"/>
-              <w:jc w:val="left"/>
-            </w:pPr>
-            <w:r>
-              <w:rPr>
-                <w:rFonts w:ascii="Calibri" w:cs="Calibri" w:eastAsia="Calibri" w:hAnsi="Calibri"/>
-                <w:sz w:val="22"/>
-                <w:szCs w:val="22"/>
-              </w:rPr>
-              <w:t xml:space="preserve">Vertical Ladle Preheater - 40 MT</w:t>
-            </w:r>
-          </w:p>
-        </w:tc>
-      </w:tr>
-      <w:tr>
-        <w:tc>
-          <w:tcPr>
-            <w:tcW w:type="dxa" w:w="780"/>
-            <w:tcBorders>
-              <w:top w:val="single" w:color="BFBFBF" w:sz="4"/>
-              <w:left w:val="single" w:color="BFBFBF" w:sz="4"/>
-              <w:bottom w:val="single" w:color="BFBFBF" w:sz="4"/>
-              <w:right w:val="single" w:color="BFBFBF" w:sz="4"/>
-            </w:tcBorders>
-            <w:shd w:fill="F3F4F6" w:val="clear"/>
-            <w:tcMar>
-              <w:top w:type="dxa" w:w="100"/>
-              <w:left w:type="dxa" w:w="140"/>
-              <w:bottom w:type="dxa" w:w="100"/>
-              <w:right w:type="dxa" w:w="140"/>
-            </w:tcMar>
-            <w:vAlign w:val="center"/>
-          </w:tcPr>
-          <w:p>
-            <w:pPr>
-              <w:spacing w:after="40" w:before="40"/>
-              <w:jc w:val="center"/>
-            </w:pPr>
-            <w:r>
-              <w:rPr>
-                <w:rFonts w:ascii="Calibri" w:cs="Calibri" w:eastAsia="Calibri" w:hAnsi="Calibri"/>
-                <w:sz w:val="22"/>
-                <w:szCs w:val="22"/>
-              </w:rPr>
-              <w:t xml:space="preserve">87</w:t>
-            </w:r>
-          </w:p>
-        </w:tc>
-        <w:tc>
-          <w:tcPr>
-            <w:tcW w:type="dxa" w:w="3580"/>
-            <w:tcBorders>
-              <w:top w:val="single" w:color="BFBFBF" w:sz="4"/>
-              <w:left w:val="single" w:color="BFBFBF" w:sz="4"/>
-              <w:bottom w:val="single" w:color="BFBFBF" w:sz="4"/>
-              <w:right w:val="single" w:color="BFBFBF" w:sz="4"/>
-            </w:tcBorders>
-            <w:shd w:fill="F3F4F6" w:val="clear"/>
-            <w:tcMar>
-              <w:top w:type="dxa" w:w="100"/>
-              <w:left w:type="dxa" w:w="140"/>
-              <w:bottom w:type="dxa" w:w="100"/>
-              <w:right w:type="dxa" w:w="140"/>
-            </w:tcMar>
-            <w:vAlign w:val="center"/>
-          </w:tcPr>
-          <w:p>
-            <w:pPr>
-              <w:spacing w:after="40" w:before="40"/>
-              <w:jc w:val="left"/>
-            </w:pPr>
-            <w:r>
-              <w:rPr>
-                <w:rFonts w:ascii="Calibri" w:cs="Calibri" w:eastAsia="Calibri" w:hAnsi="Calibri"/>
-                <w:b/>
-                <w:bCs/>
-                <w:sz w:val="22"/>
-                <w:szCs w:val="22"/>
-              </w:rPr>
-              <w:t xml:space="preserve">Lloyds Engineering Works Limited</w:t>
-            </w:r>
-          </w:p>
-        </w:tc>
-        <w:tc>
-          <w:tcPr>
-            <w:tcW w:type="dxa" w:w="5000"/>
-            <w:tcBorders>
-              <w:top w:val="single" w:color="BFBFBF" w:sz="4"/>
-              <w:left w:val="single" w:color="BFBFBF" w:sz="4"/>
-              <w:bottom w:val="single" w:color="BFBFBF" w:sz="4"/>
-              <w:right w:val="single" w:color="BFBFBF" w:sz="4"/>
-            </w:tcBorders>
-            <w:shd w:fill="F3F4F6" w:val="clear"/>
-            <w:tcMar>
-              <w:top w:type="dxa" w:w="100"/>
-              <w:left w:type="dxa" w:w="140"/>
-              <w:bottom w:type="dxa" w:w="100"/>
-              <w:right w:type="dxa" w:w="140"/>
-            </w:tcMar>
-            <w:vAlign w:val="center"/>
-          </w:tcPr>
-          <w:p>
-            <w:pPr>
-              <w:spacing w:after="40" w:before="40"/>
-              <w:jc w:val="left"/>
-            </w:pPr>
-            <w:r>
-              <w:rPr>
-                <w:rFonts w:ascii="Calibri" w:cs="Calibri" w:eastAsia="Calibri" w:hAnsi="Calibri"/>
-                <w:sz w:val="22"/>
-                <w:szCs w:val="22"/>
-              </w:rPr>
-              <w:t xml:space="preserve">Vertical Ladle Preheater - 40 MT</w:t>
-            </w:r>
-          </w:p>
-        </w:tc>
-      </w:tr>
-      <w:tr>
-        <w:tc>
-          <w:tcPr>
-            <w:tcW w:type="dxa" w:w="780"/>
-            <w:tcBorders>
-              <w:top w:val="single" w:color="BFBFBF" w:sz="4"/>
-              <w:left w:val="single" w:color="BFBFBF" w:sz="4"/>
-              <w:bottom w:val="single" w:color="BFBFBF" w:sz="4"/>
-              <w:right w:val="single" w:color="BFBFBF" w:sz="4"/>
-            </w:tcBorders>
-            <w:shd w:fill="F3F4F6" w:val="clear"/>
-            <w:tcMar>
-              <w:top w:type="dxa" w:w="100"/>
-              <w:left w:type="dxa" w:w="140"/>
-              <w:bottom w:type="dxa" w:w="100"/>
-              <w:right w:type="dxa" w:w="140"/>
-            </w:tcMar>
-            <w:vAlign w:val="center"/>
-          </w:tcPr>
-          <w:p>
-            <w:pPr>
-              <w:spacing w:after="40" w:before="40"/>
-              <w:jc w:val="center"/>
-            </w:pPr>
-            <w:r>
-              <w:rPr>
-                <w:rFonts w:ascii="Calibri" w:cs="Calibri" w:eastAsia="Calibri" w:hAnsi="Calibri"/>
-                <w:sz w:val="22"/>
-                <w:szCs w:val="22"/>
-              </w:rPr>
-              <w:t xml:space="preserve">88</w:t>
-            </w:r>
-          </w:p>
-        </w:tc>
-        <w:tc>
-          <w:tcPr>
-            <w:tcW w:type="dxa" w:w="3580"/>
-            <w:tcBorders>
-              <w:top w:val="single" w:color="BFBFBF" w:sz="4"/>
-              <w:left w:val="single" w:color="BFBFBF" w:sz="4"/>
-              <w:bottom w:val="single" w:color="BFBFBF" w:sz="4"/>
-              <w:right w:val="single" w:color="BFBFBF" w:sz="4"/>
-            </w:tcBorders>
-            <w:shd w:fill="F3F4F6" w:val="clear"/>
-            <w:tcMar>
-              <w:top w:type="dxa" w:w="100"/>
-              <w:left w:type="dxa" w:w="140"/>
-              <w:bottom w:type="dxa" w:w="100"/>
-              <w:right w:type="dxa" w:w="140"/>
-            </w:tcMar>
-            <w:vAlign w:val="center"/>
-          </w:tcPr>
-          <w:p>
-            <w:pPr>
-              <w:spacing w:after="40" w:before="40"/>
-              <w:jc w:val="left"/>
-            </w:pPr>
-            <w:r>
-              <w:rPr>
-                <w:rFonts w:ascii="Calibri" w:cs="Calibri" w:eastAsia="Calibri" w:hAnsi="Calibri"/>
-                <w:b/>
-                <w:bCs/>
-                <w:sz w:val="22"/>
-                <w:szCs w:val="22"/>
-              </w:rPr>
-              <w:t xml:space="preserve">Muhaj Baghdad Co. Ltd.</w:t>
-            </w:r>
-          </w:p>
-        </w:tc>
-        <w:tc>
-          <w:tcPr>
-            <w:tcW w:type="dxa" w:w="5000"/>
-            <w:tcBorders>
-              <w:top w:val="single" w:color="BFBFBF" w:sz="4"/>
-              <w:left w:val="single" w:color="BFBFBF" w:sz="4"/>
-              <w:bottom w:val="single" w:color="BFBFBF" w:sz="4"/>
-              <w:right w:val="single" w:color="BFBFBF" w:sz="4"/>
-            </w:tcBorders>
-            <w:shd w:fill="F3F4F6" w:val="clear"/>
-            <w:tcMar>
-              <w:top w:type="dxa" w:w="100"/>
-              <w:left w:type="dxa" w:w="140"/>
-              <w:bottom w:type="dxa" w:w="100"/>
-              <w:right w:type="dxa" w:w="140"/>
-            </w:tcMar>
-            <w:vAlign w:val="center"/>
-          </w:tcPr>
-          <w:p>
-            <w:pPr>
-              <w:spacing w:after="40" w:before="40"/>
-              <w:jc w:val="left"/>
-            </w:pPr>
-            <w:r>
-              <w:rPr>
-                <w:rFonts w:ascii="Calibri" w:cs="Calibri" w:eastAsia="Calibri" w:hAnsi="Calibri"/>
-                <w:sz w:val="22"/>
-                <w:szCs w:val="22"/>
-              </w:rPr>
-              <w:t xml:space="preserve">Tundish Preheater</w:t>
-            </w:r>
-          </w:p>
-        </w:tc>
-      </w:tr>
-      <w:tr>
-        <w:tc>
-          <w:tcPr>
-            <w:tcW w:type="dxa" w:w="780"/>
-            <w:tcBorders>
-              <w:top w:val="single" w:color="BFBFBF" w:sz="4"/>
-              <w:left w:val="single" w:color="BFBFBF" w:sz="4"/>
-              <w:bottom w:val="single" w:color="BFBFBF" w:sz="4"/>
-              <w:right w:val="single" w:color="BFBFBF" w:sz="4"/>
-            </w:tcBorders>
-            <w:shd w:fill="F3F4F6" w:val="clear"/>
-            <w:tcMar>
-              <w:top w:type="dxa" w:w="100"/>
-              <w:left w:type="dxa" w:w="140"/>
-              <w:bottom w:type="dxa" w:w="100"/>
-              <w:right w:type="dxa" w:w="140"/>
-            </w:tcMar>
-            <w:vAlign w:val="center"/>
-          </w:tcPr>
-          <w:p>
-            <w:pPr>
-              <w:spacing w:after="40" w:before="40"/>
-              <w:jc w:val="center"/>
-            </w:pPr>
-            <w:r>
-              <w:rPr>
-                <w:rFonts w:ascii="Calibri" w:cs="Calibri" w:eastAsia="Calibri" w:hAnsi="Calibri"/>
-                <w:sz w:val="22"/>
-                <w:szCs w:val="22"/>
-              </w:rPr>
-              <w:t xml:space="preserve">89</w:t>
-            </w:r>
-          </w:p>
-        </w:tc>
-        <w:tc>
-          <w:tcPr>
-            <w:tcW w:type="dxa" w:w="3580"/>
-            <w:tcBorders>
-              <w:top w:val="single" w:color="BFBFBF" w:sz="4"/>
-              <w:left w:val="single" w:color="BFBFBF" w:sz="4"/>
-              <w:bottom w:val="single" w:color="BFBFBF" w:sz="4"/>
-              <w:right w:val="single" w:color="BFBFBF" w:sz="4"/>
-            </w:tcBorders>
-            <w:shd w:fill="F3F4F6" w:val="clear"/>
-            <w:tcMar>
-              <w:top w:type="dxa" w:w="100"/>
-              <w:left w:type="dxa" w:w="140"/>
-              <w:bottom w:type="dxa" w:w="100"/>
-              <w:right w:type="dxa" w:w="140"/>
-            </w:tcMar>
-            <w:vAlign w:val="center"/>
-          </w:tcPr>
-          <w:p>
-            <w:pPr>
-              <w:spacing w:after="40" w:before="40"/>
-              <w:jc w:val="left"/>
-            </w:pPr>
-            <w:r>
-              <w:rPr>
-                <w:rFonts w:ascii="Calibri" w:cs="Calibri" w:eastAsia="Calibri" w:hAnsi="Calibri"/>
-                <w:b/>
-                <w:bCs/>
-                <w:sz w:val="22"/>
-                <w:szCs w:val="22"/>
-              </w:rPr>
-              <w:t xml:space="preserve">Topworth Steels &amp; Power Pvt. Ltd.</w:t>
-            </w:r>
-          </w:p>
-        </w:tc>
-        <w:tc>
-          <w:tcPr>
-            <w:tcW w:type="dxa" w:w="5000"/>
-            <w:tcBorders>
-              <w:top w:val="single" w:color="BFBFBF" w:sz="4"/>
-              <w:left w:val="single" w:color="BFBFBF" w:sz="4"/>
-              <w:bottom w:val="single" w:color="BFBFBF" w:sz="4"/>
-              <w:right w:val="single" w:color="BFBFBF" w:sz="4"/>
-            </w:tcBorders>
-            <w:shd w:fill="F3F4F6" w:val="clear"/>
-            <w:tcMar>
-              <w:top w:type="dxa" w:w="100"/>
-              <w:left w:type="dxa" w:w="140"/>
-              <w:bottom w:type="dxa" w:w="100"/>
-              <w:right w:type="dxa" w:w="140"/>
-            </w:tcMar>
-            <w:vAlign w:val="center"/>
-          </w:tcPr>
-          <w:p>
-            <w:pPr>
-              <w:spacing w:after="40" w:before="40"/>
-              <w:jc w:val="left"/>
-            </w:pPr>
-            <w:r>
-              <w:rPr>
-                <w:rFonts w:ascii="Calibri" w:cs="Calibri" w:eastAsia="Calibri" w:hAnsi="Calibri"/>
-                <w:sz w:val="22"/>
-                <w:szCs w:val="22"/>
-              </w:rPr>
-              <w:t xml:space="preserve">Vertical Ladle Preheater</w:t>
-            </w:r>
-          </w:p>
-        </w:tc>
-      </w:tr>
-      <w:tr>
-        <w:tc>
-          <w:tcPr>
-            <w:tcW w:type="dxa" w:w="780"/>
-            <w:tcBorders>
-              <w:top w:val="single" w:color="BFBFBF" w:sz="4"/>
-              <w:left w:val="single" w:color="BFBFBF" w:sz="4"/>
-              <w:bottom w:val="single" w:color="BFBFBF" w:sz="4"/>
-              <w:right w:val="single" w:color="BFBFBF" w:sz="4"/>
-            </w:tcBorders>
-            <w:shd w:fill="F3F4F6" w:val="clear"/>
-            <w:tcMar>
-              <w:top w:type="dxa" w:w="100"/>
-              <w:left w:type="dxa" w:w="140"/>
-              <w:bottom w:type="dxa" w:w="100"/>
-              <w:right w:type="dxa" w:w="140"/>
-            </w:tcMar>
-            <w:vAlign w:val="center"/>
-          </w:tcPr>
-          <w:p>
-            <w:pPr>
-              <w:spacing w:after="40" w:before="40"/>
-              <w:jc w:val="center"/>
-            </w:pPr>
-            <w:r>
-              <w:rPr>
-                <w:rFonts w:ascii="Calibri" w:cs="Calibri" w:eastAsia="Calibri" w:hAnsi="Calibri"/>
-                <w:sz w:val="22"/>
-                <w:szCs w:val="22"/>
-              </w:rPr>
-              <w:t xml:space="preserve">90</w:t>
-            </w:r>
-          </w:p>
-        </w:tc>
-        <w:tc>
-          <w:tcPr>
-            <w:tcW w:type="dxa" w:w="3580"/>
-            <w:tcBorders>
-              <w:top w:val="single" w:color="BFBFBF" w:sz="4"/>
-              <w:left w:val="single" w:color="BFBFBF" w:sz="4"/>
-              <w:bottom w:val="single" w:color="BFBFBF" w:sz="4"/>
-              <w:right w:val="single" w:color="BFBFBF" w:sz="4"/>
-            </w:tcBorders>
-            <w:shd w:fill="F3F4F6" w:val="clear"/>
-            <w:tcMar>
-              <w:top w:type="dxa" w:w="100"/>
-              <w:left w:type="dxa" w:w="140"/>
-              <w:bottom w:type="dxa" w:w="100"/>
-              <w:right w:type="dxa" w:w="140"/>
-            </w:tcMar>
-            <w:vAlign w:val="center"/>
-          </w:tcPr>
-          <w:p>
-            <w:pPr>
-              <w:spacing w:after="40" w:before="40"/>
-              <w:jc w:val="left"/>
-            </w:pPr>
-            <w:r>
-              <w:rPr>
-                <w:rFonts w:ascii="Calibri" w:cs="Calibri" w:eastAsia="Calibri" w:hAnsi="Calibri"/>
-                <w:b/>
-                <w:bCs/>
-                <w:sz w:val="22"/>
-                <w:szCs w:val="22"/>
-              </w:rPr>
-              <w:t xml:space="preserve">JSW Steel Limited</w:t>
-            </w:r>
-          </w:p>
-        </w:tc>
-        <w:tc>
-          <w:tcPr>
-            <w:tcW w:type="dxa" w:w="5000"/>
-            <w:tcBorders>
-              <w:top w:val="single" w:color="BFBFBF" w:sz="4"/>
-              <w:left w:val="single" w:color="BFBFBF" w:sz="4"/>
-              <w:bottom w:val="single" w:color="BFBFBF" w:sz="4"/>
-              <w:right w:val="single" w:color="BFBFBF" w:sz="4"/>
-            </w:tcBorders>
-            <w:shd w:fill="F3F4F6" w:val="clear"/>
-            <w:tcMar>
-              <w:top w:type="dxa" w:w="100"/>
-              <w:left w:type="dxa" w:w="140"/>
-              <w:bottom w:type="dxa" w:w="100"/>
-              <w:right w:type="dxa" w:w="140"/>
-            </w:tcMar>
-            <w:vAlign w:val="center"/>
-          </w:tcPr>
-          <w:p>
-            <w:pPr>
-              <w:spacing w:after="40" w:before="40"/>
-              <w:jc w:val="left"/>
-            </w:pPr>
-            <w:r>
-              <w:rPr>
-                <w:rFonts w:ascii="Calibri" w:cs="Calibri" w:eastAsia="Calibri" w:hAnsi="Calibri"/>
-                <w:sz w:val="22"/>
-                <w:szCs w:val="22"/>
-              </w:rPr>
-              <w:t xml:space="preserve">Vertical Ladle Preheater</w:t>
-            </w:r>
-          </w:p>
-        </w:tc>
-      </w:tr>
-      <w:tr>
-        <w:tc>
-          <w:tcPr>
-            <w:tcW w:type="dxa" w:w="780"/>
-            <w:tcBorders>
-              <w:top w:val="single" w:color="BFBFBF" w:sz="4"/>
-              <w:left w:val="single" w:color="BFBFBF" w:sz="4"/>
-              <w:bottom w:val="single" w:color="BFBFBF" w:sz="4"/>
-              <w:right w:val="single" w:color="BFBFBF" w:sz="4"/>
-            </w:tcBorders>
-            <w:shd w:fill="F3F4F6" w:val="clear"/>
-            <w:tcMar>
-              <w:top w:type="dxa" w:w="100"/>
-              <w:left w:type="dxa" w:w="140"/>
-              <w:bottom w:type="dxa" w:w="100"/>
-              <w:right w:type="dxa" w:w="140"/>
-            </w:tcMar>
-            <w:vAlign w:val="center"/>
-          </w:tcPr>
-          <w:p>
-            <w:pPr>
-              <w:spacing w:after="40" w:before="40"/>
-              <w:jc w:val="center"/>
-            </w:pPr>
-            <w:r>
-              <w:rPr>
-                <w:rFonts w:ascii="Calibri" w:cs="Calibri" w:eastAsia="Calibri" w:hAnsi="Calibri"/>
-                <w:sz w:val="22"/>
-                <w:szCs w:val="22"/>
-              </w:rPr>
-              <w:t xml:space="preserve">91</w:t>
-            </w:r>
-          </w:p>
-        </w:tc>
-        <w:tc>
-          <w:tcPr>
-            <w:tcW w:type="dxa" w:w="3580"/>
-            <w:tcBorders>
-              <w:top w:val="single" w:color="BFBFBF" w:sz="4"/>
-              <w:left w:val="single" w:color="BFBFBF" w:sz="4"/>
-              <w:bottom w:val="single" w:color="BFBFBF" w:sz="4"/>
-              <w:right w:val="single" w:color="BFBFBF" w:sz="4"/>
-            </w:tcBorders>
-            <w:shd w:fill="F3F4F6" w:val="clear"/>
-            <w:tcMar>
-              <w:top w:type="dxa" w:w="100"/>
-              <w:left w:type="dxa" w:w="140"/>
-              <w:bottom w:type="dxa" w:w="100"/>
-              <w:right w:type="dxa" w:w="140"/>
-            </w:tcMar>
-            <w:vAlign w:val="center"/>
-          </w:tcPr>
-          <w:p>
-            <w:pPr>
-              <w:spacing w:after="40" w:before="40"/>
-              <w:jc w:val="left"/>
-            </w:pPr>
-            <w:r>
-              <w:rPr>
-                <w:rFonts w:ascii="Calibri" w:cs="Calibri" w:eastAsia="Calibri" w:hAnsi="Calibri"/>
-                <w:b/>
-                <w:bCs/>
-                <w:sz w:val="22"/>
-                <w:szCs w:val="22"/>
-              </w:rPr>
-              <w:t xml:space="preserve">Sohar Steel LLC</w:t>
-            </w:r>
-          </w:p>
-        </w:tc>
-        <w:tc>
-          <w:tcPr>
-            <w:tcW w:type="dxa" w:w="5000"/>
-            <w:tcBorders>
-              <w:top w:val="single" w:color="BFBFBF" w:sz="4"/>
-              <w:left w:val="single" w:color="BFBFBF" w:sz="4"/>
-              <w:bottom w:val="single" w:color="BFBFBF" w:sz="4"/>
-              <w:right w:val="single" w:color="BFBFBF" w:sz="4"/>
-            </w:tcBorders>
-            <w:shd w:fill="F3F4F6" w:val="clear"/>
-            <w:tcMar>
-              <w:top w:type="dxa" w:w="100"/>
-              <w:left w:type="dxa" w:w="140"/>
-              <w:bottom w:type="dxa" w:w="100"/>
-              <w:right w:type="dxa" w:w="140"/>
-            </w:tcMar>
-            <w:vAlign w:val="center"/>
-          </w:tcPr>
-          <w:p>
-            <w:pPr>
-              <w:spacing w:after="40" w:before="40"/>
-              <w:jc w:val="left"/>
-            </w:pPr>
-            <w:r>
-              <w:rPr>
-                <w:rFonts w:ascii="Calibri" w:cs="Calibri" w:eastAsia="Calibri" w:hAnsi="Calibri"/>
-                <w:sz w:val="22"/>
-                <w:szCs w:val="22"/>
-              </w:rPr>
-              <w:t xml:space="preserve">Vertical Ladle Preheater</w:t>
-            </w:r>
-          </w:p>
-        </w:tc>
-      </w:tr>
-      <w:tr>
-        <w:tc>
-          <w:tcPr>
-            <w:tcW w:type="dxa" w:w="780"/>
-            <w:tcBorders>
-              <w:top w:val="single" w:color="BFBFBF" w:sz="4"/>
-              <w:left w:val="single" w:color="BFBFBF" w:sz="4"/>
-              <w:bottom w:val="single" w:color="BFBFBF" w:sz="4"/>
-              <w:right w:val="single" w:color="BFBFBF" w:sz="4"/>
-            </w:tcBorders>
-            <w:shd w:fill="F3F4F6" w:val="clear"/>
-            <w:tcMar>
-              <w:top w:type="dxa" w:w="100"/>
-              <w:left w:type="dxa" w:w="140"/>
-              <w:bottom w:type="dxa" w:w="100"/>
-              <w:right w:type="dxa" w:w="140"/>
-            </w:tcMar>
-            <w:vAlign w:val="center"/>
-          </w:tcPr>
-          <w:p>
-            <w:pPr>
-              <w:spacing w:after="40" w:before="40"/>
-              <w:jc w:val="center"/>
-            </w:pPr>
-            <w:r>
-              <w:rPr>
-                <w:rFonts w:ascii="Calibri" w:cs="Calibri" w:eastAsia="Calibri" w:hAnsi="Calibri"/>
-                <w:sz w:val="22"/>
-                <w:szCs w:val="22"/>
-              </w:rPr>
-              <w:t xml:space="preserve">92</w:t>
-            </w:r>
-          </w:p>
-        </w:tc>
-        <w:tc>
-          <w:tcPr>
-            <w:tcW w:type="dxa" w:w="3580"/>
-            <w:tcBorders>
-              <w:top w:val="single" w:color="BFBFBF" w:sz="4"/>
-              <w:left w:val="single" w:color="BFBFBF" w:sz="4"/>
-              <w:bottom w:val="single" w:color="BFBFBF" w:sz="4"/>
-              <w:right w:val="single" w:color="BFBFBF" w:sz="4"/>
-            </w:tcBorders>
-            <w:shd w:fill="F3F4F6" w:val="clear"/>
-            <w:tcMar>
-              <w:top w:type="dxa" w:w="100"/>
-              <w:left w:type="dxa" w:w="140"/>
-              <w:bottom w:type="dxa" w:w="100"/>
-              <w:right w:type="dxa" w:w="140"/>
-            </w:tcMar>
-            <w:vAlign w:val="center"/>
-          </w:tcPr>
-          <w:p>
-            <w:pPr>
-              <w:spacing w:after="40" w:before="40"/>
-              <w:jc w:val="left"/>
-            </w:pPr>
-            <w:r>
-              <w:rPr>
-                <w:rFonts w:ascii="Calibri" w:cs="Calibri" w:eastAsia="Calibri" w:hAnsi="Calibri"/>
-                <w:b/>
-                <w:bCs/>
-                <w:sz w:val="22"/>
-                <w:szCs w:val="22"/>
-              </w:rPr>
-              <w:t xml:space="preserve">Sohar Steel LLC</w:t>
-            </w:r>
-          </w:p>
-        </w:tc>
-        <w:tc>
-          <w:tcPr>
-            <w:tcW w:type="dxa" w:w="5000"/>
-            <w:tcBorders>
-              <w:top w:val="single" w:color="BFBFBF" w:sz="4"/>
-              <w:left w:val="single" w:color="BFBFBF" w:sz="4"/>
-              <w:bottom w:val="single" w:color="BFBFBF" w:sz="4"/>
-              <w:right w:val="single" w:color="BFBFBF" w:sz="4"/>
-            </w:tcBorders>
-            <w:shd w:fill="F3F4F6" w:val="clear"/>
-            <w:tcMar>
-              <w:top w:type="dxa" w:w="100"/>
-              <w:left w:type="dxa" w:w="140"/>
-              <w:bottom w:type="dxa" w:w="100"/>
-              <w:right w:type="dxa" w:w="140"/>
-            </w:tcMar>
-            <w:vAlign w:val="center"/>
-          </w:tcPr>
-          <w:p>
-            <w:pPr>
-              <w:spacing w:after="40" w:before="40"/>
-              <w:jc w:val="left"/>
-            </w:pPr>
-            <w:r>
-              <w:rPr>
-                <w:rFonts w:ascii="Calibri" w:cs="Calibri" w:eastAsia="Calibri" w:hAnsi="Calibri"/>
-                <w:sz w:val="22"/>
-                <w:szCs w:val="22"/>
-              </w:rPr>
-              <w:t xml:space="preserve">Horizontal Ladle Preheater</w:t>
-            </w:r>
-          </w:p>
-        </w:tc>
-      </w:tr>
-      <w:tr>
-        <w:tc>
-          <w:tcPr>
-            <w:tcW w:type="dxa" w:w="780"/>
-            <w:tcBorders>
-              <w:top w:val="single" w:color="BFBFBF" w:sz="4"/>
-              <w:left w:val="single" w:color="BFBFBF" w:sz="4"/>
-              <w:bottom w:val="single" w:color="BFBFBF" w:sz="4"/>
-              <w:right w:val="single" w:color="BFBFBF" w:sz="4"/>
-            </w:tcBorders>
-            <w:shd w:fill="F3F4F6" w:val="clear"/>
-            <w:tcMar>
-              <w:top w:type="dxa" w:w="100"/>
-              <w:left w:type="dxa" w:w="140"/>
-              <w:bottom w:type="dxa" w:w="100"/>
-              <w:right w:type="dxa" w:w="140"/>
-            </w:tcMar>
-            <w:vAlign w:val="center"/>
-          </w:tcPr>
-          <w:p>
-            <w:pPr>
-              <w:spacing w:after="40" w:before="40"/>
-              <w:jc w:val="center"/>
-            </w:pPr>
-            <w:r>
-              <w:rPr>
-                <w:rFonts w:ascii="Calibri" w:cs="Calibri" w:eastAsia="Calibri" w:hAnsi="Calibri"/>
-                <w:sz w:val="22"/>
-                <w:szCs w:val="22"/>
-              </w:rPr>
-              <w:t xml:space="preserve">93</w:t>
-            </w:r>
-          </w:p>
-        </w:tc>
-        <w:tc>
-          <w:tcPr>
-            <w:tcW w:type="dxa" w:w="3580"/>
-            <w:tcBorders>
-              <w:top w:val="single" w:color="BFBFBF" w:sz="4"/>
-              <w:left w:val="single" w:color="BFBFBF" w:sz="4"/>
-              <w:bottom w:val="single" w:color="BFBFBF" w:sz="4"/>
-              <w:right w:val="single" w:color="BFBFBF" w:sz="4"/>
-            </w:tcBorders>
-            <w:shd w:fill="F3F4F6" w:val="clear"/>
-            <w:tcMar>
-              <w:top w:type="dxa" w:w="100"/>
-              <w:left w:type="dxa" w:w="140"/>
-              <w:bottom w:type="dxa" w:w="100"/>
-              <w:right w:type="dxa" w:w="140"/>
-            </w:tcMar>
-            <w:vAlign w:val="center"/>
-          </w:tcPr>
-          <w:p>
-            <w:pPr>
-              <w:spacing w:after="40" w:before="40"/>
-              <w:jc w:val="left"/>
-            </w:pPr>
-            <w:r>
-              <w:rPr>
-                <w:rFonts w:ascii="Calibri" w:cs="Calibri" w:eastAsia="Calibri" w:hAnsi="Calibri"/>
-                <w:b/>
-                <w:bCs/>
-                <w:sz w:val="22"/>
-                <w:szCs w:val="22"/>
-              </w:rPr>
-              <w:t xml:space="preserve">Quality Industries P Ltd.</w:t>
-            </w:r>
-          </w:p>
-        </w:tc>
-        <w:tc>
-          <w:tcPr>
-            <w:tcW w:type="dxa" w:w="5000"/>
-            <w:tcBorders>
-              <w:top w:val="single" w:color="BFBFBF" w:sz="4"/>
-              <w:left w:val="single" w:color="BFBFBF" w:sz="4"/>
-              <w:bottom w:val="single" w:color="BFBFBF" w:sz="4"/>
-              <w:right w:val="single" w:color="BFBFBF" w:sz="4"/>
-            </w:tcBorders>
-            <w:shd w:fill="F3F4F6" w:val="clear"/>
-            <w:tcMar>
-              <w:top w:type="dxa" w:w="100"/>
-              <w:left w:type="dxa" w:w="140"/>
-              <w:bottom w:type="dxa" w:w="100"/>
-              <w:right w:type="dxa" w:w="140"/>
-            </w:tcMar>
-            <w:vAlign w:val="center"/>
-          </w:tcPr>
-          <w:p>
-            <w:pPr>
-              <w:spacing w:after="40" w:before="40"/>
-              <w:jc w:val="left"/>
-            </w:pPr>
-            <w:r>
-              <w:rPr>
-                <w:rFonts w:ascii="Calibri" w:cs="Calibri" w:eastAsia="Calibri" w:hAnsi="Calibri"/>
-                <w:sz w:val="22"/>
-                <w:szCs w:val="22"/>
-              </w:rPr>
-              <w:t xml:space="preserve">Vertical Ladle Preheater - 30 MT</w:t>
-            </w:r>
-          </w:p>
-        </w:tc>
-      </w:tr>
-      <w:tr>
-        <w:tc>
-          <w:tcPr>
-            <w:tcW w:type="dxa" w:w="780"/>
-            <w:tcBorders>
-              <w:top w:val="single" w:color="BFBFBF" w:sz="4"/>
-              <w:left w:val="single" w:color="BFBFBF" w:sz="4"/>
-              <w:bottom w:val="single" w:color="BFBFBF" w:sz="4"/>
-              <w:right w:val="single" w:color="BFBFBF" w:sz="4"/>
-            </w:tcBorders>
-            <w:shd w:fill="F3F4F6" w:val="clear"/>
-            <w:tcMar>
-              <w:top w:type="dxa" w:w="100"/>
-              <w:left w:type="dxa" w:w="140"/>
-              <w:bottom w:type="dxa" w:w="100"/>
-              <w:right w:type="dxa" w:w="140"/>
-            </w:tcMar>
-            <w:vAlign w:val="center"/>
-          </w:tcPr>
-          <w:p>
-            <w:pPr>
-              <w:spacing w:after="40" w:before="40"/>
-              <w:jc w:val="center"/>
-            </w:pPr>
-            <w:r>
-              <w:rPr>
-                <w:rFonts w:ascii="Calibri" w:cs="Calibri" w:eastAsia="Calibri" w:hAnsi="Calibri"/>
-                <w:sz w:val="22"/>
-                <w:szCs w:val="22"/>
-              </w:rPr>
-              <w:t xml:space="preserve">94</w:t>
-            </w:r>
-          </w:p>
-        </w:tc>
-        <w:tc>
-          <w:tcPr>
-            <w:tcW w:type="dxa" w:w="3580"/>
-            <w:tcBorders>
-              <w:top w:val="single" w:color="BFBFBF" w:sz="4"/>
-              <w:left w:val="single" w:color="BFBFBF" w:sz="4"/>
-              <w:bottom w:val="single" w:color="BFBFBF" w:sz="4"/>
-              <w:right w:val="single" w:color="BFBFBF" w:sz="4"/>
-            </w:tcBorders>
-            <w:shd w:fill="F3F4F6" w:val="clear"/>
-            <w:tcMar>
-              <w:top w:type="dxa" w:w="100"/>
-              <w:left w:type="dxa" w:w="140"/>
-              <w:bottom w:type="dxa" w:w="100"/>
-              <w:right w:type="dxa" w:w="140"/>
-            </w:tcMar>
-            <w:vAlign w:val="center"/>
-          </w:tcPr>
-          <w:p>
-            <w:pPr>
-              <w:spacing w:after="40" w:before="40"/>
-              <w:jc w:val="left"/>
-            </w:pPr>
-            <w:r>
-              <w:rPr>
-                <w:rFonts w:ascii="Calibri" w:cs="Calibri" w:eastAsia="Calibri" w:hAnsi="Calibri"/>
-                <w:b/>
-                <w:bCs/>
-                <w:sz w:val="22"/>
-                <w:szCs w:val="22"/>
-              </w:rPr>
-              <w:t xml:space="preserve">Quality Industries P Ltd.</w:t>
-            </w:r>
-          </w:p>
-        </w:tc>
-        <w:tc>
-          <w:tcPr>
-            <w:tcW w:type="dxa" w:w="5000"/>
-            <w:tcBorders>
-              <w:top w:val="single" w:color="BFBFBF" w:sz="4"/>
-              <w:left w:val="single" w:color="BFBFBF" w:sz="4"/>
-              <w:bottom w:val="single" w:color="BFBFBF" w:sz="4"/>
-              <w:right w:val="single" w:color="BFBFBF" w:sz="4"/>
-            </w:tcBorders>
-            <w:shd w:fill="F3F4F6" w:val="clear"/>
-            <w:tcMar>
-              <w:top w:type="dxa" w:w="100"/>
-              <w:left w:type="dxa" w:w="140"/>
-              <w:bottom w:type="dxa" w:w="100"/>
-              <w:right w:type="dxa" w:w="140"/>
-            </w:tcMar>
-            <w:vAlign w:val="center"/>
-          </w:tcPr>
-          <w:p>
-            <w:pPr>
-              <w:spacing w:after="40" w:before="40"/>
-              <w:jc w:val="left"/>
-            </w:pPr>
-            <w:r>
-              <w:rPr>
-                <w:rFonts w:ascii="Calibri" w:cs="Calibri" w:eastAsia="Calibri" w:hAnsi="Calibri"/>
-                <w:sz w:val="22"/>
-                <w:szCs w:val="22"/>
-              </w:rPr>
-              <w:t xml:space="preserve">Horizontal Ladle Preheater - 30 MT</w:t>
-            </w:r>
-          </w:p>
-        </w:tc>
-      </w:tr>
-      <w:tr>
-        <w:tc>
-          <w:tcPr>
-            <w:tcW w:type="dxa" w:w="780"/>
-            <w:tcBorders>
-              <w:top w:val="single" w:color="BFBFBF" w:sz="4"/>
-              <w:left w:val="single" w:color="BFBFBF" w:sz="4"/>
-              <w:bottom w:val="single" w:color="BFBFBF" w:sz="4"/>
-              <w:right w:val="single" w:color="BFBFBF" w:sz="4"/>
-            </w:tcBorders>
-            <w:shd w:fill="F3F4F6" w:val="clear"/>
-            <w:tcMar>
-              <w:top w:type="dxa" w:w="100"/>
-              <w:left w:type="dxa" w:w="140"/>
-              <w:bottom w:type="dxa" w:w="100"/>
-              <w:right w:type="dxa" w:w="140"/>
-            </w:tcMar>
-            <w:vAlign w:val="center"/>
-          </w:tcPr>
-          <w:p>
-            <w:pPr>
-              <w:spacing w:after="40" w:before="40"/>
-              <w:jc w:val="center"/>
-            </w:pPr>
-            <w:r>
-              <w:rPr>
-                <w:rFonts w:ascii="Calibri" w:cs="Calibri" w:eastAsia="Calibri" w:hAnsi="Calibri"/>
-                <w:sz w:val="22"/>
-                <w:szCs w:val="22"/>
-              </w:rPr>
-              <w:t xml:space="preserve">95</w:t>
-            </w:r>
-          </w:p>
-        </w:tc>
-        <w:tc>
-          <w:tcPr>
-            <w:tcW w:type="dxa" w:w="3580"/>
-            <w:tcBorders>
-              <w:top w:val="single" w:color="BFBFBF" w:sz="4"/>
-              <w:left w:val="single" w:color="BFBFBF" w:sz="4"/>
-              <w:bottom w:val="single" w:color="BFBFBF" w:sz="4"/>
-              <w:right w:val="single" w:color="BFBFBF" w:sz="4"/>
-            </w:tcBorders>
-            <w:shd w:fill="F3F4F6" w:val="clear"/>
-            <w:tcMar>
-              <w:top w:type="dxa" w:w="100"/>
-              <w:left w:type="dxa" w:w="140"/>
-              <w:bottom w:type="dxa" w:w="100"/>
-              <w:right w:type="dxa" w:w="140"/>
-            </w:tcMar>
-            <w:vAlign w:val="center"/>
-          </w:tcPr>
-          <w:p>
-            <w:pPr>
-              <w:spacing w:after="40" w:before="40"/>
-              <w:jc w:val="left"/>
-            </w:pPr>
-            <w:r>
-              <w:rPr>
-                <w:rFonts w:ascii="Calibri" w:cs="Calibri" w:eastAsia="Calibri" w:hAnsi="Calibri"/>
-                <w:b/>
-                <w:bCs/>
-                <w:sz w:val="22"/>
-                <w:szCs w:val="22"/>
-              </w:rPr>
-              <w:t xml:space="preserve">Rashtriya Ispat Nigam Limited</w:t>
-            </w:r>
-          </w:p>
-        </w:tc>
-        <w:tc>
-          <w:tcPr>
-            <w:tcW w:type="dxa" w:w="5000"/>
-            <w:tcBorders>
-              <w:top w:val="single" w:color="BFBFBF" w:sz="4"/>
-              <w:left w:val="single" w:color="BFBFBF" w:sz="4"/>
-              <w:bottom w:val="single" w:color="BFBFBF" w:sz="4"/>
-              <w:right w:val="single" w:color="BFBFBF" w:sz="4"/>
-            </w:tcBorders>
-            <w:shd w:fill="F3F4F6" w:val="clear"/>
-            <w:tcMar>
-              <w:top w:type="dxa" w:w="100"/>
-              <w:left w:type="dxa" w:w="140"/>
-              <w:bottom w:type="dxa" w:w="100"/>
-              <w:right w:type="dxa" w:w="140"/>
-            </w:tcMar>
-            <w:vAlign w:val="center"/>
-          </w:tcPr>
-          <w:p>
-            <w:pPr>
-              <w:spacing w:after="40" w:before="40"/>
-              <w:jc w:val="left"/>
-            </w:pPr>
-            <w:r>
-              <w:rPr>
-                <w:rFonts w:ascii="Calibri" w:cs="Calibri" w:eastAsia="Calibri" w:hAnsi="Calibri"/>
-                <w:sz w:val="22"/>
-                <w:szCs w:val="22"/>
-              </w:rPr>
-              <w:t xml:space="preserve">Tundish Preheater</w:t>
-            </w:r>
-          </w:p>
-        </w:tc>
-      </w:tr>
-      <w:tr>
-        <w:tc>
-          <w:tcPr>
-            <w:tcW w:type="dxa" w:w="780"/>
-            <w:tcBorders>
-              <w:top w:val="single" w:color="BFBFBF" w:sz="4"/>
-              <w:left w:val="single" w:color="BFBFBF" w:sz="4"/>
-              <w:bottom w:val="single" w:color="BFBFBF" w:sz="4"/>
-              <w:right w:val="single" w:color="BFBFBF" w:sz="4"/>
-            </w:tcBorders>
-            <w:shd w:fill="F3F4F6" w:val="clear"/>
-            <w:tcMar>
-              <w:top w:type="dxa" w:w="100"/>
-              <w:left w:type="dxa" w:w="140"/>
-              <w:bottom w:type="dxa" w:w="100"/>
-              <w:right w:type="dxa" w:w="140"/>
-            </w:tcMar>
-            <w:vAlign w:val="center"/>
-          </w:tcPr>
-          <w:p>
-            <w:pPr>
-              <w:spacing w:after="40" w:before="40"/>
-              <w:jc w:val="center"/>
-            </w:pPr>
-            <w:r>
-              <w:rPr>
-                <w:rFonts w:ascii="Calibri" w:cs="Calibri" w:eastAsia="Calibri" w:hAnsi="Calibri"/>
-                <w:sz w:val="22"/>
-                <w:szCs w:val="22"/>
-              </w:rPr>
-              <w:t xml:space="preserve">96</w:t>
-            </w:r>
-          </w:p>
-        </w:tc>
-        <w:tc>
-          <w:tcPr>
-            <w:tcW w:type="dxa" w:w="3580"/>
-            <w:tcBorders>
-              <w:top w:val="single" w:color="BFBFBF" w:sz="4"/>
-              <w:left w:val="single" w:color="BFBFBF" w:sz="4"/>
-              <w:bottom w:val="single" w:color="BFBFBF" w:sz="4"/>
-              <w:right w:val="single" w:color="BFBFBF" w:sz="4"/>
-            </w:tcBorders>
-            <w:shd w:fill="F3F4F6" w:val="clear"/>
-            <w:tcMar>
-              <w:top w:type="dxa" w:w="100"/>
-              <w:left w:type="dxa" w:w="140"/>
-              <w:bottom w:type="dxa" w:w="100"/>
-              <w:right w:type="dxa" w:w="140"/>
-            </w:tcMar>
-            <w:vAlign w:val="center"/>
-          </w:tcPr>
-          <w:p>
-            <w:pPr>
-              <w:spacing w:after="40" w:before="40"/>
-              <w:jc w:val="left"/>
-            </w:pPr>
-            <w:r>
-              <w:rPr>
-                <w:rFonts w:ascii="Calibri" w:cs="Calibri" w:eastAsia="Calibri" w:hAnsi="Calibri"/>
-                <w:b/>
-                <w:bCs/>
-                <w:sz w:val="22"/>
-                <w:szCs w:val="22"/>
-              </w:rPr>
-              <w:t xml:space="preserve">Rashtriya Ispat Nigam Limited</w:t>
-            </w:r>
-          </w:p>
-        </w:tc>
-        <w:tc>
-          <w:tcPr>
-            <w:tcW w:type="dxa" w:w="5000"/>
-            <w:tcBorders>
-              <w:top w:val="single" w:color="BFBFBF" w:sz="4"/>
-              <w:left w:val="single" w:color="BFBFBF" w:sz="4"/>
-              <w:bottom w:val="single" w:color="BFBFBF" w:sz="4"/>
-              <w:right w:val="single" w:color="BFBFBF" w:sz="4"/>
-            </w:tcBorders>
-            <w:shd w:fill="F3F4F6" w:val="clear"/>
-            <w:tcMar>
-              <w:top w:type="dxa" w:w="100"/>
-              <w:left w:type="dxa" w:w="140"/>
-              <w:bottom w:type="dxa" w:w="100"/>
-              <w:right w:type="dxa" w:w="140"/>
-            </w:tcMar>
-            <w:vAlign w:val="center"/>
-          </w:tcPr>
-          <w:p>
-            <w:pPr>
-              <w:spacing w:after="40" w:before="40"/>
-              <w:jc w:val="left"/>
-            </w:pPr>
-            <w:r>
-              <w:rPr>
-                <w:rFonts w:ascii="Calibri" w:cs="Calibri" w:eastAsia="Calibri" w:hAnsi="Calibri"/>
-                <w:sz w:val="22"/>
-                <w:szCs w:val="22"/>
-              </w:rPr>
-              <w:t xml:space="preserve">Tundish Preheater</w:t>
-            </w:r>
-          </w:p>
-        </w:tc>
-      </w:tr>
-      <w:tr>
-        <w:tc>
-          <w:tcPr>
-            <w:tcW w:type="dxa" w:w="780"/>
-            <w:tcBorders>
-              <w:top w:val="single" w:color="BFBFBF" w:sz="4"/>
-              <w:left w:val="single" w:color="BFBFBF" w:sz="4"/>
-              <w:bottom w:val="single" w:color="BFBFBF" w:sz="4"/>
-              <w:right w:val="single" w:color="BFBFBF" w:sz="4"/>
-            </w:tcBorders>
-            <w:shd w:fill="F3F4F6" w:val="clear"/>
-            <w:tcMar>
-              <w:top w:type="dxa" w:w="100"/>
-              <w:left w:type="dxa" w:w="140"/>
-              <w:bottom w:type="dxa" w:w="100"/>
-              <w:right w:type="dxa" w:w="140"/>
-            </w:tcMar>
-            <w:vAlign w:val="center"/>
-          </w:tcPr>
-          <w:p>
-            <w:pPr>
-              <w:spacing w:after="40" w:before="40"/>
-              <w:jc w:val="center"/>
-            </w:pPr>
-            <w:r>
-              <w:rPr>
-                <w:rFonts w:ascii="Calibri" w:cs="Calibri" w:eastAsia="Calibri" w:hAnsi="Calibri"/>
-                <w:sz w:val="22"/>
-                <w:szCs w:val="22"/>
-              </w:rPr>
-              <w:t xml:space="preserve">97</w:t>
-            </w:r>
-          </w:p>
-        </w:tc>
-        <w:tc>
-          <w:tcPr>
-            <w:tcW w:type="dxa" w:w="3580"/>
-            <w:tcBorders>
-              <w:top w:val="single" w:color="BFBFBF" w:sz="4"/>
-              <w:left w:val="single" w:color="BFBFBF" w:sz="4"/>
-              <w:bottom w:val="single" w:color="BFBFBF" w:sz="4"/>
-              <w:right w:val="single" w:color="BFBFBF" w:sz="4"/>
-            </w:tcBorders>
-            <w:shd w:fill="F3F4F6" w:val="clear"/>
-            <w:tcMar>
-              <w:top w:type="dxa" w:w="100"/>
-              <w:left w:type="dxa" w:w="140"/>
-              <w:bottom w:type="dxa" w:w="100"/>
-              <w:right w:type="dxa" w:w="140"/>
-            </w:tcMar>
-            <w:vAlign w:val="center"/>
-          </w:tcPr>
-          <w:p>
-            <w:pPr>
-              <w:spacing w:after="40" w:before="40"/>
-              <w:jc w:val="left"/>
-            </w:pPr>
-            <w:r>
-              <w:rPr>
-                <w:rFonts w:ascii="Calibri" w:cs="Calibri" w:eastAsia="Calibri" w:hAnsi="Calibri"/>
-                <w:b/>
-                <w:bCs/>
-                <w:sz w:val="22"/>
-                <w:szCs w:val="22"/>
-              </w:rPr>
-              <w:t xml:space="preserve">PT. Garuda Yamato Steel</w:t>
-            </w:r>
-          </w:p>
-        </w:tc>
-        <w:tc>
-          <w:tcPr>
-            <w:tcW w:type="dxa" w:w="5000"/>
-            <w:tcBorders>
-              <w:top w:val="single" w:color="BFBFBF" w:sz="4"/>
-              <w:left w:val="single" w:color="BFBFBF" w:sz="4"/>
-              <w:bottom w:val="single" w:color="BFBFBF" w:sz="4"/>
-              <w:right w:val="single" w:color="BFBFBF" w:sz="4"/>
-            </w:tcBorders>
-            <w:shd w:fill="F3F4F6" w:val="clear"/>
-            <w:tcMar>
-              <w:top w:type="dxa" w:w="100"/>
-              <w:left w:type="dxa" w:w="140"/>
-              <w:bottom w:type="dxa" w:w="100"/>
-              <w:right w:type="dxa" w:w="140"/>
-            </w:tcMar>
-            <w:vAlign w:val="center"/>
-          </w:tcPr>
-          <w:p>
-            <w:pPr>
-              <w:spacing w:after="40" w:before="40"/>
-              <w:jc w:val="left"/>
-            </w:pPr>
-            <w:r>
-              <w:rPr>
-                <w:rFonts w:ascii="Calibri" w:cs="Calibri" w:eastAsia="Calibri" w:hAnsi="Calibri"/>
-                <w:sz w:val="22"/>
-                <w:szCs w:val="22"/>
-              </w:rPr>
-              <w:t xml:space="preserve">Horizontal Ladle Preheater</w:t>
-            </w:r>
-          </w:p>
-        </w:tc>
-      </w:tr>
-      <w:tr>
-        <w:tc>
-          <w:tcPr>
-            <w:tcW w:type="dxa" w:w="780"/>
-            <w:tcBorders>
-              <w:top w:val="single" w:color="BFBFBF" w:sz="4"/>
-              <w:left w:val="single" w:color="BFBFBF" w:sz="4"/>
-              <w:bottom w:val="single" w:color="BFBFBF" w:sz="4"/>
-              <w:right w:val="single" w:color="BFBFBF" w:sz="4"/>
-            </w:tcBorders>
-            <w:shd w:fill="F3F4F6" w:val="clear"/>
-            <w:tcMar>
-              <w:top w:type="dxa" w:w="100"/>
-              <w:left w:type="dxa" w:w="140"/>
-              <w:bottom w:type="dxa" w:w="100"/>
-              <w:right w:type="dxa" w:w="140"/>
-            </w:tcMar>
-            <w:vAlign w:val="center"/>
-          </w:tcPr>
-          <w:p>
-            <w:pPr>
-              <w:spacing w:after="40" w:before="40"/>
-              <w:jc w:val="center"/>
-            </w:pPr>
-            <w:r>
-              <w:rPr>
-                <w:rFonts w:ascii="Calibri" w:cs="Calibri" w:eastAsia="Calibri" w:hAnsi="Calibri"/>
-                <w:sz w:val="22"/>
-                <w:szCs w:val="22"/>
-              </w:rPr>
-              <w:t xml:space="preserve">98</w:t>
-            </w:r>
-          </w:p>
-        </w:tc>
-        <w:tc>
-          <w:tcPr>
-            <w:tcW w:type="dxa" w:w="3580"/>
-            <w:tcBorders>
-              <w:top w:val="single" w:color="BFBFBF" w:sz="4"/>
-              <w:left w:val="single" w:color="BFBFBF" w:sz="4"/>
-              <w:bottom w:val="single" w:color="BFBFBF" w:sz="4"/>
-              <w:right w:val="single" w:color="BFBFBF" w:sz="4"/>
-            </w:tcBorders>
-            <w:shd w:fill="F3F4F6" w:val="clear"/>
-            <w:tcMar>
-              <w:top w:type="dxa" w:w="100"/>
-              <w:left w:type="dxa" w:w="140"/>
-              <w:bottom w:type="dxa" w:w="100"/>
-              <w:right w:type="dxa" w:w="140"/>
-            </w:tcMar>
-            <w:vAlign w:val="center"/>
-          </w:tcPr>
-          <w:p>
-            <w:pPr>
-              <w:spacing w:after="40" w:before="40"/>
-              <w:jc w:val="left"/>
-            </w:pPr>
-            <w:r>
-              <w:rPr>
-                <w:rFonts w:ascii="Calibri" w:cs="Calibri" w:eastAsia="Calibri" w:hAnsi="Calibri"/>
-                <w:b/>
-                <w:bCs/>
-                <w:sz w:val="22"/>
-                <w:szCs w:val="22"/>
-              </w:rPr>
-              <w:t xml:space="preserve">PT. Garuda Yamato Steel</w:t>
-            </w:r>
-          </w:p>
-        </w:tc>
-        <w:tc>
-          <w:tcPr>
-            <w:tcW w:type="dxa" w:w="5000"/>
-            <w:tcBorders>
-              <w:top w:val="single" w:color="BFBFBF" w:sz="4"/>
-              <w:left w:val="single" w:color="BFBFBF" w:sz="4"/>
-              <w:bottom w:val="single" w:color="BFBFBF" w:sz="4"/>
-              <w:right w:val="single" w:color="BFBFBF" w:sz="4"/>
-            </w:tcBorders>
-            <w:shd w:fill="F3F4F6" w:val="clear"/>
-            <w:tcMar>
-              <w:top w:type="dxa" w:w="100"/>
-              <w:left w:type="dxa" w:w="140"/>
-              <w:bottom w:type="dxa" w:w="100"/>
-              <w:right w:type="dxa" w:w="140"/>
-            </w:tcMar>
-            <w:vAlign w:val="center"/>
-          </w:tcPr>
-          <w:p>
-            <w:pPr>
-              <w:spacing w:after="40" w:before="40"/>
-              <w:jc w:val="left"/>
-            </w:pPr>
-            <w:r>
-              <w:rPr>
-                <w:rFonts w:ascii="Calibri" w:cs="Calibri" w:eastAsia="Calibri" w:hAnsi="Calibri"/>
-                <w:sz w:val="22"/>
-                <w:szCs w:val="22"/>
-              </w:rPr>
-              <w:t xml:space="preserve">Vertical Ladle Preheater</w:t>
-            </w:r>
-          </w:p>
-        </w:tc>
-      </w:tr>
-      <w:tr>
-        <w:tc>
-          <w:tcPr>
-            <w:tcW w:type="dxa" w:w="780"/>
-            <w:tcBorders>
-              <w:top w:val="single" w:color="BFBFBF" w:sz="4"/>
-              <w:left w:val="single" w:color="BFBFBF" w:sz="4"/>
-              <w:bottom w:val="single" w:color="BFBFBF" w:sz="4"/>
-              <w:right w:val="single" w:color="BFBFBF" w:sz="4"/>
-            </w:tcBorders>
-            <w:shd w:fill="F3F4F6" w:val="clear"/>
-            <w:tcMar>
-              <w:top w:type="dxa" w:w="100"/>
-              <w:left w:type="dxa" w:w="140"/>
-              <w:bottom w:type="dxa" w:w="100"/>
-              <w:right w:type="dxa" w:w="140"/>
-            </w:tcMar>
-            <w:vAlign w:val="center"/>
-          </w:tcPr>
-          <w:p>
-            <w:pPr>
-              <w:spacing w:after="40" w:before="40"/>
-              <w:jc w:val="center"/>
-            </w:pPr>
-            <w:r>
-              <w:rPr>
-                <w:rFonts w:ascii="Calibri" w:cs="Calibri" w:eastAsia="Calibri" w:hAnsi="Calibri"/>
-                <w:sz w:val="22"/>
-                <w:szCs w:val="22"/>
-              </w:rPr>
-              <w:t xml:space="preserve">99</w:t>
+              <w:t>75</w:t>
             </w:r>
           </w:p>
         </w:tc>

</xml_diff>

<commit_message>
fix: mirror CV and orifice-plate changes onto Tundish template
- 'Pneumatic control valve' / 'Pneumatic Control valve' -> 'Control valve'
  (5 occurrences) — matches the generic CV wording used in VLPH/HLPH offers.
- Removed 6 paragraphs that bulleted 'Orifice plate fitted with differential
  pressure transmitter' / DPT variants from the temperature-control section.
- Removed 2 standalone 'Orifice plate' bullets.

Other recent template changes (logo square/size, cover spacers, pilot
gas-line move, Annexure III restructure, has_plc_with_hmi gating) don't
apply because the Tundish template's structure is different — it's a
hand-built static document without the same Jinja blocks. Tundish
already includes 'PLC Siemens S7 1200 + HMI + Burner Control Unit' in
its baked text.

Co-Authored-By: Claude Opus 4.7 (1M context) <noreply@anthropic.com>
</commit_message>
<xml_diff>
--- a/Tundish_Offer_Template.docx
+++ b/Tundish_Offer_Template.docx
@@ -2687,7 +2687,7 @@
         <w:rPr>
           <w:highlight w:val="yellow"/>
         </w:rPr>
-        <w:t xml:space="preserve">ake Pneumatic control valve and Shut-off valve </w:t>
+        <w:t xml:space="preserve">ake Control valve and Shut-off valve </w:t>
       </w:r>
       <w:r>
         <w:rPr>
@@ -12851,134 +12851,82 @@
         <w:jc w:val="both"/>
       </w:pPr>
       <w:r>
+        <w:t>Pneumatic</w:t>
+      </w:r>
+      <w:r>
+        <w:rPr>
+          <w:spacing w:val="18"/>
+        </w:rPr>
+        <w:t xml:space="preserve"> </w:t>
+      </w:r>
+      <w:r>
+        <w:rPr>
+          <w:spacing w:val="2"/>
+        </w:rPr>
+        <w:t>F</w:t>
+      </w:r>
+      <w:r>
+        <w:rPr>
+          <w:spacing w:val="-2"/>
+        </w:rPr>
+        <w:t>l</w:t>
+      </w:r>
+      <w:r>
         <w:rPr>
           <w:spacing w:val="1"/>
         </w:rPr>
-        <w:t>O</w:t>
-      </w:r>
-      <w:r>
-        <w:t>r</w:t>
+        <w:t>o</w:t>
+      </w:r>
+      <w:r>
+        <w:t>w</w:t>
+      </w:r>
+      <w:r>
+        <w:rPr>
+          <w:spacing w:val="10"/>
+        </w:rPr>
+        <w:t xml:space="preserve"> </w:t>
+      </w:r>
+      <w:r>
+        <w:t>control</w:t>
+      </w:r>
+      <w:r>
+        <w:rPr>
+          <w:spacing w:val="14"/>
+        </w:rPr>
+        <w:t xml:space="preserve"> </w:t>
+      </w:r>
+      <w:r>
+        <w:rPr>
+          <w:spacing w:val="1"/>
+          <w:w w:val="102"/>
+        </w:rPr>
+        <w:t>v</w:t>
       </w:r>
       <w:r>
         <w:rPr>
           <w:spacing w:val="-1"/>
-        </w:rPr>
-        <w:t>i</w:t>
-      </w:r>
-      <w:r>
-        <w:rPr>
-          <w:spacing w:val="2"/>
-        </w:rPr>
-        <w:t>f</w:t>
-      </w:r>
-      <w:r>
-        <w:rPr>
-          <w:spacing w:val="-1"/>
-        </w:rPr>
-        <w:t>ic</w:t>
-      </w:r>
-      <w:r>
+          <w:w w:val="102"/>
+        </w:rPr>
+        <w:t>a</w:t>
+      </w:r>
+      <w:r>
+        <w:rPr>
+          <w:w w:val="102"/>
+        </w:rPr>
+        <w:t>l</w:t>
+      </w:r>
+      <w:r>
+        <w:rPr>
+          <w:spacing w:val="1"/>
+          <w:w w:val="102"/>
+        </w:rPr>
+        <w:t>v</w:t>
+      </w:r>
+      <w:r>
+        <w:rPr>
+          <w:w w:val="102"/>
+        </w:rPr>
         <w:t>e</w:t>
-      </w:r>
-      <w:r>
-        <w:rPr>
-          <w:spacing w:val="12"/>
-        </w:rPr>
-        <w:t xml:space="preserve"> </w:t>
-      </w:r>
-      <w:r>
-        <w:rPr>
-          <w:spacing w:val="1"/>
-        </w:rPr>
-        <w:t>pl</w:t>
-      </w:r>
-      <w:r>
-        <w:rPr>
-          <w:spacing w:val="-1"/>
-        </w:rPr>
-        <w:t>a</w:t>
-      </w:r>
-      <w:r>
-        <w:rPr>
-          <w:spacing w:val="1"/>
-        </w:rPr>
-        <w:t>t</w:t>
-      </w:r>
-      <w:r>
-        <w:t>e</w:t>
-      </w:r>
-      <w:r>
-        <w:rPr>
-          <w:spacing w:val="11"/>
-        </w:rPr>
-        <w:t xml:space="preserve"> </w:t>
-      </w:r>
-      <w:r>
-        <w:t>fi</w:t>
-      </w:r>
-      <w:r>
-        <w:rPr>
-          <w:spacing w:val="-1"/>
-        </w:rPr>
-        <w:t>t</w:t>
-      </w:r>
-      <w:r>
-        <w:rPr>
-          <w:spacing w:val="1"/>
-        </w:rPr>
-        <w:t>t</w:t>
-      </w:r>
-      <w:r>
-        <w:rPr>
-          <w:spacing w:val="-1"/>
-        </w:rPr>
-        <w:t>e</w:t>
-      </w:r>
-      <w:r>
-        <w:t>d</w:t>
-      </w:r>
-      <w:r>
-        <w:rPr>
-          <w:spacing w:val="10"/>
-        </w:rPr>
-        <w:t xml:space="preserve"> </w:t>
-      </w:r>
-      <w:r>
-        <w:t>w</w:t>
-      </w:r>
-      <w:r>
-        <w:rPr>
-          <w:spacing w:val="1"/>
-        </w:rPr>
-        <w:t>i</w:t>
-      </w:r>
-      <w:r>
-        <w:t>th</w:t>
-      </w:r>
-      <w:r>
-        <w:rPr>
-          <w:spacing w:val="11"/>
-        </w:rPr>
-        <w:t xml:space="preserve"> </w:t>
-      </w:r>
-      <w:r>
-        <w:rPr>
-          <w:w w:val="102"/>
-        </w:rPr>
-        <w:t>D</w:t>
-      </w:r>
-      <w:r>
-        <w:rPr>
-          <w:spacing w:val="2"/>
-          <w:w w:val="102"/>
-        </w:rPr>
-        <w:t>P</w:t>
-      </w:r>
-      <w:r>
-        <w:rPr>
-          <w:w w:val="102"/>
-        </w:rPr>
-        <w:t>T.</w:t>
       </w:r>
     </w:p>
     <w:p>
@@ -12994,99 +12942,6 @@
         <w:ind w:right="864"/>
         <w:contextualSpacing/>
         <w:jc w:val="both"/>
-      </w:pPr>
-      <w:r>
-        <w:t>Pneumatic</w:t>
-      </w:r>
-      <w:r>
-        <w:rPr>
-          <w:spacing w:val="18"/>
-        </w:rPr>
-        <w:t xml:space="preserve"> </w:t>
-      </w:r>
-      <w:r>
-        <w:rPr>
-          <w:spacing w:val="2"/>
-        </w:rPr>
-        <w:t>F</w:t>
-      </w:r>
-      <w:r>
-        <w:rPr>
-          <w:spacing w:val="-2"/>
-        </w:rPr>
-        <w:t>l</w:t>
-      </w:r>
-      <w:r>
-        <w:rPr>
-          <w:spacing w:val="1"/>
-        </w:rPr>
-        <w:t>o</w:t>
-      </w:r>
-      <w:r>
-        <w:t>w</w:t>
-      </w:r>
-      <w:r>
-        <w:rPr>
-          <w:spacing w:val="10"/>
-        </w:rPr>
-        <w:t xml:space="preserve"> </w:t>
-      </w:r>
-      <w:r>
-        <w:t>control</w:t>
-      </w:r>
-      <w:r>
-        <w:rPr>
-          <w:spacing w:val="14"/>
-        </w:rPr>
-        <w:t xml:space="preserve"> </w:t>
-      </w:r>
-      <w:r>
-        <w:rPr>
-          <w:spacing w:val="1"/>
-          <w:w w:val="102"/>
-        </w:rPr>
-        <w:t>v</w:t>
-      </w:r>
-      <w:r>
-        <w:rPr>
-          <w:spacing w:val="-1"/>
-          <w:w w:val="102"/>
-        </w:rPr>
-        <w:t>a</w:t>
-      </w:r>
-      <w:r>
-        <w:rPr>
-          <w:w w:val="102"/>
-        </w:rPr>
-        <w:t>l</w:t>
-      </w:r>
-      <w:r>
-        <w:rPr>
-          <w:spacing w:val="1"/>
-          <w:w w:val="102"/>
-        </w:rPr>
-        <w:t>v</w:t>
-      </w:r>
-      <w:r>
-        <w:rPr>
-          <w:w w:val="102"/>
-        </w:rPr>
-        <w:t>e</w:t>
-      </w:r>
-    </w:p>
-    <w:p>
-      <w:pPr>
-        <w:pStyle w:val="ListParagraph"/>
-        <w:widowControl/>
-        <w:numPr>
-          <w:ilvl w:val="0"/>
-          <w:numId w:val="27"/>
-        </w:numPr>
-        <w:autoSpaceDE/>
-        <w:autoSpaceDN/>
-        <w:ind w:right="864"/>
-        <w:contextualSpacing/>
-        <w:jc w:val="both"/>
         <w:rPr>
           <w:w w:val="102"/>
         </w:rPr>
@@ -13690,7 +13545,7 @@
         <w:rPr>
           <w:spacing w:val="2"/>
         </w:rPr>
-        <w:t>Orifice Plate</w:t>
+        <w:t>DPT</w:t>
       </w:r>
     </w:p>
     <w:p>
@@ -13714,7 +13569,7 @@
         <w:rPr>
           <w:spacing w:val="2"/>
         </w:rPr>
-        <w:t>DPT</w:t>
+        <w:t>Control valve</w:t>
       </w:r>
     </w:p>
     <w:p>
@@ -13738,7 +13593,93 @@
         <w:rPr>
           <w:spacing w:val="2"/>
         </w:rPr>
-        <w:t>Pneumatic Control valve</w:t>
+        <w:t>Rotary joint</w:t>
+      </w:r>
+    </w:p>
+    <w:p>
+      <w:pPr>
+        <w:pStyle w:val="ListParagraph"/>
+        <w:widowControl/>
+        <w:autoSpaceDE/>
+        <w:autoSpaceDN/>
+        <w:ind w:left="2160" w:right="864" w:firstLine="0"/>
+        <w:contextualSpacing/>
+        <w:jc w:val="both"/>
+        <w:rPr>
+          <w:spacing w:val="2"/>
+        </w:rPr>
+      </w:pPr>
+    </w:p>
+    <w:p>
+      <w:pPr>
+        <w:ind w:left="1440" w:right="864"/>
+        <w:jc w:val="both"/>
+        <w:rPr>
+          <w:b/>
+          <w:bCs/>
+          <w:u w:val="single" w:color="000000"/>
+        </w:rPr>
+      </w:pPr>
+      <w:r>
+        <w:rPr>
+          <w:spacing w:val="2"/>
+        </w:rPr>
+        <w:t xml:space="preserve"> </w:t>
+      </w:r>
+      <w:r>
+        <w:rPr>
+          <w:b/>
+          <w:bCs/>
+          <w:u w:val="single" w:color="000000"/>
+        </w:rPr>
+        <w:t xml:space="preserve">NG </w:t>
+      </w:r>
+      <w:r>
+        <w:rPr>
+          <w:b/>
+          <w:bCs/>
+          <w:u w:val="single" w:color="000000"/>
+        </w:rPr>
+        <w:t xml:space="preserve">LINE FOR </w:t>
+      </w:r>
+      <w:r>
+        <w:rPr>
+          <w:b/>
+          <w:bCs/>
+          <w:u w:val="single" w:color="000000"/>
+        </w:rPr>
+        <w:t>MAIN</w:t>
+      </w:r>
+      <w:r>
+        <w:rPr>
+          <w:b/>
+          <w:bCs/>
+          <w:u w:val="single" w:color="000000"/>
+        </w:rPr>
+        <w:t xml:space="preserve"> BURNER</w:t>
+      </w:r>
+    </w:p>
+    <w:p>
+      <w:pPr>
+        <w:pStyle w:val="BodyText"/>
+        <w:spacing w:line="245" w:lineRule="auto"/>
+        <w:ind w:left="1440" w:right="864"/>
+        <w:jc w:val="both"/>
+      </w:pPr>
+      <w:r>
+        <w:t xml:space="preserve">The </w:t>
+      </w:r>
+      <w:r>
+        <w:t>NG</w:t>
+      </w:r>
+      <w:r>
+        <w:t xml:space="preserve"> line for </w:t>
+      </w:r>
+      <w:r>
+        <w:t>main</w:t>
+      </w:r>
+      <w:r>
+        <w:t xml:space="preserve"> burner will be consisting of following main components:</w:t>
       </w:r>
     </w:p>
     <w:p>
@@ -13762,93 +13703,13 @@
         <w:rPr>
           <w:spacing w:val="2"/>
         </w:rPr>
-        <w:t>Rotary joint</w:t>
-      </w:r>
-    </w:p>
-    <w:p>
-      <w:pPr>
-        <w:pStyle w:val="ListParagraph"/>
-        <w:widowControl/>
-        <w:autoSpaceDE/>
-        <w:autoSpaceDN/>
-        <w:ind w:left="2160" w:right="864" w:firstLine="0"/>
-        <w:contextualSpacing/>
-        <w:jc w:val="both"/>
+        <w:t>Ball</w:t>
+      </w:r>
+      <w:r>
         <w:rPr>
           <w:spacing w:val="2"/>
         </w:rPr>
-      </w:pPr>
-    </w:p>
-    <w:p>
-      <w:pPr>
-        <w:ind w:left="1440" w:right="864"/>
-        <w:jc w:val="both"/>
-        <w:rPr>
-          <w:b/>
-          <w:bCs/>
-          <w:u w:val="single" w:color="000000"/>
-        </w:rPr>
-      </w:pPr>
-      <w:r>
-        <w:rPr>
-          <w:spacing w:val="2"/>
-        </w:rPr>
-        <w:t xml:space="preserve"> </w:t>
-      </w:r>
-      <w:r>
-        <w:rPr>
-          <w:b/>
-          <w:bCs/>
-          <w:u w:val="single" w:color="000000"/>
-        </w:rPr>
-        <w:t xml:space="preserve">NG </w:t>
-      </w:r>
-      <w:r>
-        <w:rPr>
-          <w:b/>
-          <w:bCs/>
-          <w:u w:val="single" w:color="000000"/>
-        </w:rPr>
-        <w:t xml:space="preserve">LINE FOR </w:t>
-      </w:r>
-      <w:r>
-        <w:rPr>
-          <w:b/>
-          <w:bCs/>
-          <w:u w:val="single" w:color="000000"/>
-        </w:rPr>
-        <w:t>MAIN</w:t>
-      </w:r>
-      <w:r>
-        <w:rPr>
-          <w:b/>
-          <w:bCs/>
-          <w:u w:val="single" w:color="000000"/>
-        </w:rPr>
-        <w:t xml:space="preserve"> BURNER</w:t>
-      </w:r>
-    </w:p>
-    <w:p>
-      <w:pPr>
-        <w:pStyle w:val="BodyText"/>
-        <w:spacing w:line="245" w:lineRule="auto"/>
-        <w:ind w:left="1440" w:right="864"/>
-        <w:jc w:val="both"/>
-      </w:pPr>
-      <w:r>
-        <w:t xml:space="preserve">The </w:t>
-      </w:r>
-      <w:r>
-        <w:t>NG</w:t>
-      </w:r>
-      <w:r>
-        <w:t xml:space="preserve"> line for </w:t>
-      </w:r>
-      <w:r>
-        <w:t>main</w:t>
-      </w:r>
-      <w:r>
-        <w:t xml:space="preserve"> burner will be consisting of following main components:</w:t>
+        <w:t xml:space="preserve"> valve</w:t>
       </w:r>
     </w:p>
     <w:p>
@@ -13872,13 +13733,7 @@
         <w:rPr>
           <w:spacing w:val="2"/>
         </w:rPr>
-        <w:t>Ball</w:t>
-      </w:r>
-      <w:r>
-        <w:rPr>
-          <w:spacing w:val="2"/>
-        </w:rPr>
-        <w:t xml:space="preserve"> valve</w:t>
+        <w:t>Pressure gauge with manual cock.</w:t>
       </w:r>
     </w:p>
     <w:p>
@@ -13902,7 +13757,7 @@
         <w:rPr>
           <w:spacing w:val="2"/>
         </w:rPr>
-        <w:t>Pressure gauge with manual cock.</w:t>
+        <w:t>Gas filter</w:t>
       </w:r>
     </w:p>
     <w:p>
@@ -13926,7 +13781,7 @@
         <w:rPr>
           <w:spacing w:val="2"/>
         </w:rPr>
-        <w:t>Gas filter</w:t>
+        <w:t>Slam shut-off valve</w:t>
       </w:r>
     </w:p>
     <w:p>
@@ -13950,7 +13805,7 @@
         <w:rPr>
           <w:spacing w:val="2"/>
         </w:rPr>
-        <w:t>Slam shut-off valve</w:t>
+        <w:t>Gas pressure regulator</w:t>
       </w:r>
     </w:p>
     <w:p>
@@ -13974,7 +13829,7 @@
         <w:rPr>
           <w:spacing w:val="2"/>
         </w:rPr>
-        <w:t>Gas pressure regulator</w:t>
+        <w:t>Safety relief valve</w:t>
       </w:r>
     </w:p>
     <w:p>
@@ -13998,7 +13853,7 @@
         <w:rPr>
           <w:spacing w:val="2"/>
         </w:rPr>
-        <w:t>Safety relief valve</w:t>
+        <w:t>Pressure Switch Low</w:t>
       </w:r>
     </w:p>
     <w:p>
@@ -14022,7 +13877,7 @@
         <w:rPr>
           <w:spacing w:val="2"/>
         </w:rPr>
-        <w:t>Pressure Switch Low</w:t>
+        <w:t>Pressure Switch High</w:t>
       </w:r>
     </w:p>
     <w:p>
@@ -14046,7 +13901,7 @@
         <w:rPr>
           <w:spacing w:val="2"/>
         </w:rPr>
-        <w:t>Pressure Switch High</w:t>
+        <w:t>Solenoid valve</w:t>
       </w:r>
     </w:p>
     <w:p>
@@ -14070,7 +13925,7 @@
         <w:rPr>
           <w:spacing w:val="2"/>
         </w:rPr>
-        <w:t>Solenoid valve</w:t>
+        <w:t>DPT</w:t>
       </w:r>
     </w:p>
     <w:p>
@@ -14094,55 +13949,7 @@
         <w:rPr>
           <w:spacing w:val="2"/>
         </w:rPr>
-        <w:t>Orifice Plate</w:t>
-      </w:r>
-    </w:p>
-    <w:p>
-      <w:pPr>
-        <w:pStyle w:val="ListParagraph"/>
-        <w:widowControl/>
-        <w:numPr>
-          <w:ilvl w:val="0"/>
-          <w:numId w:val="32"/>
-        </w:numPr>
-        <w:autoSpaceDE/>
-        <w:autoSpaceDN/>
-        <w:ind w:right="864"/>
-        <w:contextualSpacing/>
-        <w:jc w:val="both"/>
-        <w:rPr>
-          <w:spacing w:val="2"/>
-        </w:rPr>
-      </w:pPr>
-      <w:r>
-        <w:rPr>
-          <w:spacing w:val="2"/>
-        </w:rPr>
-        <w:t>DPT</w:t>
-      </w:r>
-    </w:p>
-    <w:p>
-      <w:pPr>
-        <w:pStyle w:val="ListParagraph"/>
-        <w:widowControl/>
-        <w:numPr>
-          <w:ilvl w:val="0"/>
-          <w:numId w:val="32"/>
-        </w:numPr>
-        <w:autoSpaceDE/>
-        <w:autoSpaceDN/>
-        <w:ind w:right="864"/>
-        <w:contextualSpacing/>
-        <w:jc w:val="both"/>
-        <w:rPr>
-          <w:spacing w:val="2"/>
-        </w:rPr>
-      </w:pPr>
-      <w:r>
-        <w:rPr>
-          <w:spacing w:val="2"/>
-        </w:rPr>
-        <w:t>Pneumatic Control valve</w:t>
+        <w:t>Control valve</w:t>
       </w:r>
     </w:p>
     <w:p>
@@ -14967,7 +14774,7 @@
         <w:sym w:font="Wingdings" w:char="F06C"/>
       </w:r>
       <w:r>
-        <w:t xml:space="preserve"> Orifice plate with differential pressure transmitter</w:t>
+        <w:t xml:space="preserve"> Control valve</w:t>
       </w:r>
     </w:p>
     <w:p>
@@ -14979,7 +14786,7 @@
         <w:sym w:font="Wingdings" w:char="F06C"/>
       </w:r>
       <w:r>
-        <w:t xml:space="preserve"> Pneumatic control valve</w:t>
+        <w:t xml:space="preserve"> Pipeline and pipefittings</w:t>
       </w:r>
     </w:p>
     <w:p>
@@ -14987,11 +14794,35 @@
         <w:pStyle w:val="Header"/>
         <w:ind w:left="1440"/>
       </w:pPr>
-      <w:r>
-        <w:sym w:font="Wingdings" w:char="F06C"/>
-      </w:r>
-      <w:r>
-        <w:t xml:space="preserve"> Pipeline and pipefittings</w:t>
+    </w:p>
+    <w:p>
+      <w:pPr>
+        <w:ind w:left="1440"/>
+        <w:rPr>
+          <w:b/>
+          <w:bCs/>
+        </w:rPr>
+      </w:pPr>
+      <w:r>
+        <w:rPr>
+          <w:b/>
+          <w:bCs/>
+        </w:rPr>
+        <w:t xml:space="preserve">On the main </w:t>
+      </w:r>
+      <w:r>
+        <w:rPr>
+          <w:b/>
+          <w:bCs/>
+        </w:rPr>
+        <w:t>MG</w:t>
+      </w:r>
+      <w:r>
+        <w:rPr>
+          <w:b/>
+          <w:bCs/>
+        </w:rPr>
+        <w:t xml:space="preserve"> pipeline:</w:t>
       </w:r>
     </w:p>
     <w:p>
@@ -14999,59 +14830,11 @@
         <w:pStyle w:val="Header"/>
         <w:ind w:left="1440"/>
       </w:pPr>
-    </w:p>
-    <w:p>
-      <w:pPr>
-        <w:ind w:left="1440"/>
-        <w:rPr>
-          <w:b/>
-          <w:bCs/>
-        </w:rPr>
-      </w:pPr>
-      <w:r>
-        <w:rPr>
-          <w:b/>
-          <w:bCs/>
-        </w:rPr>
-        <w:t xml:space="preserve">On the main </w:t>
-      </w:r>
-      <w:r>
-        <w:rPr>
-          <w:b/>
-          <w:bCs/>
-        </w:rPr>
-        <w:t>MG</w:t>
-      </w:r>
-      <w:r>
-        <w:rPr>
-          <w:b/>
-          <w:bCs/>
-        </w:rPr>
-        <w:t xml:space="preserve"> pipeline:</w:t>
-      </w:r>
-    </w:p>
-    <w:p>
-      <w:pPr>
-        <w:pStyle w:val="Header"/>
-        <w:ind w:left="1440"/>
-      </w:pPr>
       <w:r>
         <w:sym w:font="Wingdings" w:char="F06C"/>
       </w:r>
       <w:r>
-        <w:t xml:space="preserve"> Orifice plate with differential pressure transmitter</w:t>
-      </w:r>
-    </w:p>
-    <w:p>
-      <w:pPr>
-        <w:pStyle w:val="Header"/>
-        <w:ind w:left="1440"/>
-      </w:pPr>
-      <w:r>
-        <w:sym w:font="Wingdings" w:char="F06C"/>
-      </w:r>
-      <w:r>
-        <w:t xml:space="preserve"> Pneumatic control valve</w:t>
+        <w:t xml:space="preserve"> Control valve</w:t>
       </w:r>
     </w:p>
     <w:p>
@@ -15103,24 +14886,6 @@
           <w:bCs/>
         </w:rPr>
         <w:t xml:space="preserve"> pipeline:</w:t>
-      </w:r>
-    </w:p>
-    <w:p>
-      <w:pPr>
-        <w:pStyle w:val="Header"/>
-        <w:ind w:left="1440"/>
-      </w:pPr>
-      <w:r>
-        <w:sym w:font="Wingdings" w:char="F06C"/>
-      </w:r>
-      <w:r>
-        <w:t xml:space="preserve"> </w:t>
-      </w:r>
-      <w:r>
-        <w:t xml:space="preserve">Orifice plate fitted with </w:t>
-      </w:r>
-      <w:r>
-        <w:t>differential pressure transmitter</w:t>
       </w:r>
     </w:p>
     <w:p>
@@ -16259,54 +16024,6 @@
           <w:spacing w:val="2"/>
         </w:rPr>
         <w:t>Thermocouple with Temperature transmitter</w:t>
-      </w:r>
-    </w:p>
-    <w:p>
-      <w:pPr>
-        <w:pStyle w:val="ListParagraph"/>
-        <w:widowControl/>
-        <w:numPr>
-          <w:ilvl w:val="0"/>
-          <w:numId w:val="33"/>
-        </w:numPr>
-        <w:autoSpaceDE/>
-        <w:autoSpaceDN/>
-        <w:ind w:right="864"/>
-        <w:contextualSpacing/>
-        <w:jc w:val="both"/>
-        <w:rPr>
-          <w:spacing w:val="2"/>
-        </w:rPr>
-      </w:pPr>
-      <w:r>
-        <w:rPr>
-          <w:spacing w:val="2"/>
-        </w:rPr>
-        <w:t>Orifice plate fitted with differential pressure transmitter on gas line.</w:t>
-      </w:r>
-    </w:p>
-    <w:p>
-      <w:pPr>
-        <w:pStyle w:val="ListParagraph"/>
-        <w:widowControl/>
-        <w:numPr>
-          <w:ilvl w:val="0"/>
-          <w:numId w:val="33"/>
-        </w:numPr>
-        <w:autoSpaceDE/>
-        <w:autoSpaceDN/>
-        <w:ind w:right="864"/>
-        <w:contextualSpacing/>
-        <w:jc w:val="both"/>
-        <w:rPr>
-          <w:spacing w:val="2"/>
-        </w:rPr>
-      </w:pPr>
-      <w:r>
-        <w:rPr>
-          <w:spacing w:val="2"/>
-        </w:rPr>
-        <w:t>Orifice plate fitted with differential pressure transmitter on airline.</w:t>
       </w:r>
     </w:p>
     <w:p>

</xml_diff>